<commit_message>
Fortalece cadena de valor y capa agentica (Figura 4 y Tabla 10 con columna de beneficio y alcance humano)
</commit_message>
<xml_diff>
--- a/Informe_EP3_MVP_HORECA_Marley_Coffee.docx
+++ b/Informe_EP3_MVP_HORECA_Marley_Coffee.docx
@@ -10008,17 +10008,16 @@
     </w:p>
     <w:p>
       <w:r>
-        <w:t xml:space="preserve">La auditoría operativa reveló que el mayor desgaste interno ocurre después de la primera venta: hoy el 82 %* de las reposiciones entra de forma manual por teléfono, correo o WhatsApp de cada vendedor, mientras solo el 30 %* de las fuentes de datos se sincroniza automáticamente (Duoc UC, 2026b). </w:t>
+        <w:t xml:space="preserve">La auditoría operativa reveló que la principal problemática interna de Marley Coffee es el exceso de trabajo manual: hoy el 82 %* de las reposiciones entra a mano por teléfono, correo o WhatsApp de cada vendedor y solo el 30 %* de los datos se sincroniza automáticamente (Duoc UC, 2026b), obligando al equipo a transcribir pedidos y revisar stock a ciegas. </w:t>
       </w:r>
       <w:r>
         <w:rPr>
           <w:b/>
-          <w:bCs/>
         </w:rPr>
-        <w:t>Digitalizar la recompra y conectar el inventario con el CRM libera horas críticas del equipo comercial y evita quiebres de café en los locales.</w:t>
-      </w:r>
-      <w:r>
-        <w:t xml:space="preserve"> La Figura 4 muestra cómo se despliegan seis agentes especializados a lo largo de la cadena de valor para absorber el trabajo mecánico, manteniendo siempre a una persona responsable en cada compuerta de decisión.</w:t>
+        <w:t>La tesis de la propuesta es que la base del ecosistema está sólidamente construida como arquitectura integrada, mientras que los seis agentes de IA aportan la fluidez operativa entre cada área.</w:t>
+      </w:r>
+      <w:r>
+        <w:t xml:space="preserve"> Como muestra la Figura 4, los agentes absorben el trabajo mecánico en la cadena de valor y dejan al alcance exclusivo de lo humano el criterio comercial, financiero y relacional.</w:t>
       </w:r>
     </w:p>
     <w:p>
@@ -10034,7 +10033,7 @@
         <w:lastRenderedPageBreak/>
         <w:drawing>
           <wp:inline distT="0" distB="0" distL="0" distR="0" wp14:anchorId="6EE41BE2" wp14:editId="400EAE81">
-            <wp:extent cx="6115050" cy="1866900"/>
+            <wp:extent cx="6115050" cy="1720000"/>
             <wp:effectExtent l="0" t="0" r="0" b="0"/>
             <wp:docPr id="5" name="fig4" descr="Figura 4. Agentes y personas en la cadena de valor, con el cuello de botella marcado" title="Figura 4. Agentes y personas en la cadena de valor, con el cuello de botella marcado"/>
             <wp:cNvGraphicFramePr>
@@ -10059,7 +10058,7 @@
                   <pic:spPr bwMode="auto">
                     <a:xfrm>
                       <a:off x="0" y="0"/>
-                      <a:ext cx="6115050" cy="1866900"/>
+                      <a:ext cx="6115050" cy="1720000"/>
                     </a:xfrm>
                     <a:prstGeom prst="rect">
                       <a:avLst/>
@@ -10081,11 +10080,9 @@
       <w:r>
         <w:rPr>
           <w:b/>
-          <w:bCs/>
           <w:sz w:val="19"/>
-          <w:szCs w:val="19"/>
         </w:rPr>
-        <w:t>Figura 4. Agentes y personas en la cadena de valor, con el cuello de botella marcado</w:t>
+        <w:t>Figura 4. Cadena de valor agéntica: automatización IA, alcance humano y beneficio por área</w:t>
       </w:r>
     </w:p>
     <w:p>
@@ -10112,9 +10109,8 @@
         <w:rPr>
           <w:color w:val="3F3F40"/>
           <w:sz w:val="16"/>
-          <w:szCs w:val="16"/>
         </w:rPr>
-        <w:t>Nota de lectura: el bloque rojo es donde hoy se pierde más tiempo: ahí el agente de Logística reserva stock y crea el pedido en VTEX, y Logística confirma lo que no calza.</w:t>
+        <w:t>Nota de lectura: la arquitectura sostiene el dato y los agentes dan fluidez entre áreas; el bloque rojo marca el cuello de botella actual (82 %* de reposición manual) que el Agente de Logística automatiza bajo supervisión humana.</w:t>
       </w:r>
     </w:p>
     <w:p>
@@ -10122,7 +10118,7 @@
         <w:pStyle w:val="Ttulo2"/>
       </w:pPr>
       <w:r>
-        <w:t>Marketing condicionado por stock y gobernanza de la capa agéntica</w:t>
+        <w:t>Arquitectura base, fluidez agéntica y gobernanza de stock</w:t>
       </w:r>
     </w:p>
     <w:p>
@@ -10654,33 +10650,30 @@
     </w:p>
     <w:p>
       <w:r>
-        <w:t xml:space="preserve">La capa agéntica opera bajo un principio estricto de autonomía supervisada, visible en la pantalla R07 y en el Espejo Paralelo del prototipo. </w:t>
+        <w:t xml:space="preserve">Sobre esta base arquitectónica, la capa agéntica opera bajo autonomía supervisada (R07 y Espejo Paralelo): </w:t>
       </w:r>
       <w:r>
         <w:rPr>
           <w:b/>
-          <w:bCs/>
         </w:rPr>
-        <w:t>Los seis agentes (Marketing, Calificación, Ventas, Logística, Postventa y el Orquestador) preparan cálculos, cruzan datos y redactan borradores, pero jamás ejecutan acciones financieras o contractuales irreversibles por cuenta propia.</w:t>
-      </w:r>
-      <w:r>
-        <w:t xml:space="preserve"> Así, el Agente de Calificación calcula el puntaje y promueve a MQL, pero la ejecutiva acepta el SQL; el Agente de Ventas arma la propuesta instantánea, pero la persona confirma el precio final; y el Agente de Postventa detecta cuándo toca reponer, pero el cliente y el equipo confirman el pedido antes de facturar (Anexo E, hojas 20 y 23).</w:t>
-      </w:r>
-    </w:p>
-    <w:p>
-      <w:r>
-        <w:lastRenderedPageBreak/>
-        <w:t xml:space="preserve">En la operación diaria, la comuna declarada por el local conecta automáticamente tres variables: la prioridad comercial, la ejecutiva territorial y el calendario de ruta de despacho (por ejemplo, Ruta Oriente los martes y jueves en demostración; Tabla 10). </w:t>
+        <w:t>los seis agentes (Marketing, Calificación, Ventas, Logística, Postventa y Orquestador) dan fluidez al flujo eliminando el trabajo manual repetitivo, pero jamás ejecutan acciones financieras o contractuales irreversibles por cuenta propia.</w:t>
+      </w:r>
+      <w:r>
+        <w:t xml:space="preserve"> Así, Marketing y Calificación trazan el origen, calculan el puntaje dual y asignan zona sin digitar fichas, pero la ejecutiva acepta el SQL; Ventas arma la propuesta en 60 s con stock real, pero la persona cierra el precio; Logística reserva SKU y sugiere ruta, pero Operaciones valida fechas; el Orquestador pre-arma el alta con RUT, pero Finanzas aprueba el crédito; y Postventa predice la recompra, pero el cliente y el equipo confirman antes de facturar (Anexo E, hojas 20 y 23).</w:t>
+      </w:r>
+    </w:p>
+    <w:p>
+      <w:r>
+        <w:t xml:space="preserve">En la operación diaria, esta sinergia entre automatización agéntica y alcance humano articula toda la cadena de suministro (Tabla 10): la comuna declarada conecta al instante la prioridad comercial, la ejecutiva territorial y el calendario de ruta (por ejemplo, Ruta Oriente los martes y jueves en demostración). </w:t>
       </w:r>
       <w:r>
         <w:rPr>
           <w:b/>
-          <w:bCs/>
         </w:rPr>
-        <w:t>En postventa, el cliente inicia su consulta desde Mi cuenta (C09), el chat o WhatsApp; el caso conserva pedido, historial y responsable. Los avisos y el seguimiento comercial se realizan por correo autorizado.</w:t>
-      </w:r>
-      <w:r>
-        <w:t xml:space="preserve"> Si el cliente reporta una falla en su cafetera, el sistema abre el ticket de incidencia (DEMO-INC), activa el workflow W9 para pausar de inmediato cualquier recordatorio de recompra u oferta de venta cruzada y deriva el caso a atención humana; los envíos comerciales solo se reactivan cuando el propio cliente confirma en el chat que su máquina volvió a operar sin problemas.</w:t>
+        <w:t>En postventa, Mi cuenta (C09), el chat y WhatsApp entrante convergen en un solo hilo trazable donde el cliente repite su pedido en un toque sin depender de mensajes manuales.</w:t>
+      </w:r>
+      <w:r>
+        <w:t xml:space="preserve"> Si reporta una falla en su cafetera, el sistema abre el ticket (DEMO-INC), activa el workflow W9 para pausar al instante todo recordatorio de recompra o venta cruzada y deriva el caso al técnico humano; las campañas solo se reactivan cuando el cliente confirma en el chat que su máquina volvió a operar.</w:t>
       </w:r>
     </w:p>
     <w:p>
@@ -10692,11 +10685,9 @@
       <w:r>
         <w:rPr>
           <w:b/>
-          <w:bCs/>
           <w:sz w:val="19"/>
-          <w:szCs w:val="19"/>
         </w:rPr>
-        <w:t>Tabla 10. Requerimientos operativos por dimensión</w:t>
+        <w:t>Tabla 10. Cadena de valor operativa y agentes de IA: automatización, alcance humano y beneficio por área</w:t>
       </w:r>
     </w:p>
     <w:p>
@@ -10709,9 +10700,8 @@
         <w:rPr>
           <w:color w:val="3F3F40"/>
           <w:sz w:val="16"/>
-          <w:szCs w:val="16"/>
         </w:rPr>
-        <w:t>Período: piloto de 90 días* · Unidad: requerimientos · Fuente: elaboración propia; base académica*</w:t>
+        <w:t>Período: piloto de 90 días* · Unidad: eslabones operativos de la cadena de valor · Fuente: elaboración propia; base académica*</w:t>
       </w:r>
     </w:p>
     <w:p>
@@ -10724,9 +10714,8 @@
         <w:rPr>
           <w:color w:val="3F3F40"/>
           <w:sz w:val="16"/>
-          <w:szCs w:val="16"/>
         </w:rPr>
-        <w:t>Nota de lectura: la comuna ordena puntaje, ruta y ejecutiva; lo que la operación no asegura no se promete en pantalla.</w:t>
+        <w:t>Nota de lectura: la arquitectura conecta los sistemas y cada agente absorbe la carga manual; las personas deciden en cada compuerta.</w:t>
       </w:r>
     </w:p>
     <w:tbl>
@@ -10747,10 +10736,10 @@
         <w:tblLook w:val="0000" w:firstRow="0" w:lastRow="0" w:firstColumn="0" w:lastColumn="0" w:noHBand="0" w:noVBand="0"/>
       </w:tblPr>
       <w:tblGrid>
-        <w:gridCol w:w="1561"/>
-        <w:gridCol w:w="3652"/>
-        <w:gridCol w:w="2116"/>
-        <w:gridCol w:w="2309"/>
+        <w:gridCol w:w="1780"/>
+        <w:gridCol w:w="2958"/>
+        <w:gridCol w:w="2450"/>
+        <w:gridCol w:w="2450"/>
       </w:tblGrid>
       <w:tr>
         <w:trPr>
@@ -10759,7 +10748,7 @@
         </w:trPr>
         <w:tc>
           <w:tcPr>
-            <w:tcW w:w="1542" w:type="dxa"/>
+            <w:tcW w:w="1780" w:type="dxa"/>
             <w:tcBorders>
               <w:top w:val="none" w:sz="0" w:space="0" w:color="FFFFFF"/>
               <w:left w:val="none" w:sz="0" w:space="0" w:color="FFFFFF"/>
@@ -10768,9 +10757,9 @@
             </w:tcBorders>
             <w:shd w:val="clear" w:color="auto" w:fill="0D0D0D"/>
             <w:tcMar>
-              <w:top w:w="70" w:type="dxa"/>
-              <w:left w:w="110" w:type="dxa"/>
-              <w:bottom w:w="70" w:type="dxa"/>
+              <w:top w:w="45" w:type="dxa"/>
+              <w:left w:w="110" w:type="dxa"/>
+              <w:bottom w:w="45" w:type="dxa"/>
               <w:right w:w="110" w:type="dxa"/>
             </w:tcMar>
             <w:vAlign w:val="center"/>
@@ -10783,19 +10772,16 @@
             <w:r>
               <w:rPr>
                 <w:b/>
-                <w:bCs/>
-                <w:caps/>
                 <w:color w:val="FFFFFF"/>
-                <w:sz w:val="16"/>
-                <w:szCs w:val="16"/>
-              </w:rPr>
-              <w:t>Dimensión</w:t>
-            </w:r>
-          </w:p>
-        </w:tc>
-        <w:tc>
-          <w:tcPr>
-            <w:tcW w:w="3662" w:type="dxa"/>
+                <w:sz w:val="15"/>
+              </w:rPr>
+              <w:t>Área y Agente IA</w:t>
+            </w:r>
+          </w:p>
+        </w:tc>
+        <w:tc>
+          <w:tcPr>
+            <w:tcW w:w="2958" w:type="dxa"/>
             <w:tcBorders>
               <w:top w:val="none" w:sz="0" w:space="0" w:color="FFFFFF"/>
               <w:left w:val="none" w:sz="0" w:space="0" w:color="FFFFFF"/>
@@ -10804,9 +10790,9 @@
             </w:tcBorders>
             <w:shd w:val="clear" w:color="auto" w:fill="0D0D0D"/>
             <w:tcMar>
-              <w:top w:w="70" w:type="dxa"/>
-              <w:left w:w="110" w:type="dxa"/>
-              <w:bottom w:w="70" w:type="dxa"/>
+              <w:top w:w="45" w:type="dxa"/>
+              <w:left w:w="110" w:type="dxa"/>
+              <w:bottom w:w="45" w:type="dxa"/>
               <w:right w:w="110" w:type="dxa"/>
             </w:tcMar>
             <w:vAlign w:val="center"/>
@@ -10819,19 +10805,16 @@
             <w:r>
               <w:rPr>
                 <w:b/>
-                <w:bCs/>
-                <w:caps/>
                 <w:color w:val="FFFFFF"/>
-                <w:sz w:val="16"/>
-                <w:szCs w:val="16"/>
-              </w:rPr>
-              <w:t>Requerimiento</w:t>
-            </w:r>
-          </w:p>
-        </w:tc>
-        <w:tc>
-          <w:tcPr>
-            <w:tcW w:w="2120" w:type="dxa"/>
+                <w:sz w:val="15"/>
+              </w:rPr>
+              <w:t>Qué automatiza el Agente (Fluidez)</w:t>
+            </w:r>
+          </w:p>
+        </w:tc>
+        <w:tc>
+          <w:tcPr>
+            <w:tcW w:w="2450" w:type="dxa"/>
             <w:tcBorders>
               <w:top w:val="none" w:sz="0" w:space="0" w:color="FFFFFF"/>
               <w:left w:val="none" w:sz="0" w:space="0" w:color="FFFFFF"/>
@@ -10840,9 +10823,9 @@
             </w:tcBorders>
             <w:shd w:val="clear" w:color="auto" w:fill="0D0D0D"/>
             <w:tcMar>
-              <w:top w:w="70" w:type="dxa"/>
-              <w:left w:w="110" w:type="dxa"/>
-              <w:bottom w:w="70" w:type="dxa"/>
+              <w:top w:w="45" w:type="dxa"/>
+              <w:left w:w="110" w:type="dxa"/>
+              <w:bottom w:w="45" w:type="dxa"/>
               <w:right w:w="110" w:type="dxa"/>
             </w:tcMar>
             <w:vAlign w:val="center"/>
@@ -10855,19 +10838,16 @@
             <w:r>
               <w:rPr>
                 <w:b/>
-                <w:bCs/>
-                <w:caps/>
                 <w:color w:val="FFFFFF"/>
-                <w:sz w:val="16"/>
-                <w:szCs w:val="16"/>
-              </w:rPr>
-              <w:t>Restricción</w:t>
-            </w:r>
-          </w:p>
-        </w:tc>
-        <w:tc>
-          <w:tcPr>
-            <w:tcW w:w="2314" w:type="dxa"/>
+                <w:sz w:val="15"/>
+              </w:rPr>
+              <w:t>Alcance humano y control</w:t>
+            </w:r>
+          </w:p>
+        </w:tc>
+        <w:tc>
+          <w:tcPr>
+            <w:tcW w:w="2450" w:type="dxa"/>
             <w:tcBorders>
               <w:top w:val="none" w:sz="0" w:space="0" w:color="FFFFFF"/>
               <w:left w:val="none" w:sz="0" w:space="0" w:color="FFFFFF"/>
@@ -10876,9 +10856,9 @@
             </w:tcBorders>
             <w:shd w:val="clear" w:color="auto" w:fill="0D0D0D"/>
             <w:tcMar>
-              <w:top w:w="70" w:type="dxa"/>
-              <w:left w:w="110" w:type="dxa"/>
-              <w:bottom w:w="70" w:type="dxa"/>
+              <w:top w:w="45" w:type="dxa"/>
+              <w:left w:w="110" w:type="dxa"/>
+              <w:bottom w:w="45" w:type="dxa"/>
               <w:right w:w="110" w:type="dxa"/>
             </w:tcMar>
             <w:vAlign w:val="center"/>
@@ -10891,13 +10871,10 @@
             <w:r>
               <w:rPr>
                 <w:b/>
-                <w:bCs/>
-                <w:caps/>
                 <w:color w:val="FFFFFF"/>
-                <w:sz w:val="16"/>
-                <w:szCs w:val="16"/>
-              </w:rPr>
-              <w:t>Control</w:t>
+                <w:sz w:val="15"/>
+              </w:rPr>
+              <w:t>Beneficio directo en el negocio</w:t>
             </w:r>
           </w:p>
         </w:tc>
@@ -10908,17 +10885,17 @@
         </w:trPr>
         <w:tc>
           <w:tcPr>
-            <w:tcW w:w="1542" w:type="dxa"/>
-            <w:tcBorders>
-              <w:top w:val="none" w:sz="0" w:space="0" w:color="FFFFFF"/>
-              <w:left w:val="none" w:sz="0" w:space="0" w:color="FFFFFF"/>
-              <w:bottom w:val="single" w:sz="4" w:space="0" w:color="DDD7CA"/>
-              <w:right w:val="none" w:sz="0" w:space="0" w:color="FFFFFF"/>
-            </w:tcBorders>
-            <w:tcMar>
-              <w:top w:w="80" w:type="dxa"/>
-              <w:left w:w="110" w:type="dxa"/>
-              <w:bottom w:w="80" w:type="dxa"/>
+            <w:tcW w:w="1780" w:type="dxa"/>
+            <w:tcBorders>
+              <w:top w:val="none" w:sz="0" w:space="0" w:color="FFFFFF"/>
+              <w:left w:val="none" w:sz="0" w:space="0" w:color="FFFFFF"/>
+              <w:bottom w:val="single" w:sz="4" w:space="0" w:color="DDD7CA"/>
+              <w:right w:val="none" w:sz="0" w:space="0" w:color="FFFFFF"/>
+            </w:tcBorders>
+            <w:tcMar>
+              <w:top w:w="36" w:type="dxa"/>
+              <w:left w:w="110" w:type="dxa"/>
+              <w:bottom w:w="36" w:type="dxa"/>
               <w:right w:w="110" w:type="dxa"/>
             </w:tcMar>
           </w:tcPr>
@@ -10929,26 +10906,33 @@
             </w:pPr>
             <w:r>
               <w:rPr>
-                <w:sz w:val="18"/>
-                <w:szCs w:val="18"/>
-              </w:rPr>
-              <w:t>Almacenamiento</w:t>
-            </w:r>
-          </w:p>
-        </w:tc>
-        <w:tc>
-          <w:tcPr>
-            <w:tcW w:w="3662" w:type="dxa"/>
-            <w:tcBorders>
-              <w:top w:val="none" w:sz="0" w:space="0" w:color="FFFFFF"/>
-              <w:left w:val="none" w:sz="0" w:space="0" w:color="FFFFFF"/>
-              <w:bottom w:val="single" w:sz="4" w:space="0" w:color="DDD7CA"/>
-              <w:right w:val="none" w:sz="0" w:space="0" w:color="FFFFFF"/>
-            </w:tcBorders>
-            <w:tcMar>
-              <w:top w:w="80" w:type="dxa"/>
-              <w:left w:w="110" w:type="dxa"/>
-              <w:bottom w:w="80" w:type="dxa"/>
+                <w:b/>
+                <w:sz w:val="15"/>
+              </w:rPr>
+              <w:t>1. Captación y Datos</w:t>
+              <w:br/>
+            </w:r>
+            <w:r>
+              <w:rPr>
+                <w:sz w:val="15"/>
+              </w:rPr>
+              <w:t>Ag. Marketing / Calif.</w:t>
+            </w:r>
+          </w:p>
+        </w:tc>
+        <w:tc>
+          <w:tcPr>
+            <w:tcW w:w="2958" w:type="dxa"/>
+            <w:tcBorders>
+              <w:top w:val="none" w:sz="0" w:space="0" w:color="FFFFFF"/>
+              <w:left w:val="none" w:sz="0" w:space="0" w:color="FFFFFF"/>
+              <w:bottom w:val="single" w:sz="4" w:space="0" w:color="DDD7CA"/>
+              <w:right w:val="none" w:sz="0" w:space="0" w:color="FFFFFF"/>
+            </w:tcBorders>
+            <w:tcMar>
+              <w:top w:w="36" w:type="dxa"/>
+              <w:left w:w="110" w:type="dxa"/>
+              <w:bottom w:w="36" w:type="dxa"/>
               <w:right w:w="110" w:type="dxa"/>
             </w:tcMar>
           </w:tcPr>
@@ -10959,26 +10943,25 @@
             </w:pPr>
             <w:r>
               <w:rPr>
-                <w:sz w:val="18"/>
-                <w:szCs w:val="18"/>
-              </w:rPr>
-              <w:t>Stock HORECA por SKU con seguridad según consumo; POP a pedido.</w:t>
-            </w:r>
-          </w:p>
-        </w:tc>
-        <w:tc>
-          <w:tcPr>
-            <w:tcW w:w="2120" w:type="dxa"/>
-            <w:tcBorders>
-              <w:top w:val="none" w:sz="0" w:space="0" w:color="FFFFFF"/>
-              <w:left w:val="none" w:sz="0" w:space="0" w:color="FFFFFF"/>
-              <w:bottom w:val="single" w:sz="4" w:space="0" w:color="DDD7CA"/>
-              <w:right w:val="none" w:sz="0" w:space="0" w:color="FFFFFF"/>
-            </w:tcBorders>
-            <w:tcMar>
-              <w:top w:w="80" w:type="dxa"/>
-              <w:left w:w="110" w:type="dxa"/>
-              <w:bottom w:w="80" w:type="dxa"/>
+                <w:sz w:val="15"/>
+              </w:rPr>
+              <w:t>Traza UTM/consentimiento, guarda avance (W1), calcula score dual y asigna zona.</w:t>
+            </w:r>
+          </w:p>
+        </w:tc>
+        <w:tc>
+          <w:tcPr>
+            <w:tcW w:w="2450" w:type="dxa"/>
+            <w:tcBorders>
+              <w:top w:val="none" w:sz="0" w:space="0" w:color="FFFFFF"/>
+              <w:left w:val="none" w:sz="0" w:space="0" w:color="FFFFFF"/>
+              <w:bottom w:val="single" w:sz="4" w:space="0" w:color="DDD7CA"/>
+              <w:right w:val="none" w:sz="0" w:space="0" w:color="FFFFFF"/>
+            </w:tcBorders>
+            <w:tcMar>
+              <w:top w:w="36" w:type="dxa"/>
+              <w:left w:w="110" w:type="dxa"/>
+              <w:bottom w:w="36" w:type="dxa"/>
               <w:right w:w="110" w:type="dxa"/>
             </w:tcMar>
           </w:tcPr>
@@ -10989,26 +10972,25 @@
             </w:pPr>
             <w:r>
               <w:rPr>
-                <w:sz w:val="18"/>
-                <w:szCs w:val="18"/>
-              </w:rPr>
-              <w:t>Quiebre en hora punta.</w:t>
-            </w:r>
-          </w:p>
-        </w:tc>
-        <w:tc>
-          <w:tcPr>
-            <w:tcW w:w="2314" w:type="dxa"/>
-            <w:tcBorders>
-              <w:top w:val="none" w:sz="0" w:space="0" w:color="FFFFFF"/>
-              <w:left w:val="none" w:sz="0" w:space="0" w:color="FFFFFF"/>
-              <w:bottom w:val="single" w:sz="4" w:space="0" w:color="DDD7CA"/>
-              <w:right w:val="none" w:sz="0" w:space="0" w:color="FFFFFF"/>
-            </w:tcBorders>
-            <w:tcMar>
-              <w:top w:w="80" w:type="dxa"/>
-              <w:left w:w="110" w:type="dxa"/>
-              <w:bottom w:w="80" w:type="dxa"/>
+                <w:sz w:val="15"/>
+              </w:rPr>
+              <w:t>Marketing aprueba pauta y Ventas acepta el SQL; sandbox mes 1 si no hay API.</w:t>
+            </w:r>
+          </w:p>
+        </w:tc>
+        <w:tc>
+          <w:tcPr>
+            <w:tcW w:w="2450" w:type="dxa"/>
+            <w:tcBorders>
+              <w:top w:val="none" w:sz="0" w:space="0" w:color="FFFFFF"/>
+              <w:left w:val="none" w:sz="0" w:space="0" w:color="FFFFFF"/>
+              <w:bottom w:val="single" w:sz="4" w:space="0" w:color="DDD7CA"/>
+              <w:right w:val="none" w:sz="0" w:space="0" w:color="FFFFFF"/>
+            </w:tcBorders>
+            <w:tcMar>
+              <w:top w:w="36" w:type="dxa"/>
+              <w:left w:w="110" w:type="dxa"/>
+              <w:bottom w:w="36" w:type="dxa"/>
               <w:right w:w="110" w:type="dxa"/>
             </w:tcMar>
           </w:tcPr>
@@ -11019,10 +11001,9 @@
             </w:pPr>
             <w:r>
               <w:rPr>
-                <w:sz w:val="18"/>
-                <w:szCs w:val="18"/>
-              </w:rPr>
-              <w:t>Logística confirma stock antes de la propuesta.</w:t>
+                <w:sz w:val="15"/>
+              </w:rPr>
+              <w:t>Cero digitación manual de fichas, 0 fuga de leads y trazabilidad total.</w:t>
             </w:r>
           </w:p>
         </w:tc>
@@ -11033,7 +11014,7 @@
         </w:trPr>
         <w:tc>
           <w:tcPr>
-            <w:tcW w:w="1542" w:type="dxa"/>
+            <w:tcW w:w="1780" w:type="dxa"/>
             <w:tcBorders>
               <w:top w:val="none" w:sz="0" w:space="0" w:color="FFFFFF"/>
               <w:left w:val="none" w:sz="0" w:space="0" w:color="FFFFFF"/>
@@ -11042,28 +11023,35 @@
             </w:tcBorders>
             <w:shd w:val="clear" w:color="auto" w:fill="F7F5F0"/>
             <w:tcMar>
-              <w:top w:w="80" w:type="dxa"/>
-              <w:left w:w="110" w:type="dxa"/>
-              <w:bottom w:w="80" w:type="dxa"/>
-              <w:right w:w="110" w:type="dxa"/>
-            </w:tcMar>
-          </w:tcPr>
-          <w:p>
-            <w:pPr>
-              <w:spacing w:after="0" w:line="262" w:lineRule="auto"/>
-            </w:pPr>
-            <w:r>
-              <w:rPr>
-                <w:sz w:val="18"/>
-                <w:szCs w:val="18"/>
-              </w:rPr>
-              <w:t>Fulfilment</w:t>
-            </w:r>
-          </w:p>
-        </w:tc>
-        <w:tc>
-          <w:tcPr>
-            <w:tcW w:w="3662" w:type="dxa"/>
+              <w:top w:w="36" w:type="dxa"/>
+              <w:left w:w="110" w:type="dxa"/>
+              <w:bottom w:w="36" w:type="dxa"/>
+              <w:right w:w="110" w:type="dxa"/>
+            </w:tcMar>
+          </w:tcPr>
+          <w:p>
+            <w:pPr>
+              <w:spacing w:after="0" w:line="262" w:lineRule="auto"/>
+            </w:pPr>
+            <w:r>
+              <w:rPr>
+                <w:b/>
+                <w:sz w:val="15"/>
+              </w:rPr>
+              <w:t>2. Almacenamiento</w:t>
+              <w:br/>
+            </w:r>
+            <w:r>
+              <w:rPr>
+                <w:sz w:val="15"/>
+              </w:rPr>
+              <w:t>Ag. Logística / Ventas</w:t>
+            </w:r>
+          </w:p>
+        </w:tc>
+        <w:tc>
+          <w:tcPr>
+            <w:tcW w:w="2958" w:type="dxa"/>
             <w:tcBorders>
               <w:top w:val="none" w:sz="0" w:space="0" w:color="FFFFFF"/>
               <w:left w:val="none" w:sz="0" w:space="0" w:color="FFFFFF"/>
@@ -11072,28 +11060,27 @@
             </w:tcBorders>
             <w:shd w:val="clear" w:color="auto" w:fill="F7F5F0"/>
             <w:tcMar>
-              <w:top w:w="80" w:type="dxa"/>
-              <w:left w:w="110" w:type="dxa"/>
-              <w:bottom w:w="80" w:type="dxa"/>
-              <w:right w:w="110" w:type="dxa"/>
-            </w:tcMar>
-          </w:tcPr>
-          <w:p>
-            <w:pPr>
-              <w:spacing w:after="0" w:line="262" w:lineRule="auto"/>
-            </w:pPr>
-            <w:r>
-              <w:rPr>
-                <w:sz w:val="18"/>
-                <w:szCs w:val="18"/>
-              </w:rPr>
-              <w:t>Pedido al aceptar o reponer, con reserva y verificación.</w:t>
-            </w:r>
-          </w:p>
-        </w:tc>
-        <w:tc>
-          <w:tcPr>
-            <w:tcW w:w="2120" w:type="dxa"/>
+              <w:top w:w="36" w:type="dxa"/>
+              <w:left w:w="110" w:type="dxa"/>
+              <w:bottom w:w="36" w:type="dxa"/>
+              <w:right w:w="110" w:type="dxa"/>
+            </w:tcMar>
+          </w:tcPr>
+          <w:p>
+            <w:pPr>
+              <w:spacing w:after="0" w:line="262" w:lineRule="auto"/>
+            </w:pPr>
+            <w:r>
+              <w:rPr>
+                <w:sz w:val="15"/>
+              </w:rPr>
+              <w:t>Cruza stock HORECA por SKU en ERP al cotizar, sugiere sustitutos y frena quiebres.</w:t>
+            </w:r>
+          </w:p>
+        </w:tc>
+        <w:tc>
+          <w:tcPr>
+            <w:tcW w:w="2450" w:type="dxa"/>
             <w:tcBorders>
               <w:top w:val="none" w:sz="0" w:space="0" w:color="FFFFFF"/>
               <w:left w:val="none" w:sz="0" w:space="0" w:color="FFFFFF"/>
@@ -11102,28 +11089,27 @@
             </w:tcBorders>
             <w:shd w:val="clear" w:color="auto" w:fill="F7F5F0"/>
             <w:tcMar>
-              <w:top w:w="80" w:type="dxa"/>
-              <w:left w:w="110" w:type="dxa"/>
-              <w:bottom w:w="80" w:type="dxa"/>
-              <w:right w:w="110" w:type="dxa"/>
-            </w:tcMar>
-          </w:tcPr>
-          <w:p>
-            <w:pPr>
-              <w:spacing w:after="0" w:line="262" w:lineRule="auto"/>
-            </w:pPr>
-            <w:r>
-              <w:rPr>
-                <w:sz w:val="18"/>
-                <w:szCs w:val="18"/>
-              </w:rPr>
-              <w:t>82 %* manual hoy.</w:t>
-            </w:r>
-          </w:p>
-        </w:tc>
-        <w:tc>
-          <w:tcPr>
-            <w:tcW w:w="2314" w:type="dxa"/>
+              <w:top w:w="36" w:type="dxa"/>
+              <w:left w:w="110" w:type="dxa"/>
+              <w:bottom w:w="36" w:type="dxa"/>
+              <w:right w:w="110" w:type="dxa"/>
+            </w:tcMar>
+          </w:tcPr>
+          <w:p>
+            <w:pPr>
+              <w:spacing w:after="0" w:line="262" w:lineRule="auto"/>
+            </w:pPr>
+            <w:r>
+              <w:rPr>
+                <w:sz w:val="15"/>
+              </w:rPr>
+              <w:t>Logística confirma stock real ante hora punta y gestiona POP a pedido.</w:t>
+            </w:r>
+          </w:p>
+        </w:tc>
+        <w:tc>
+          <w:tcPr>
+            <w:tcW w:w="2450" w:type="dxa"/>
             <w:tcBorders>
               <w:top w:val="none" w:sz="0" w:space="0" w:color="FFFFFF"/>
               <w:left w:val="none" w:sz="0" w:space="0" w:color="FFFFFF"/>
@@ -11132,22 +11118,21 @@
             </w:tcBorders>
             <w:shd w:val="clear" w:color="auto" w:fill="F7F5F0"/>
             <w:tcMar>
-              <w:top w:w="80" w:type="dxa"/>
-              <w:left w:w="110" w:type="dxa"/>
-              <w:bottom w:w="80" w:type="dxa"/>
-              <w:right w:w="110" w:type="dxa"/>
-            </w:tcMar>
-          </w:tcPr>
-          <w:p>
-            <w:pPr>
-              <w:spacing w:after="0" w:line="262" w:lineRule="auto"/>
-            </w:pPr>
-            <w:r>
-              <w:rPr>
-                <w:sz w:val="18"/>
-                <w:szCs w:val="18"/>
-              </w:rPr>
-              <w:t>Pedido desde el CRM; pedidos completos.</w:t>
+              <w:top w:w="36" w:type="dxa"/>
+              <w:left w:w="110" w:type="dxa"/>
+              <w:bottom w:w="36" w:type="dxa"/>
+              <w:right w:w="110" w:type="dxa"/>
+            </w:tcMar>
+          </w:tcPr>
+          <w:p>
+            <w:pPr>
+              <w:spacing w:after="0" w:line="262" w:lineRule="auto"/>
+            </w:pPr>
+            <w:r>
+              <w:rPr>
+                <w:sz w:val="15"/>
+              </w:rPr>
+              <w:t>Evita sobrevender sin cobertura y rota sobrestock cuidando el margen.</w:t>
             </w:r>
           </w:p>
         </w:tc>
@@ -11158,117 +11143,121 @@
         </w:trPr>
         <w:tc>
           <w:tcPr>
-            <w:tcW w:w="1542" w:type="dxa"/>
-            <w:tcBorders>
-              <w:top w:val="none" w:sz="0" w:space="0" w:color="FFFFFF"/>
-              <w:left w:val="none" w:sz="0" w:space="0" w:color="FFFFFF"/>
-              <w:bottom w:val="single" w:sz="4" w:space="0" w:color="DDD7CA"/>
-              <w:right w:val="none" w:sz="0" w:space="0" w:color="FFFFFF"/>
-            </w:tcBorders>
-            <w:tcMar>
-              <w:top w:w="80" w:type="dxa"/>
-              <w:left w:w="110" w:type="dxa"/>
-              <w:bottom w:w="80" w:type="dxa"/>
-              <w:right w:w="110" w:type="dxa"/>
-            </w:tcMar>
-          </w:tcPr>
-          <w:p>
-            <w:pPr>
-              <w:spacing w:after="0" w:line="262" w:lineRule="auto"/>
-            </w:pPr>
-            <w:r>
-              <w:rPr>
-                <w:sz w:val="18"/>
-                <w:szCs w:val="18"/>
-              </w:rPr>
-              <w:t>Distribución</w:t>
-            </w:r>
-          </w:p>
-        </w:tc>
-        <w:tc>
-          <w:tcPr>
-            <w:tcW w:w="3662" w:type="dxa"/>
-            <w:tcBorders>
-              <w:top w:val="none" w:sz="0" w:space="0" w:color="FFFFFF"/>
-              <w:left w:val="none" w:sz="0" w:space="0" w:color="FFFFFF"/>
-              <w:bottom w:val="single" w:sz="4" w:space="0" w:color="DDD7CA"/>
-              <w:right w:val="none" w:sz="0" w:space="0" w:color="FFFFFF"/>
-            </w:tcBorders>
-            <w:tcMar>
-              <w:top w:w="80" w:type="dxa"/>
-              <w:left w:w="110" w:type="dxa"/>
-              <w:bottom w:w="80" w:type="dxa"/>
-              <w:right w:w="110" w:type="dxa"/>
-            </w:tcMar>
-          </w:tcPr>
-          <w:p>
-            <w:pPr>
-              <w:spacing w:after="0" w:line="262" w:lineRule="auto"/>
-            </w:pPr>
-            <w:r>
-              <w:rPr>
-                <w:sz w:val="18"/>
-                <w:szCs w:val="18"/>
-              </w:rPr>
-              <w:t>Rutas por zona con días fijos; regiones por transporte; seguimiento en Mi cuenta.</w:t>
-            </w:r>
-          </w:p>
-        </w:tc>
-        <w:tc>
-          <w:tcPr>
-            <w:tcW w:w="2120" w:type="dxa"/>
-            <w:tcBorders>
-              <w:top w:val="none" w:sz="0" w:space="0" w:color="FFFFFF"/>
-              <w:left w:val="none" w:sz="0" w:space="0" w:color="FFFFFF"/>
-              <w:bottom w:val="single" w:sz="4" w:space="0" w:color="DDD7CA"/>
-              <w:right w:val="none" w:sz="0" w:space="0" w:color="FFFFFF"/>
-            </w:tcBorders>
-            <w:tcMar>
-              <w:top w:w="80" w:type="dxa"/>
-              <w:left w:w="110" w:type="dxa"/>
-              <w:bottom w:w="80" w:type="dxa"/>
-              <w:right w:w="110" w:type="dxa"/>
-            </w:tcMar>
-          </w:tcPr>
-          <w:p>
-            <w:pPr>
-              <w:spacing w:after="0" w:line="262" w:lineRule="auto"/>
-            </w:pPr>
-            <w:r>
-              <w:rPr>
-                <w:sz w:val="18"/>
-                <w:szCs w:val="18"/>
-              </w:rPr>
-              <w:t>Días de ruta de demostración.</w:t>
-            </w:r>
-          </w:p>
-        </w:tc>
-        <w:tc>
-          <w:tcPr>
-            <w:tcW w:w="2314" w:type="dxa"/>
-            <w:tcBorders>
-              <w:top w:val="none" w:sz="0" w:space="0" w:color="FFFFFF"/>
-              <w:left w:val="none" w:sz="0" w:space="0" w:color="FFFFFF"/>
-              <w:bottom w:val="single" w:sz="4" w:space="0" w:color="DDD7CA"/>
-              <w:right w:val="none" w:sz="0" w:space="0" w:color="FFFFFF"/>
-            </w:tcBorders>
-            <w:tcMar>
-              <w:top w:w="80" w:type="dxa"/>
-              <w:left w:w="110" w:type="dxa"/>
-              <w:bottom w:w="80" w:type="dxa"/>
-              <w:right w:w="110" w:type="dxa"/>
-            </w:tcMar>
-          </w:tcPr>
-          <w:p>
-            <w:pPr>
-              <w:spacing w:after="0" w:line="262" w:lineRule="auto"/>
-            </w:pPr>
-            <w:r>
-              <w:rPr>
-                <w:sz w:val="18"/>
-                <w:szCs w:val="18"/>
-              </w:rPr>
-              <w:t>No mostrar días sin confirmar.</w:t>
+            <w:tcW w:w="1780" w:type="dxa"/>
+            <w:tcBorders>
+              <w:top w:val="none" w:sz="0" w:space="0" w:color="FFFFFF"/>
+              <w:left w:val="none" w:sz="0" w:space="0" w:color="FFFFFF"/>
+              <w:bottom w:val="single" w:sz="4" w:space="0" w:color="DDD7CA"/>
+              <w:right w:val="none" w:sz="0" w:space="0" w:color="FFFFFF"/>
+            </w:tcBorders>
+            <w:tcMar>
+              <w:top w:w="36" w:type="dxa"/>
+              <w:left w:w="110" w:type="dxa"/>
+              <w:bottom w:w="36" w:type="dxa"/>
+              <w:right w:w="110" w:type="dxa"/>
+            </w:tcMar>
+          </w:tcPr>
+          <w:p>
+            <w:pPr>
+              <w:spacing w:after="0" w:line="262" w:lineRule="auto"/>
+            </w:pPr>
+            <w:r>
+              <w:rPr>
+                <w:b/>
+                <w:sz w:val="15"/>
+              </w:rPr>
+              <w:t>3. Fulfilment</w:t>
+              <w:br/>
+            </w:r>
+            <w:r>
+              <w:rPr>
+                <w:sz w:val="15"/>
+              </w:rPr>
+              <w:t>Ag. Logística</w:t>
+            </w:r>
+          </w:p>
+        </w:tc>
+        <w:tc>
+          <w:tcPr>
+            <w:tcW w:w="2958" w:type="dxa"/>
+            <w:tcBorders>
+              <w:top w:val="none" w:sz="0" w:space="0" w:color="FFFFFF"/>
+              <w:left w:val="none" w:sz="0" w:space="0" w:color="FFFFFF"/>
+              <w:bottom w:val="single" w:sz="4" w:space="0" w:color="DDD7CA"/>
+              <w:right w:val="none" w:sz="0" w:space="0" w:color="FFFFFF"/>
+            </w:tcBorders>
+            <w:tcMar>
+              <w:top w:w="36" w:type="dxa"/>
+              <w:left w:w="110" w:type="dxa"/>
+              <w:bottom w:w="36" w:type="dxa"/>
+              <w:right w:w="110" w:type="dxa"/>
+            </w:tcMar>
+          </w:tcPr>
+          <w:p>
+            <w:pPr>
+              <w:spacing w:after="0" w:line="262" w:lineRule="auto"/>
+            </w:pPr>
+            <w:r>
+              <w:rPr>
+                <w:sz w:val="15"/>
+              </w:rPr>
+              <w:t>Al aceptar propuesta o reponer en 1 clic (LM5), reserva SKU y crea pedido en CRM.</w:t>
+            </w:r>
+          </w:p>
+        </w:tc>
+        <w:tc>
+          <w:tcPr>
+            <w:tcW w:w="2450" w:type="dxa"/>
+            <w:tcBorders>
+              <w:top w:val="none" w:sz="0" w:space="0" w:color="FFFFFF"/>
+              <w:left w:val="none" w:sz="0" w:space="0" w:color="FFFFFF"/>
+              <w:bottom w:val="single" w:sz="4" w:space="0" w:color="DDD7CA"/>
+              <w:right w:val="none" w:sz="0" w:space="0" w:color="FFFFFF"/>
+            </w:tcBorders>
+            <w:tcMar>
+              <w:top w:w="36" w:type="dxa"/>
+              <w:left w:w="110" w:type="dxa"/>
+              <w:bottom w:w="36" w:type="dxa"/>
+              <w:right w:w="110" w:type="dxa"/>
+            </w:tcMar>
+          </w:tcPr>
+          <w:p>
+            <w:pPr>
+              <w:spacing w:after="0" w:line="262" w:lineRule="auto"/>
+            </w:pPr>
+            <w:r>
+              <w:rPr>
+                <w:sz w:val="15"/>
+              </w:rPr>
+              <w:t>Bodega verifica el armado físico y destraba descuadres antes de despachar.</w:t>
+            </w:r>
+          </w:p>
+        </w:tc>
+        <w:tc>
+          <w:tcPr>
+            <w:tcW w:w="2450" w:type="dxa"/>
+            <w:tcBorders>
+              <w:top w:val="none" w:sz="0" w:space="0" w:color="FFFFFF"/>
+              <w:left w:val="none" w:sz="0" w:space="0" w:color="FFFFFF"/>
+              <w:bottom w:val="single" w:sz="4" w:space="0" w:color="DDD7CA"/>
+              <w:right w:val="none" w:sz="0" w:space="0" w:color="FFFFFF"/>
+            </w:tcBorders>
+            <w:tcMar>
+              <w:top w:w="36" w:type="dxa"/>
+              <w:left w:w="110" w:type="dxa"/>
+              <w:bottom w:w="36" w:type="dxa"/>
+              <w:right w:w="110" w:type="dxa"/>
+            </w:tcMar>
+          </w:tcPr>
+          <w:p>
+            <w:pPr>
+              <w:spacing w:after="0" w:line="262" w:lineRule="auto"/>
+            </w:pPr>
+            <w:r>
+              <w:rPr>
+                <w:sz w:val="15"/>
+              </w:rPr>
+              <w:t>Elimina de raíz el 82 %* de pedido manual y libera horas para vender.</w:t>
             </w:r>
           </w:p>
         </w:tc>
@@ -11279,7 +11268,7 @@
         </w:trPr>
         <w:tc>
           <w:tcPr>
-            <w:tcW w:w="1542" w:type="dxa"/>
+            <w:tcW w:w="1780" w:type="dxa"/>
             <w:tcBorders>
               <w:top w:val="none" w:sz="0" w:space="0" w:color="FFFFFF"/>
               <w:left w:val="none" w:sz="0" w:space="0" w:color="FFFFFF"/>
@@ -11288,28 +11277,35 @@
             </w:tcBorders>
             <w:shd w:val="clear" w:color="auto" w:fill="F7F5F0"/>
             <w:tcMar>
-              <w:top w:w="80" w:type="dxa"/>
-              <w:left w:w="110" w:type="dxa"/>
-              <w:bottom w:w="80" w:type="dxa"/>
-              <w:right w:w="110" w:type="dxa"/>
-            </w:tcMar>
-          </w:tcPr>
-          <w:p>
-            <w:pPr>
-              <w:spacing w:after="0" w:line="262" w:lineRule="auto"/>
-            </w:pPr>
-            <w:r>
-              <w:rPr>
-                <w:sz w:val="18"/>
-                <w:szCs w:val="18"/>
-              </w:rPr>
-              <w:t>Servicio</w:t>
-            </w:r>
-          </w:p>
-        </w:tc>
-        <w:tc>
-          <w:tcPr>
-            <w:tcW w:w="3662" w:type="dxa"/>
+              <w:top w:w="36" w:type="dxa"/>
+              <w:left w:w="110" w:type="dxa"/>
+              <w:bottom w:w="36" w:type="dxa"/>
+              <w:right w:w="110" w:type="dxa"/>
+            </w:tcMar>
+          </w:tcPr>
+          <w:p>
+            <w:pPr>
+              <w:spacing w:after="0" w:line="262" w:lineRule="auto"/>
+            </w:pPr>
+            <w:r>
+              <w:rPr>
+                <w:b/>
+                <w:sz w:val="15"/>
+              </w:rPr>
+              <w:t>4. Distribución</w:t>
+              <w:br/>
+            </w:r>
+            <w:r>
+              <w:rPr>
+                <w:sz w:val="15"/>
+              </w:rPr>
+              <w:t>Ag. Logística</w:t>
+            </w:r>
+          </w:p>
+        </w:tc>
+        <w:tc>
+          <w:tcPr>
+            <w:tcW w:w="2958" w:type="dxa"/>
             <w:tcBorders>
               <w:top w:val="none" w:sz="0" w:space="0" w:color="FFFFFF"/>
               <w:left w:val="none" w:sz="0" w:space="0" w:color="FFFFFF"/>
@@ -11318,28 +11314,27 @@
             </w:tcBorders>
             <w:shd w:val="clear" w:color="auto" w:fill="F7F5F0"/>
             <w:tcMar>
-              <w:top w:w="80" w:type="dxa"/>
-              <w:left w:w="110" w:type="dxa"/>
-              <w:bottom w:w="80" w:type="dxa"/>
-              <w:right w:w="110" w:type="dxa"/>
-            </w:tcMar>
-          </w:tcPr>
-          <w:p>
-            <w:pPr>
-              <w:spacing w:after="0" w:line="262" w:lineRule="auto"/>
-            </w:pPr>
-            <w:r>
-              <w:rPr>
-                <w:sz w:val="18"/>
-                <w:szCs w:val="18"/>
-              </w:rPr>
-              <w:t>Ejecutiva por zona; mantención de máquinas; ticket con estado.</w:t>
-            </w:r>
-          </w:p>
-        </w:tc>
-        <w:tc>
-          <w:tcPr>
-            <w:tcW w:w="2120" w:type="dxa"/>
+              <w:top w:w="36" w:type="dxa"/>
+              <w:left w:w="110" w:type="dxa"/>
+              <w:bottom w:w="36" w:type="dxa"/>
+              <w:right w:w="110" w:type="dxa"/>
+            </w:tcMar>
+          </w:tcPr>
+          <w:p>
+            <w:pPr>
+              <w:spacing w:after="0" w:line="262" w:lineRule="auto"/>
+            </w:pPr>
+            <w:r>
+              <w:rPr>
+                <w:sz w:val="15"/>
+              </w:rPr>
+              <w:t>Asigna ruta por zona con días fijos según comuna (regiones courier) en Mi cuenta.</w:t>
+            </w:r>
+          </w:p>
+        </w:tc>
+        <w:tc>
+          <w:tcPr>
+            <w:tcW w:w="2450" w:type="dxa"/>
             <w:tcBorders>
               <w:top w:val="none" w:sz="0" w:space="0" w:color="FFFFFF"/>
               <w:left w:val="none" w:sz="0" w:space="0" w:color="FFFFFF"/>
@@ -11348,28 +11343,27 @@
             </w:tcBorders>
             <w:shd w:val="clear" w:color="auto" w:fill="F7F5F0"/>
             <w:tcMar>
-              <w:top w:w="80" w:type="dxa"/>
-              <w:left w:w="110" w:type="dxa"/>
-              <w:bottom w:w="80" w:type="dxa"/>
-              <w:right w:w="110" w:type="dxa"/>
-            </w:tcMar>
-          </w:tcPr>
-          <w:p>
-            <w:pPr>
-              <w:spacing w:after="0" w:line="262" w:lineRule="auto"/>
-            </w:pPr>
-            <w:r>
-              <w:rPr>
-                <w:sz w:val="18"/>
-                <w:szCs w:val="18"/>
-              </w:rPr>
-              <w:t>Capacidad; respuesta técnica de 31 h*.</w:t>
-            </w:r>
-          </w:p>
-        </w:tc>
-        <w:tc>
-          <w:tcPr>
-            <w:tcW w:w="2314" w:type="dxa"/>
+              <w:top w:w="36" w:type="dxa"/>
+              <w:left w:w="110" w:type="dxa"/>
+              <w:bottom w:w="36" w:type="dxa"/>
+              <w:right w:w="110" w:type="dxa"/>
+            </w:tcMar>
+          </w:tcPr>
+          <w:p>
+            <w:pPr>
+              <w:spacing w:after="0" w:line="262" w:lineRule="auto"/>
+            </w:pPr>
+            <w:r>
+              <w:rPr>
+                <w:sz w:val="15"/>
+              </w:rPr>
+              <w:t>Operaciones valida flota y promete la fecha (sin mostrar días no confirmados).</w:t>
+            </w:r>
+          </w:p>
+        </w:tc>
+        <w:tc>
+          <w:tcPr>
+            <w:tcW w:w="2450" w:type="dxa"/>
             <w:tcBorders>
               <w:top w:val="none" w:sz="0" w:space="0" w:color="FFFFFF"/>
               <w:left w:val="none" w:sz="0" w:space="0" w:color="FFFFFF"/>
@@ -11378,22 +11372,21 @@
             </w:tcBorders>
             <w:shd w:val="clear" w:color="auto" w:fill="F7F5F0"/>
             <w:tcMar>
-              <w:top w:w="80" w:type="dxa"/>
-              <w:left w:w="110" w:type="dxa"/>
-              <w:bottom w:w="80" w:type="dxa"/>
-              <w:right w:w="110" w:type="dxa"/>
-            </w:tcMar>
-          </w:tcPr>
-          <w:p>
-            <w:pPr>
-              <w:spacing w:after="0" w:line="262" w:lineRule="auto"/>
-            </w:pPr>
-            <w:r>
-              <w:rPr>
-                <w:sz w:val="18"/>
-                <w:szCs w:val="18"/>
-              </w:rPr>
-              <w:t>Primera respuesta por zona; reasignación.</w:t>
+              <w:top w:w="36" w:type="dxa"/>
+              <w:left w:w="110" w:type="dxa"/>
+              <w:bottom w:w="36" w:type="dxa"/>
+              <w:right w:w="110" w:type="dxa"/>
+            </w:tcMar>
+          </w:tcPr>
+          <w:p>
+            <w:pPr>
+              <w:spacing w:after="0" w:line="262" w:lineRule="auto"/>
+            </w:pPr>
+            <w:r>
+              <w:rPr>
+                <w:sz w:val="15"/>
+              </w:rPr>
+              <w:t>Despachos ordenados por comuna, certeza horaria y OTIF ≥ 95 %*.</w:t>
             </w:r>
           </w:p>
         </w:tc>
@@ -11404,17 +11397,17 @@
         </w:trPr>
         <w:tc>
           <w:tcPr>
-            <w:tcW w:w="1542" w:type="dxa"/>
-            <w:tcBorders>
-              <w:top w:val="none" w:sz="0" w:space="0" w:color="FFFFFF"/>
-              <w:left w:val="none" w:sz="0" w:space="0" w:color="FFFFFF"/>
-              <w:bottom w:val="single" w:sz="4" w:space="0" w:color="DDD7CA"/>
-              <w:right w:val="none" w:sz="0" w:space="0" w:color="FFFFFF"/>
-            </w:tcBorders>
-            <w:tcMar>
-              <w:top w:w="80" w:type="dxa"/>
-              <w:left w:w="110" w:type="dxa"/>
-              <w:bottom w:w="80" w:type="dxa"/>
+            <w:tcW w:w="1780" w:type="dxa"/>
+            <w:tcBorders>
+              <w:top w:val="none" w:sz="0" w:space="0" w:color="FFFFFF"/>
+              <w:left w:val="none" w:sz="0" w:space="0" w:color="FFFFFF"/>
+              <w:bottom w:val="single" w:sz="4" w:space="0" w:color="DDD7CA"/>
+              <w:right w:val="none" w:sz="0" w:space="0" w:color="FFFFFF"/>
+            </w:tcBorders>
+            <w:tcMar>
+              <w:top w:w="36" w:type="dxa"/>
+              <w:left w:w="110" w:type="dxa"/>
+              <w:bottom w:w="36" w:type="dxa"/>
               <w:right w:w="110" w:type="dxa"/>
             </w:tcMar>
           </w:tcPr>
@@ -11425,26 +11418,33 @@
             </w:pPr>
             <w:r>
               <w:rPr>
-                <w:sz w:val="18"/>
-                <w:szCs w:val="18"/>
-              </w:rPr>
-              <w:t>Cobro</w:t>
-            </w:r>
-          </w:p>
-        </w:tc>
-        <w:tc>
-          <w:tcPr>
-            <w:tcW w:w="3662" w:type="dxa"/>
-            <w:tcBorders>
-              <w:top w:val="none" w:sz="0" w:space="0" w:color="FFFFFF"/>
-              <w:left w:val="none" w:sz="0" w:space="0" w:color="FFFFFF"/>
-              <w:bottom w:val="single" w:sz="4" w:space="0" w:color="DDD7CA"/>
-              <w:right w:val="none" w:sz="0" w:space="0" w:color="FFFFFF"/>
-            </w:tcBorders>
-            <w:tcMar>
-              <w:top w:w="80" w:type="dxa"/>
-              <w:left w:w="110" w:type="dxa"/>
-              <w:bottom w:w="80" w:type="dxa"/>
+                <w:b/>
+                <w:sz w:val="15"/>
+              </w:rPr>
+              <w:t>5. Cobro y Factura</w:t>
+              <w:br/>
+            </w:r>
+            <w:r>
+              <w:rPr>
+                <w:sz w:val="15"/>
+              </w:rPr>
+              <w:t>Ag. Orquestador</w:t>
+            </w:r>
+          </w:p>
+        </w:tc>
+        <w:tc>
+          <w:tcPr>
+            <w:tcW w:w="2958" w:type="dxa"/>
+            <w:tcBorders>
+              <w:top w:val="none" w:sz="0" w:space="0" w:color="FFFFFF"/>
+              <w:left w:val="none" w:sz="0" w:space="0" w:color="FFFFFF"/>
+              <w:bottom w:val="single" w:sz="4" w:space="0" w:color="DDD7CA"/>
+              <w:right w:val="none" w:sz="0" w:space="0" w:color="FFFFFF"/>
+            </w:tcBorders>
+            <w:tcMar>
+              <w:top w:w="36" w:type="dxa"/>
+              <w:left w:w="110" w:type="dxa"/>
+              <w:bottom w:w="36" w:type="dxa"/>
               <w:right w:w="110" w:type="dxa"/>
             </w:tcMar>
           </w:tcPr>
@@ -11455,26 +11455,25 @@
             </w:pPr>
             <w:r>
               <w:rPr>
-                <w:sz w:val="18"/>
-                <w:szCs w:val="18"/>
-              </w:rPr>
-              <w:t>Alta B2B; factura al despachar; conciliación.</w:t>
-            </w:r>
-          </w:p>
-        </w:tc>
-        <w:tc>
-          <w:tcPr>
-            <w:tcW w:w="2120" w:type="dxa"/>
-            <w:tcBorders>
-              <w:top w:val="none" w:sz="0" w:space="0" w:color="FFFFFF"/>
-              <w:left w:val="none" w:sz="0" w:space="0" w:color="FFFFFF"/>
-              <w:bottom w:val="single" w:sz="4" w:space="0" w:color="DDD7CA"/>
-              <w:right w:val="none" w:sz="0" w:space="0" w:color="FFFFFF"/>
-            </w:tcBorders>
-            <w:tcMar>
-              <w:top w:w="80" w:type="dxa"/>
-              <w:left w:w="110" w:type="dxa"/>
-              <w:bottom w:w="80" w:type="dxa"/>
+                <w:sz w:val="15"/>
+              </w:rPr>
+              <w:t>Pre-arma alta B2B con RUT, giro y OC; emite factura al despachar y concilia.</w:t>
+            </w:r>
+          </w:p>
+        </w:tc>
+        <w:tc>
+          <w:tcPr>
+            <w:tcW w:w="2450" w:type="dxa"/>
+            <w:tcBorders>
+              <w:top w:val="none" w:sz="0" w:space="0" w:color="FFFFFF"/>
+              <w:left w:val="none" w:sz="0" w:space="0" w:color="FFFFFF"/>
+              <w:bottom w:val="single" w:sz="4" w:space="0" w:color="DDD7CA"/>
+              <w:right w:val="none" w:sz="0" w:space="0" w:color="FFFFFF"/>
+            </w:tcBorders>
+            <w:tcMar>
+              <w:top w:w="36" w:type="dxa"/>
+              <w:left w:w="110" w:type="dxa"/>
+              <w:bottom w:w="36" w:type="dxa"/>
               <w:right w:w="110" w:type="dxa"/>
             </w:tcMar>
           </w:tcPr>
@@ -11485,26 +11484,25 @@
             </w:pPr>
             <w:r>
               <w:rPr>
-                <w:sz w:val="18"/>
-                <w:szCs w:val="18"/>
-              </w:rPr>
-              <w:t>Las condiciones vigentes no cambian.</w:t>
-            </w:r>
-          </w:p>
-        </w:tc>
-        <w:tc>
-          <w:tcPr>
-            <w:tcW w:w="2314" w:type="dxa"/>
-            <w:tcBorders>
-              <w:top w:val="none" w:sz="0" w:space="0" w:color="FFFFFF"/>
-              <w:left w:val="none" w:sz="0" w:space="0" w:color="FFFFFF"/>
-              <w:bottom w:val="single" w:sz="4" w:space="0" w:color="DDD7CA"/>
-              <w:right w:val="none" w:sz="0" w:space="0" w:color="FFFFFF"/>
-            </w:tcBorders>
-            <w:tcMar>
-              <w:top w:w="80" w:type="dxa"/>
-              <w:left w:w="110" w:type="dxa"/>
-              <w:bottom w:w="80" w:type="dxa"/>
+                <w:sz w:val="15"/>
+              </w:rPr>
+              <w:t>Finanzas valida cada alta y aprueba línea de crédito o condición vigente.</w:t>
+            </w:r>
+          </w:p>
+        </w:tc>
+        <w:tc>
+          <w:tcPr>
+            <w:tcW w:w="2450" w:type="dxa"/>
+            <w:tcBorders>
+              <w:top w:val="none" w:sz="0" w:space="0" w:color="FFFFFF"/>
+              <w:left w:val="none" w:sz="0" w:space="0" w:color="FFFFFF"/>
+              <w:bottom w:val="single" w:sz="4" w:space="0" w:color="DDD7CA"/>
+              <w:right w:val="none" w:sz="0" w:space="0" w:color="FFFFFF"/>
+            </w:tcBorders>
+            <w:tcMar>
+              <w:top w:w="36" w:type="dxa"/>
+              <w:left w:w="110" w:type="dxa"/>
+              <w:bottom w:w="36" w:type="dxa"/>
               <w:right w:w="110" w:type="dxa"/>
             </w:tcMar>
           </w:tcPr>
@@ -11515,10 +11513,9 @@
             </w:pPr>
             <w:r>
               <w:rPr>
-                <w:sz w:val="18"/>
-                <w:szCs w:val="18"/>
-              </w:rPr>
-              <w:t>Finanzas valida cada alta.</w:t>
+                <w:sz w:val="15"/>
+              </w:rPr>
+              <w:t>Formalización B2B ágil sin errores manuales ni riesgo crediticio.</w:t>
             </w:r>
           </w:p>
         </w:tc>
@@ -11529,7 +11526,7 @@
         </w:trPr>
         <w:tc>
           <w:tcPr>
-            <w:tcW w:w="1542" w:type="dxa"/>
+            <w:tcW w:w="1780" w:type="dxa"/>
             <w:tcBorders>
               <w:top w:val="none" w:sz="0" w:space="0" w:color="FFFFFF"/>
               <w:left w:val="none" w:sz="0" w:space="0" w:color="FFFFFF"/>
@@ -11538,28 +11535,35 @@
             </w:tcBorders>
             <w:shd w:val="clear" w:color="auto" w:fill="F7F5F0"/>
             <w:tcMar>
-              <w:top w:w="80" w:type="dxa"/>
-              <w:left w:w="110" w:type="dxa"/>
-              <w:bottom w:w="80" w:type="dxa"/>
-              <w:right w:w="110" w:type="dxa"/>
-            </w:tcMar>
-          </w:tcPr>
-          <w:p>
-            <w:pPr>
-              <w:spacing w:after="0" w:line="262" w:lineRule="auto"/>
-            </w:pPr>
-            <w:r>
-              <w:rPr>
-                <w:sz w:val="18"/>
-                <w:szCs w:val="18"/>
-              </w:rPr>
-              <w:t>Datos</w:t>
-            </w:r>
-          </w:p>
-        </w:tc>
-        <w:tc>
-          <w:tcPr>
-            <w:tcW w:w="3662" w:type="dxa"/>
+              <w:top w:w="36" w:type="dxa"/>
+              <w:left w:w="110" w:type="dxa"/>
+              <w:bottom w:w="36" w:type="dxa"/>
+              <w:right w:w="110" w:type="dxa"/>
+            </w:tcMar>
+          </w:tcPr>
+          <w:p>
+            <w:pPr>
+              <w:spacing w:after="0" w:line="262" w:lineRule="auto"/>
+            </w:pPr>
+            <w:r>
+              <w:rPr>
+                <w:b/>
+                <w:sz w:val="15"/>
+              </w:rPr>
+              <w:t>6. Postventa</w:t>
+              <w:br/>
+            </w:r>
+            <w:r>
+              <w:rPr>
+                <w:sz w:val="15"/>
+              </w:rPr>
+              <w:t>Ag. Postventa</w:t>
+            </w:r>
+          </w:p>
+        </w:tc>
+        <w:tc>
+          <w:tcPr>
+            <w:tcW w:w="2958" w:type="dxa"/>
             <w:tcBorders>
               <w:top w:val="none" w:sz="0" w:space="0" w:color="FFFFFF"/>
               <w:left w:val="none" w:sz="0" w:space="0" w:color="FFFFFF"/>
@@ -11568,28 +11572,27 @@
             </w:tcBorders>
             <w:shd w:val="clear" w:color="auto" w:fill="F7F5F0"/>
             <w:tcMar>
-              <w:top w:w="80" w:type="dxa"/>
-              <w:left w:w="110" w:type="dxa"/>
-              <w:bottom w:w="80" w:type="dxa"/>
-              <w:right w:w="110" w:type="dxa"/>
-            </w:tcMar>
-          </w:tcPr>
-          <w:p>
-            <w:pPr>
-              <w:spacing w:after="0" w:line="262" w:lineRule="auto"/>
-            </w:pPr>
-            <w:r>
-              <w:rPr>
-                <w:sz w:val="18"/>
-                <w:szCs w:val="18"/>
-              </w:rPr>
-              <w:t>Capa de integración con registro de cada llamada; consentimiento.</w:t>
-            </w:r>
-          </w:p>
-        </w:tc>
-        <w:tc>
-          <w:tcPr>
-            <w:tcW w:w="2120" w:type="dxa"/>
+              <w:top w:w="36" w:type="dxa"/>
+              <w:left w:w="110" w:type="dxa"/>
+              <w:bottom w:w="36" w:type="dxa"/>
+              <w:right w:w="110" w:type="dxa"/>
+            </w:tcMar>
+          </w:tcPr>
+          <w:p>
+            <w:pPr>
+              <w:spacing w:after="0" w:line="262" w:lineRule="auto"/>
+            </w:pPr>
+            <w:r>
+              <w:rPr>
+                <w:sz w:val="15"/>
+              </w:rPr>
+              <w:t>Predice recompra, abre tickets con estado (DEMO-INC) y pausa pauta en falla (W9).</w:t>
+            </w:r>
+          </w:p>
+        </w:tc>
+        <w:tc>
+          <w:tcPr>
+            <w:tcW w:w="2450" w:type="dxa"/>
             <w:tcBorders>
               <w:top w:val="none" w:sz="0" w:space="0" w:color="FFFFFF"/>
               <w:left w:val="none" w:sz="0" w:space="0" w:color="FFFFFF"/>
@@ -11598,28 +11601,27 @@
             </w:tcBorders>
             <w:shd w:val="clear" w:color="auto" w:fill="F7F5F0"/>
             <w:tcMar>
-              <w:top w:w="80" w:type="dxa"/>
-              <w:left w:w="110" w:type="dxa"/>
-              <w:bottom w:w="80" w:type="dxa"/>
-              <w:right w:w="110" w:type="dxa"/>
-            </w:tcMar>
-          </w:tcPr>
-          <w:p>
-            <w:pPr>
-              <w:spacing w:after="0" w:line="262" w:lineRule="auto"/>
-            </w:pPr>
-            <w:r>
-              <w:rPr>
-                <w:sz w:val="18"/>
-                <w:szCs w:val="18"/>
-              </w:rPr>
-              <w:t>ERP y CRM sin marca informada.</w:t>
-            </w:r>
-          </w:p>
-        </w:tc>
-        <w:tc>
-          <w:tcPr>
-            <w:tcW w:w="2314" w:type="dxa"/>
+              <w:top w:w="36" w:type="dxa"/>
+              <w:left w:w="110" w:type="dxa"/>
+              <w:bottom w:w="36" w:type="dxa"/>
+              <w:right w:w="110" w:type="dxa"/>
+            </w:tcMar>
+          </w:tcPr>
+          <w:p>
+            <w:pPr>
+              <w:spacing w:after="0" w:line="262" w:lineRule="auto"/>
+            </w:pPr>
+            <w:r>
+              <w:rPr>
+                <w:sz w:val="15"/>
+              </w:rPr>
+              <w:t>Ejecutiva territorial y técnico resuelven en terreno (bajando las 31 h* de espera).</w:t>
+            </w:r>
+          </w:p>
+        </w:tc>
+        <w:tc>
+          <w:tcPr>
+            <w:tcW w:w="2450" w:type="dxa"/>
             <w:tcBorders>
               <w:top w:val="none" w:sz="0" w:space="0" w:color="FFFFFF"/>
               <w:left w:val="none" w:sz="0" w:space="0" w:color="FFFFFF"/>
@@ -11628,22 +11630,21 @@
             </w:tcBorders>
             <w:shd w:val="clear" w:color="auto" w:fill="F7F5F0"/>
             <w:tcMar>
-              <w:top w:w="80" w:type="dxa"/>
-              <w:left w:w="110" w:type="dxa"/>
-              <w:bottom w:w="80" w:type="dxa"/>
-              <w:right w:w="110" w:type="dxa"/>
-            </w:tcMar>
-          </w:tcPr>
-          <w:p>
-            <w:pPr>
-              <w:spacing w:after="0" w:line="262" w:lineRule="auto"/>
-            </w:pPr>
-            <w:r>
-              <w:rPr>
-                <w:sz w:val="18"/>
-                <w:szCs w:val="18"/>
-              </w:rPr>
-              <w:t>Ambiente de prueba el mes 1; archivo programado si no hay API.</w:t>
+              <w:top w:w="36" w:type="dxa"/>
+              <w:left w:w="110" w:type="dxa"/>
+              <w:bottom w:w="36" w:type="dxa"/>
+              <w:right w:w="110" w:type="dxa"/>
+            </w:tcMar>
+          </w:tcPr>
+          <w:p>
+            <w:pPr>
+              <w:spacing w:after="0" w:line="262" w:lineRule="auto"/>
+            </w:pPr>
+            <w:r>
+              <w:rPr>
+                <w:sz w:val="15"/>
+              </w:rPr>
+              <w:t>Eleva recompra digital (18→40 %*) y retención anual del 86 % al 90 %*.</w:t>
             </w:r>
           </w:p>
         </w:tc>
@@ -11677,7 +11678,7 @@
         <w:ind w:left="140" w:right="140"/>
       </w:pPr>
       <w:r>
-        <w:t>La decisión operativa es atacar primero el 82 %* de reposiciones manuales conectando inventario, rutas por comuna y postventa por WhatsApp, de modo que cada venta nueva entre a una cadena capaz de cumplir a tiempo.</w:t>
+        <w:t>La decisión operativa es unir una arquitectura conectada con seis agentes de IA que eliminan el 82 %* de trabajo manual en reposiciones, cotizaciones y stock, dejando siempre al alcance humano el control comercial, logístico y financiero.</w:t>
       </w:r>
     </w:p>
     <w:p>

</xml_diff>

<commit_message>
Actualiza recorrido productos y comodato y sincroniza entrega Marley
</commit_message>
<xml_diff>
--- a/Informe_EP3_MVP_HORECA_Marley_Coffee.docx
+++ b/Informe_EP3_MVP_HORECA_Marley_Coffee.docx
@@ -4,70 +4,43 @@
   <w:body>
     <w:p>
       <w:pPr>
-        <w:tabs>
-          <w:tab w:val="right" w:pos="9638"/>
-        </w:tabs>
-        <w:spacing w:after="60"/>
-      </w:pPr>
-      <w:r>
-        <w:rPr>
-          <w:b/>
-          <w:bCs/>
-          <w:color w:val="7A5D00"/>
-          <w:sz w:val="18"/>
-          <w:szCs w:val="18"/>
-        </w:rPr>
-        <w:t>MARLEY COFFEE CHILE · CANAL HORECA</w:t>
-      </w:r>
-      <w:r>
-        <w:rPr>
-          <w:b/>
-          <w:bCs/>
-          <w:color w:val="7A5D00"/>
-          <w:sz w:val="18"/>
-          <w:szCs w:val="18"/>
-        </w:rPr>
-        <w:tab/>
-        <w:t>TMA1103 · Duoc UC · EP3</w:t>
-      </w:r>
-    </w:p>
-    <w:p>
-      <w:pPr>
-        <w:spacing w:before="80" w:after="140"/>
-        <w:jc w:val="center"/>
+        <w:spacing w:after="0" w:line="20" w:lineRule="exact"/>
       </w:pPr>
       <w:r>
         <w:rPr>
           <w:noProof/>
         </w:rPr>
         <w:drawing>
-          <wp:inline distT="0" distB="0" distL="0" distR="0" wp14:anchorId="07C4E973" wp14:editId="283C8678">
-            <wp:extent cx="6115050" cy="3438525"/>
+          <wp:anchor distT="0" distB="0" distL="0" distR="0" simplePos="0" relativeHeight="251659500" behindDoc="1" locked="0" layoutInCell="1" allowOverlap="1" wp14:anchorId="370AA48E" wp14:editId="2E57ABD6">
+            <wp:simplePos x="0" y="0"/>
+            <wp:positionH relativeFrom="page">
+              <wp:posOffset>0</wp:posOffset>
+            </wp:positionH>
+            <wp:positionV relativeFrom="page">
+              <wp:posOffset>0</wp:posOffset>
+            </wp:positionV>
+            <wp:extent cx="7560310" cy="10692130"/>
             <wp:effectExtent l="0" t="0" r="0" b="0"/>
-            <wp:docPr id="1" name="portada_leon" descr="MVP basado en la convergencia de estrategias" title="Portada León Marley Coffee Empresas - Convergencia Estratégica"/>
-            <wp:cNvGraphicFramePr>
-              <a:graphicFrameLocks xmlns:a="http://schemas.openxmlformats.org/drawingml/2006/main" noChangeAspect="1"/>
-            </wp:cNvGraphicFramePr>
+            <wp:wrapNone/>
+            <wp:docPr id="9001" name="Portada generada integrada" descr="Marley Coffee Empresas. Producto mínimo viable para el canal HORECA. Integrantes: Nicolás Pérez - Carlos Vargas. Profesor: Samuel Muñoz. Ramo: Taller aplicado final. Sección: 002V. 19 de octubre de 2026."/>
+            <wp:cNvGraphicFramePr/>
             <a:graphic xmlns:a="http://schemas.openxmlformats.org/drawingml/2006/main">
               <a:graphicData uri="http://schemas.openxmlformats.org/drawingml/2006/picture">
                 <pic:pic xmlns:pic="http://schemas.openxmlformats.org/drawingml/2006/picture">
                   <pic:nvPicPr>
-                    <pic:cNvPr id="0" name=""/>
-                    <pic:cNvPicPr>
-                      <a:picLocks noChangeAspect="1" noChangeArrowheads="1"/>
-                    </pic:cNvPicPr>
+                    <pic:cNvPr id="0" name="Portada_Marley_Coffee_Generada.png"/>
+                    <pic:cNvPicPr/>
                   </pic:nvPicPr>
                   <pic:blipFill>
                     <a:blip r:embed="rId7"/>
-                    <a:srcRect/>
                     <a:stretch>
                       <a:fillRect/>
                     </a:stretch>
                   </pic:blipFill>
-                  <pic:spPr bwMode="auto">
+                  <pic:spPr>
                     <a:xfrm>
                       <a:off x="0" y="0"/>
-                      <a:ext cx="6115050" cy="3438525"/>
+                      <a:ext cx="7560310" cy="10692130"/>
                     </a:xfrm>
                     <a:prstGeom prst="rect">
                       <a:avLst/>
@@ -76,124 +49,8 @@
                 </pic:pic>
               </a:graphicData>
             </a:graphic>
-          </wp:inline>
+          </wp:anchor>
         </w:drawing>
-      </w:r>
-    </w:p>
-    <w:p>
-      <w:pPr>
-        <w:spacing w:after="100"/>
-      </w:pPr>
-      <w:r>
-        <w:rPr>
-          <w:caps/>
-          <w:color w:val="7A5D00"/>
-          <w:spacing w:val="25"/>
-          <w:sz w:val="18"/>
-          <w:szCs w:val="18"/>
-        </w:rPr>
-        <w:t>Propuesta inicial integrada · MVP · UX/UI · Inbound · eCommerce</w:t>
-      </w:r>
-    </w:p>
-    <w:p>
-      <w:pPr>
-        <w:pBdr>
-          <w:bottom w:val="single" w:sz="36" w:space="8" w:color="F7BE00"/>
-        </w:pBdr>
-        <w:spacing w:after="160" w:line="240" w:lineRule="auto"/>
-      </w:pPr>
-      <w:r>
-        <w:rPr>
-          <w:b/>
-          <w:bCs/>
-          <w:caps/>
-          <w:sz w:val="56"/>
-          <w:szCs w:val="56"/>
-        </w:rPr>
-        <w:t>Marley Coffee Empresas</w:t>
-      </w:r>
-    </w:p>
-    <w:p>
-      <w:pPr>
-        <w:spacing w:after="140" w:line="280" w:lineRule="auto"/>
-      </w:pPr>
-      <w:r>
-        <w:rPr>
-          <w:color w:val="3F3F40"/>
-          <w:sz w:val="22"/>
-          <w:szCs w:val="22"/>
-        </w:rPr>
-        <w:t>Una propuesta para que las empresas elijan su café con claridad y continúen la compra con una ejecutiva que ya conoce su necesidad. Sitio Empresas, portal del cliente y gestión interna conectados.</w:t>
-      </w:r>
-    </w:p>
-    <w:p>
-      <w:pPr>
-        <w:spacing w:after="50" w:line="250" w:lineRule="auto"/>
-      </w:pPr>
-      <w:r>
-        <w:rPr>
-          <w:b/>
-          <w:bCs/>
-          <w:sz w:val="19"/>
-          <w:szCs w:val="19"/>
-        </w:rPr>
-        <w:t>Evaluación Parcial N°3</w:t>
-      </w:r>
-      <w:r>
-        <w:rPr>
-          <w:sz w:val="19"/>
-          <w:szCs w:val="19"/>
-        </w:rPr>
-        <w:t xml:space="preserve"> · Encargo grupal · Taller Aplicado Final de Marketing</w:t>
-      </w:r>
-    </w:p>
-    <w:p>
-      <w:pPr>
-        <w:spacing w:after="50" w:line="250" w:lineRule="auto"/>
-      </w:pPr>
-      <w:r>
-        <w:rPr>
-          <w:sz w:val="19"/>
-          <w:szCs w:val="19"/>
-        </w:rPr>
-        <w:t>Indicadores de logro IL2.1 · IL2.2 · IL2.3</w:t>
-      </w:r>
-    </w:p>
-    <w:p>
-      <w:pPr>
-        <w:spacing w:after="50" w:line="250" w:lineRule="auto"/>
-      </w:pPr>
-      <w:r>
-        <w:rPr>
-          <w:sz w:val="19"/>
-          <w:szCs w:val="19"/>
-        </w:rPr>
-        <w:t>Integrantes: Nicolás Pérez y Carlos Vargas</w:t>
-      </w:r>
-    </w:p>
-    <w:p>
-      <w:pPr>
-        <w:spacing w:after="50" w:line="250" w:lineRule="auto"/>
-      </w:pPr>
-      <w:r>
-        <w:rPr>
-          <w:sz w:val="19"/>
-          <w:szCs w:val="19"/>
-        </w:rPr>
-        <w:t>Versión 3.7 · 15 de octubre de 2026 · atención conectada y postventa</w:t>
-      </w:r>
-    </w:p>
-    <w:p>
-      <w:pPr>
-        <w:spacing w:after="50" w:line="250" w:lineRule="auto"/>
-      </w:pPr>
-      <w:r>
-        <w:rPr>
-          <w:color w:val="3F3F40"/>
-          <w:sz w:val="15"/>
-          <w:szCs w:val="15"/>
-        </w:rPr>
-        <w:t>Anexos: A prototipo.html · B wireframes.html · C mockups.html · D diagramas.html · E Anexo_E_Matrices (Excel) · F Blueprint de inbound (PDF) · G a J en este documento</w:t>
       </w:r>
     </w:p>
     <w:p>
@@ -612,7 +469,7 @@
               <w:rPr>
                 <w:noProof/>
               </w:rPr>
-              <w:t>11</w:t>
+              <w:t>10</w:t>
             </w:r>
             <w:r>
               <w:rPr>
@@ -1305,14 +1162,7 @@
     </w:p>
     <w:p>
       <w:r>
-        <w:rPr>
-          <w:b/>
-          <w:bCs/>
-        </w:rPr>
-        <w:t>Marley Coffee Empresas conecta la vitrina digital, el diagnóstico comercial y la operación interna en un solo flujo continuo.</w:t>
-      </w:r>
-      <w:r>
-        <w:t xml:space="preserve"> El MVP propuesto articula un sitio B2B especializado, un portal interactivo del cliente y un CRM por rol asistido por una capa de agentes de inteligencia artificial. En lugar de pedir un cuestionario interminable, el comprador guarda su avance con nombre y correo, marca su operación en tres pasos simples y recibe al instante una propuesta en arriendo mensual o compra directa con rango de inversión estimado. Al mismo tiempo, el sistema asigna a la ejecutiva de su zona, verifica disponibilidad logística y mantiene un chat consultivo que prepara la propuesta y registra la solicitud; una ejecutiva revisa las condiciones y responde por correo sin hacerle repetir su historia.</w:t>
+        <w:t>Marley Coffee Empresas conecta la vitrina digital, el diagnóstico comercial y la operación interna en un solo flujo continuo. El MVP propuesto articula un sitio B2B especializado, un portal interactivo del cliente y un CRM por rol asistido por una capa de agentes de inteligencia artificial. En lugar de pedir un cuestionario interminable, el comprador guarda su avance con nombre y correo, marca su operación en tres pasos simples y recibe al instante una propuesta en comodato con compra mensual de insumos, carga inicial de referencia y abastecimiento mensual por cotizar. Al mismo tiempo, el sistema asigna a la ejecutiva de su zona, prepara la revisión logística y mantiene un chat consultivo que prepara la propuesta y registra la solicitud; una ejecutiva revisa las condiciones y responde por correo sin hacerle repetir su historia.</w:t>
       </w:r>
     </w:p>
     <w:p>
@@ -1423,17 +1273,7 @@
     </w:p>
     <w:p>
       <w:r>
-        <w:t xml:space="preserve">El diagnóstico del caso demostró que Marley Coffee no sufre un problema de producto ni de marca: lidera el retail con 50 % a 60 % de participación (Duoc UC, 2026b) y un tráfico saludable de 6,07 páginas por visita con apenas 16,05 % de rebote (Similarweb, 2026). </w:t>
-      </w:r>
-      <w:r>
-        <w:rPr>
-          <w:b/>
-          <w:bCs/>
-        </w:rPr>
-        <w:t>El cuello de botella está en la desconexión entre la demanda profesional que llega al sitio y la operación interna que debe atenderla.</w:t>
-      </w:r>
-      <w:r>
-        <w:t xml:space="preserve"> En la web actual de Marley, el canal B2B no existe como acceso visible: el comprador HORECA ingresa por la tienda de personas (B2C) y solo halla un botón genérico «Cotizar» que no segmenta su necesidad. Quien llega se topa con un formulario frío de ocho campos sin propuesta de valor de marca ni de máquinas, sin lead magnet y con la promesa de ser contactado en 3 a 5 días hábiles, mientras el equipo transcribe datos a mano (prompts madre; Equipo del proyecto, 2026a, 2026e). La Tabla 1 sintetiza cómo se transforma cada fricción real del sitio en valor de negocio.</w:t>
+        <w:t>El diagnóstico identificó una brecha entre la demanda profesional y la información disponible antes de cotizar: acceso poco claro, ocho campos y condiciones comerciales que el comprador aún desconoce. La captura del sitio anuncia un máximo de 3 días hábiles de contacto. En la consulta del equipo, Carlos Vargas reportó más de cinco días de espera para obtener una información básica: las máquinas se entregan en comodato, con compra mensual de insumos y carga base previa a la instalación. Es una experiencia puntual, no un promedio de atención de la empresa. La mejora propuesta consiste en explicar esas condiciones desde el home B2B y orientar la selección de equipo y productos antes de pedir más esfuerzo (Tabla 1; comunicación comercial aportada por el equipo, 19-10-2026).</w:t>
       </w:r>
     </w:p>
     <w:p>
@@ -1913,7 +1753,7 @@
                 <w:sz w:val="18"/>
                 <w:szCs w:val="18"/>
               </w:rPr>
-              <w:t>Formulario rígido de 8 campos sin beneficio que exige elegir máquina a ciegas y promete respuesta en 3 a 5 días (prompts madre; Equipo del proyecto, 2026a)</w:t>
+              <w:t>Formulario rígido de 8 campos sin beneficio que exige elegir máquina a ciegas y promete respuesta en un máximo de 3 días (prompts madre; Equipo del proyecto, 2026a)</w:t>
             </w:r>
           </w:p>
         </w:tc>
@@ -2073,7 +1913,7 @@
                 <w:sz w:val="18"/>
                 <w:szCs w:val="18"/>
               </w:rPr>
-              <w:t>Opacidad de precios: sin rangos de arriendo ni compra directa visibles, obligando a reuniones lentas para un dato básico (prompts madre; Equipo del proyecto, 2026a)</w:t>
+              <w:t>Condiciones de comodato, carga inicial y compra mensual no explicadas con claridad antes del contacto comercial (diagnóstico y comunicación del ejecutivo aportada por el equipo).</w:t>
             </w:r>
           </w:p>
         </w:tc>
@@ -2133,7 +1973,7 @@
                 <w:sz w:val="18"/>
                 <w:szCs w:val="18"/>
               </w:rPr>
-              <w:t>Propuesta instantánea calculada por el Agente de Ventas con precio estimado, máquina sugerida, cuota y desglose de consumo</w:t>
+              <w:t>Resumen de solución: equipo de referencia en comodato, consumo orientativo, pago inicial conocido y abastecimiento por cotizar</w:t>
             </w:r>
           </w:p>
         </w:tc>
@@ -2366,7 +2206,7 @@
           <w:noProof/>
         </w:rPr>
         <w:drawing>
-          <wp:inline distT="0" distB="0" distL="0" distR="0" wp14:anchorId="34FF6B15" wp14:editId="45BBD507">
+          <wp:inline distT="0" distB="0" distL="0" distR="0" wp14:anchorId="7467F8D2" wp14:editId="53C18673">
             <wp:extent cx="6115050" cy="2952750"/>
             <wp:effectExtent l="0" t="0" r="0" b="0"/>
             <wp:docPr id="2" name="fig1" descr="Figura 1. Ecosistema conectado: de cada contacto, un dato; de cada dato, una acción" title="Figura 1. Ecosistema conectado: de cada contacto, un dato; de cada dato, una acción"/>
@@ -2460,13 +2300,7 @@
     </w:p>
     <w:p>
       <w:r>
-        <w:rPr>
-          <w:b/>
-        </w:rPr>
-        <w:t xml:space="preserve">El objetivo estratégico del proyecto es lograr conectividad total del ecosistema y trazabilidad punto a punto, controlando cada interacción para medir qué ocurre en tiempo real y eliminar el trabajo manual mediante inteligencia artificial. </w:t>
-      </w:r>
-      <w:r>
-        <w:t>Hoy Marley Coffee desembolsa un piso estimado de $520.000 a $1.195.000 CLP/mes en softwares que operan como islas desconectadas: VTEX en plan Basic o Business ($190.000 a $475.000 CLP/mes más 1,5 % a 2,5 % de comisión por venta), Connectif ($95.000 a $240.000 CLP/mes), WiseCX/Zendesk ($140.000 a $260.000 CLP/mes) y JUMP para B2B ($95.000 a $220.000 CLP/mes, confirmado en las aclaraciones del caso; tarifas en VTEX Subscribe, Capterra y G2). Frente a ese gasto pasivo, la solución articula Claude Code ($19.500 CLP/mes, validado al construir el prototipo completo en dos semanas), un VPS de alta RAM en Hostinger ($24.200 a $55.000 CLP/mes) y Ollama Max ($96.000 CLP/mes) con deepseek-v4.1-flash, cuyos créditos cubren más de 330.000 peticiones mensuales de agentes —superando con holgura el tráfico actual de 295.637 visitas trimestrales (~98.546 visitas/mes, mayoritariamente B2C; Similarweb, 2026)— bajo dos rutas estratégicas que consumen menos del 1 % del presupuesto del brief (Tabla 2).</w:t>
+        <w:t>El objetivo es conectar el ecosistema y medir cada interacción sin duplicar datos. La Tabla 2 compara dos escenarios académicos de costo mensual: mantener e integrar las herramientas actuales, o migrar parte de ellas a una solución propia. Los rangos de VTEX, Connectif, atención y JUMP se utilizan como estimaciones de planificación, no como facturas auditadas de Marley Coffee. Los componentes de desarrollo, servidor e IA también requieren cotización y dimensionamiento en el piloto. Las lecturas públicas de APIs documentan una vía técnica de integración; no acreditan acceso productivo, capacidad suficiente ni un número garantizado de peticiones. Antes de contratar se deben validar con TI los permisos, volúmenes, seguridad, soporte y costo total (Anexo E, hojas 17 y 24).</w:t>
       </w:r>
     </w:p>
     <w:p>
@@ -2506,10 +2340,10 @@
       </w:pPr>
       <w:r>
         <w:rPr>
-          <w:color w:val="3F3F40"/>
+          <w:color w:val="000000"/>
           <w:sz w:val="16"/>
         </w:rPr>
-        <w:t>Nota de lectura: ambos caminos representan &lt; 1 % del presupuesto mensual del brief ($18,3M CLP/mes; $220M CLP/año). Especificaciones en Anexo E, hojas 17 y 24.</w:t>
+        <w:t>Nota de lectura: frente a $18,3M CLP/mes del brief ($220M al año), el Camino 1 equivale aproximadamente a 3,1–6,1 % y el Camino 2 a 0,8–0,9 %. Rangos académicos; implementación, comisiones y soporte se presupuestan aparte.</w:t>
       </w:r>
     </w:p>
     <w:tbl>
@@ -2823,7 +2657,7 @@
               <w:rPr>
                 <w:sz w:val="18"/>
               </w:rPr>
-              <w:t>El ahorro de JUMP compensa casi toda la IA: Marley paga prácticamente lo mismo que hoy, ganando conectividad inmediata y 19 agentes operativos.</w:t>
+              <w:t>Integra el contexto de seis agentes del MVP; la conectividad efectiva y el ahorro neto se verifican con TI en el piloto.</w:t>
             </w:r>
           </w:p>
         </w:tc>
@@ -2916,7 +2750,7 @@
               <w:rPr>
                 <w:sz w:val="18"/>
               </w:rPr>
-              <w:t>Ahorro de hasta 85 % en software fijo, 0 % de comisión por venta y liberación de casi la totalidad de los $220M CLP del brief para inversión comercial.</w:t>
+              <w:t>Puede reducir licencias recurrentes; el ahorro depende de cotizaciones comparables, migración, soporte y comisiones vigentes.</w:t>
             </w:r>
           </w:p>
         </w:tc>
@@ -3009,7 +2843,7 @@
               <w:rPr>
                 <w:sz w:val="18"/>
               </w:rPr>
-              <w:t>La IA construye la solución una vez y Python la ejecuta gratis 24/7: baja el costo de IA, elimina tareas manuales y guía en qué cuentas clave invertir.</w:t>
+              <w:t>Python ejecuta reglas sin consumo de tokens por cálculo; servidor, mantenimiento y supervisión mantienen costos.</w:t>
             </w:r>
           </w:p>
         </w:tc>
@@ -3022,13 +2856,7 @@
     </w:p>
     <w:p>
       <w:r>
-        <w:rPr>
-          <w:b/>
-        </w:rPr>
-        <w:t xml:space="preserve">Esta dualidad convierte el gasto en licencias en un sistema de control comercial que protege los $220.000.000 CLP anuales del brief ($18,3M/mes; Duoc UC, 2026b). </w:t>
-      </w:r>
-      <w:r>
-        <w:t>Mientras el Camino 1 conecta por API el ecosistema actual dando de baja JUMP, el Camino 2 migra a código Open Source propio y une los agentes de KPIs con algoritmos matemáticos en Python para experimentar con el lead scoring, identificar las cuentas clave (Key Accounts) más rentables y automatizar la reposición y el soporte (pausando campañas ante fallas técnicas) sin gastar tokens repetitivos, liberando más del 99 % del presupuesto para marketing y crecimiento real (Anexo E, hojas 17 y 24).</w:t>
+        <w:t>La decisión financiera de la arquitectura digital es comparar el costo total de ambos caminos tecnológicos antes de migrar. Estos costos de software se distinguen del modelo comercial del café: la máquina se presta en comodato y la facturación recurrente se sostiene en insumos. Implementación, seguridad, operación y soporte deben sumarse a las licencias. El piloto medirá costo por cuenta y horas ahorradas antes de decidir la plataforma (Anexo E, hojas 17 y 24).</w:t>
       </w:r>
     </w:p>
     <w:p>
@@ -3041,41 +2869,17 @@
     </w:p>
     <w:p>
       <w:r>
-        <w:t xml:space="preserve">Aplicando la ecuación de valor de Hormozi (2021) y el marco del curso (Duoc UC, 2026c), la propuesta desarrollada maximiza el resultado percibido y reduce a casi cero el tiempo de espera y el esfuerzo del cliente. </w:t>
-      </w:r>
-      <w:r>
-        <w:rPr>
-          <w:b/>
-          <w:bCs/>
-        </w:rPr>
-        <w:t>En menos de un minuto, cualquier negocio HORECA obtiene la máquina recomendada para su volumen, los kilos o cápsulas de café al mes y un rango transparente de costo mensual.</w:t>
-      </w:r>
-      <w:r>
-        <w:t xml:space="preserve"> Se definió además una regla comercial clara para todo el ecosistema: ofrecer únicamente arriendo mensual y compra directa de las máquinas, eliminando figuras ambiguas que inmovilizan capital sin asegurar rentabilidad. La efectividad de esta promesa se mide directamente en la tasa de aceptación de propuestas en pantalla y en el cierre de nuevos clientes contratados.</w:t>
-      </w:r>
-    </w:p>
-    <w:p>
-      <w:r>
-        <w:t xml:space="preserve">En lo competitivo, esta claridad resuelve la barrera del comprador profesional sin tocar los precios oficiales de Marley. </w:t>
-      </w:r>
-      <w:r>
-        <w:rPr>
-          <w:b/>
-          <w:bCs/>
-        </w:rPr>
-        <w:t>La ventaja diferencial no se construye bajando precios, sino eliminando la incertidumbre de comprar y reponer a tiempo.</w:t>
-      </w:r>
-      <w:r>
-        <w:t xml:space="preserve"> Al saber qué máquina le sirve, contar con ejecutiva de zona con respuesta bajo 5 minutos y reponer en un toque, el costo de cambiarse de proveedor sube de forma natural.</w:t>
-      </w:r>
-    </w:p>
-    <w:p>
-      <w:r>
-        <w:t xml:space="preserve">El diseño anticipa las objeciones del decisor B2B en el momento oportuno. Si duda de dejar datos sin beneficio, el sistema le explica que resguarda su cotización con código de seguimiento; si teme mensajes invasivos, los permisos de servicio y promoción se piden por separado; y si prefiere hablar </w:t>
-      </w:r>
-      <w:r>
-        <w:lastRenderedPageBreak/>
-        <w:t xml:space="preserve">con una persona, el asistente transfiere su ficha a la ejecutiva sin repetir nada. </w:t>
+        <w:t>La propuesta de valor une servicio y abastecimiento: entender qué equipo puede servir al negocio, elegir café e insumos y distinguir el pago inicial de la reposición mensual. La máquina se presta en comodato. El catálogo y el carrito cotizador convierten la exploración en una solicitud concreta, sin enviar al comprador a la tienda B2C. Una ejecutiva valida formatos, compatibilidad, disponibilidad y precios. Se evaluarán comprensión, continuidad hasta revisión comercial y recompra (Duoc UC, 2026c).</w:t>
+      </w:r>
+    </w:p>
+    <w:p>
+      <w:r>
+        <w:t>La información comercial debe estar antes del formulario: qué significa el comodato, qué se compra cada mes y qué se paga para comenzar. Esa claridad reduce incertidumbre sin inventar condiciones. La atención humana en menos de 5 minutos sigue siendo una meta del piloto, condicionada a horario, dotación y prioridad; la demora puntual informada por el equipo refuerza la necesidad de autoservicio informativo, sin atribuir una mejora ya lograda.</w:t>
+      </w:r>
+    </w:p>
+    <w:p>
+      <w:r>
+        <w:t xml:space="preserve">El diseño anticipa las objeciones del decisor B2B en el momento oportuno. Si duda de dejar datos sin beneficio, el sistema le explica que resguarda su cotización con código de seguimiento; si teme mensajes invasivos, los permisos de servicio y promoción se piden por separado; y si prefiere hablar con una persona, el asistente transfiere su ficha a la ejecutiva sin repetir nada. </w:t>
       </w:r>
       <w:r>
         <w:rPr>
@@ -3090,6 +2894,7 @@
         <w:pStyle w:val="Ttulo2"/>
       </w:pPr>
       <w:r>
+        <w:lastRenderedPageBreak/>
         <w:t>Plan de mejora y resultados esperados por hipótesis</w:t>
       </w:r>
     </w:p>
@@ -4189,7 +3994,6 @@
     </w:p>
     <w:p>
       <w:r>
-        <w:lastRenderedPageBreak/>
         <w:t xml:space="preserve">El despliegue sigue una lógica gradual que protege la operación actual: primero se cierra la segunda ronda de usabilidad y se activa la medición de eventos; luego se ejecuta el piloto de 90 días* en las zonas Oriente y Centro con ocho cuentas HORECA*; y finalmente se escala la integración con VTEX B2B Suite, el ERP y el resto de las regiones a los 12 meses (Equipo del proyecto, 2026e). </w:t>
       </w:r>
       <w:r>
@@ -4197,7 +4001,15 @@
           <w:b/>
           <w:bCs/>
         </w:rPr>
-        <w:t>Ninguna fase posterior se libera sin haber comprobado con datos los criterios de salida de la etapa previa.</w:t>
+        <w:t xml:space="preserve">Ninguna </w:t>
+      </w:r>
+      <w:r>
+        <w:rPr>
+          <w:b/>
+          <w:bCs/>
+        </w:rPr>
+        <w:lastRenderedPageBreak/>
+        <w:t>fase posterior se libera sin haber comprobado con datos los criterios de salida de la etapa previa.</w:t>
       </w:r>
     </w:p>
     <w:p>
@@ -4242,17 +4054,7 @@
     </w:p>
     <w:p>
       <w:r>
-        <w:t xml:space="preserve">Siguiendo el principio de producto mínimo viable (Ries, 2011; Duoc UC, 2026c), se diseñó el artefacto para validar la tesis central del proyecto con el menor riesgo técnico y financiero posible. </w:t>
-      </w:r>
-      <w:r>
-        <w:rPr>
-          <w:b/>
-          <w:bCs/>
-        </w:rPr>
-        <w:t>Se determinó construir con precisión el puente donde hoy se pierden los negocios: el paso desde el interés inicial en el sitio hasta la atención calificada y la recompra en un toque.</w:t>
-      </w:r>
-      <w:r>
-        <w:t xml:space="preserve"> En lugar de rediseñar el sitio B2C completo o desarrollar un facturador propio antes de validar la demanda, se concentró el alcance en los módulos que eliminan la fricción del cliente y el trabajo manual del equipo (Tabla 4).</w:t>
+        <w:t>El alcance conserva la tienda B2C y concentra el nuevo camino en Empresas: productos (C10), máquinas y condiciones del comodato (C11), contacto, diagnóstico y propuesta. Ambos pasos de exploración preceden a los datos, sin exigir artículos ni un equipo definitivo. Café e insumos sostienen la recurrencia; la máquina habilita el servicio. El carrito conserva cantidades y observaciones, sin pago, facturación o crédito (Ries, 2011; Tabla 4).</w:t>
       </w:r>
     </w:p>
     <w:p>
@@ -4510,19 +4312,10 @@
             </w:pPr>
             <w:r>
               <w:rPr>
-                <w:b/>
-                <w:bCs/>
-                <w:sz w:val="18"/>
-                <w:szCs w:val="18"/>
-              </w:rPr>
-              <w:t>Portada con máquinas primero</w:t>
-            </w:r>
-            <w:r>
-              <w:rPr>
-                <w:sz w:val="18"/>
-                <w:szCs w:val="18"/>
-              </w:rPr>
-              <w:t xml:space="preserve"> y soluciones filtradas por giro (hotel, restaurante, cafetería, eventos).</w:t>
+                <w:sz w:val="18"/>
+                <w:szCs w:val="18"/>
+              </w:rPr>
+              <w:t>Portada con valor del servicio, proceso, comodato y catálogo de productos; equipos según forma de servir.</w:t>
             </w:r>
           </w:p>
         </w:tc>
@@ -4674,35 +4467,10 @@
             </w:pPr>
             <w:r>
               <w:rPr>
-                <w:b/>
-                <w:bCs/>
-                <w:sz w:val="18"/>
-                <w:szCs w:val="18"/>
-              </w:rPr>
-              <w:t>Diagnóstico interactivo en 3 pasos</w:t>
-            </w:r>
-            <w:r>
-              <w:rPr>
-                <w:sz w:val="18"/>
-                <w:szCs w:val="18"/>
-              </w:rPr>
-              <w:t xml:space="preserve"> con valores sugeridos por giro y </w:t>
-            </w:r>
-            <w:r>
-              <w:rPr>
-                <w:b/>
-                <w:bCs/>
-                <w:sz w:val="18"/>
-                <w:szCs w:val="18"/>
-              </w:rPr>
-              <w:t>propuesta instantánea</w:t>
-            </w:r>
-            <w:r>
-              <w:rPr>
-                <w:sz w:val="18"/>
-                <w:szCs w:val="18"/>
-              </w:rPr>
-              <w:t xml:space="preserve"> en arriendo mensual o compra directa.</w:t>
+                <w:sz w:val="18"/>
+                <w:szCs w:val="18"/>
+              </w:rPr>
+              <w:t>Diagnóstico interactivo en 3 pasos con valores sugeridos por giro y propuesta instantánea en comodato con compra mensual de insumos.</w:t>
             </w:r>
           </w:p>
         </w:tc>
@@ -4729,19 +4497,10 @@
             </w:pPr>
             <w:r>
               <w:rPr>
-                <w:b/>
-                <w:bCs/>
-                <w:sz w:val="18"/>
-                <w:szCs w:val="18"/>
-              </w:rPr>
-              <w:t>Entrega de equipos sin cargo fijo</w:t>
-            </w:r>
-            <w:r>
-              <w:rPr>
-                <w:sz w:val="18"/>
-                <w:szCs w:val="18"/>
-              </w:rPr>
-              <w:t>: descartada del ecosistema para proteger el capital y estandarizar el margen con arriendo y compra directa.</w:t>
+                <w:sz w:val="18"/>
+                <w:szCs w:val="18"/>
+              </w:rPr>
+              <w:t>Arriendo y venta directa de máquinas: excluidos porque no corresponden al sistema comercial confirmado por el ejecutivo.</w:t>
             </w:r>
           </w:p>
         </w:tc>
@@ -4920,22 +4679,11 @@
     </w:p>
     <w:p>
       <w:r>
-        <w:rPr>
-          <w:b/>
-          <w:bCs/>
-        </w:rPr>
-        <w:t xml:space="preserve">Este alcance permite comprobar empíricamente desde hoy las dos hipótesis de impacto inmediato: la captación ágil con 3 datos y cotización en 60 segundos (Hipótesis 1), y la priorización comercial con atención asistida de la ejecutiva de zona (Hipótesis 3). Asimismo, </w:t>
-      </w:r>
-      <w:r>
-        <w:rPr>
-          <w:b/>
-          <w:bCs/>
-        </w:rPr>
+        <w:t xml:space="preserve">Este alcance permite demostrar el funcionamiento local y preparar la validación de dos hipótesis de impacto: la captación ágil con 3 datos y cotización en 60 segundos (Hipótesis 1), y la priorización comercial con atención asistida de la ejecutiva de zona (Hipótesis 3). Asimismo, deja completamente modelada y documentada la arquitectura para activar en el piloto la medición de canales (Hipótesis 2), la recomendación por giro según stock del ERP (Hipótesis 4), la recompra digital en un clic (Hipótesis 5) y la capa agéntica con aprobación humana (Hipótesis 6). Para operar en producción se requiere definir la dotación de ejecutivas por zona, los horarios hábiles, la matriz de rutas y el registro auditable de consentimientos conforme a la Ley 19.628. Asimismo, se estableció como restricción explícita que </w:t>
+      </w:r>
+      <w:r>
         <w:lastRenderedPageBreak/>
-        <w:t>deja completamente modelada y documentada la arquitectura para activar en el piloto la medición de canales (Hipótesis 2), la recomendación por giro según stock del ERP (Hipótesis 4), la recompra digital en un clic (Hipótesis 5) y la capa agéntica con aprobación humana (Hipótesis 6).</w:t>
-      </w:r>
-      <w:r>
-        <w:t xml:space="preserve"> Para operar en producción se requiere definir la dotación de ejecutivas por zona, los horarios hábiles, la matriz de rutas y el registro auditable de consentimientos conforme a la Ley 19.628. Asimismo, se estableció como restricción explícita que el prototipo rotule los precios como supuestos académicos y separe con total honestidad qué corre en el motor local del navegador y qué requiere credenciales corporativas.</w:t>
+        <w:t>el prototipo rotule los precios como supuestos académicos y separe con total honestidad qué corre en el motor local del navegador y qué requiere credenciales corporativas.</w:t>
       </w:r>
     </w:p>
     <w:p>
@@ -6113,38 +5861,18 @@
         <w:pStyle w:val="Ttulo2"/>
       </w:pPr>
       <w:r>
+        <w:t>Perfilamiento progresivo y recorrido conectado en paralelo</w:t>
+      </w:r>
+    </w:p>
+    <w:p>
+      <w:r>
+        <w:t>La arquitectura conecta B2C (C01), Empresas (C02–C11) y el CRM. Los CTA nuevos llevan a Productos y luego a Máquinas, antes del contacto (C03/LM2/W1). Revisar ambos pasos no obliga a agregar artículos ni elegir un equipo; el diagnóstico orienta después. Se conservan cesta, notas y preferencia. Gmail/Hotmail/Otro y +56 9 agilizan los datos; el seguimiento es por correo con permiso. Una propuesta guardada retoma su contexto.</w:t>
+      </w:r>
+    </w:p>
+    <w:p>
+      <w:r>
         <w:lastRenderedPageBreak/>
-        <w:t>Perfilamiento progresivo y recorrido conectado en paralelo</w:t>
-      </w:r>
-    </w:p>
-    <w:p>
-      <w:r>
-        <w:t xml:space="preserve">La arquitectura organiza tres espacios conectados en tiempo real: la tienda B2C (C01) con acceso a Empresas; el portal Marley Coffee Empresas (C02 a C09); y el CRM interno por rol: Ventas (R01–R04, R08, R10), Marketing (R11–R13), Jefatura (R05–R07, R14–R15) y Trazabilidad (R16). </w:t>
-      </w:r>
-      <w:r>
-        <w:rPr>
-          <w:b/>
-          <w:bCs/>
-        </w:rPr>
-        <w:t>En vez de pedir ocho campos de golpe, se implementó un perfilamiento progresivo por capas donde cada dato destraba un beneficio inmediato.</w:t>
-      </w:r>
-      <w:r>
-        <w:t xml:space="preserve"> Al pulsar «Cotizar», el comprador ingresa nombre y correo, con teléfono opcional (C03) a cambio de resguardar su cotización con código de seguimiento (LM2, workflow W1), permitiendo a Marley recuperar el avance por correo autorizado a las 24 horas si interrumpe su sesión (W4).</w:t>
-      </w:r>
-    </w:p>
-    <w:p>
-      <w:r>
-        <w:t xml:space="preserve">A continuación, el diagnóstico (C04) resuelve la configuración en tres pasos con valores premarcados por giro: tipo de local, comuna con volumen de tazas y modalidad de servicio. </w:t>
-      </w:r>
-      <w:r>
-        <w:rPr>
-          <w:b/>
-          <w:bCs/>
-        </w:rPr>
-        <w:t>Al tercer toque, el Agente de Ventas calcula la propuesta en pantalla (C05) sin esperas.</w:t>
-      </w:r>
-      <w:r>
-        <w:t xml:space="preserve"> El cliente compara arriendo mensual o compra directa, ajusta extras (C07) y pulsa «Confirmar propuesta» (C06). «Propuesta confirmada» muestra folio y resumen para revisión y seguimiento por correo; Mi cuenta (C09) corresponde a postventa tras contratar.</w:t>
+        <w:t>El diagnóstico (C04) reúne negocio, local, volumen y forma de servir en tres capas. La propuesta (C05) combina equipo de referencia en comodato, consumo orientativo y productos elegidos, separando carga inicial de reposición por cotizar. Se pueden ajustar cantidades, equipo y complementos sin perder datos. Confirmar registra interés y folio para revisión por correo (C06), sin contrato ni cobro. Ventas recibe la selección; Operaciones valida SKU, compatibilidad y stock. Mi cuenta (C09) representa la postventa.</w:t>
       </w:r>
     </w:p>
     <w:p>
@@ -6173,7 +5901,7 @@
           <w:noProof/>
         </w:rPr>
         <w:drawing>
-          <wp:inline distT="0" distB="0" distL="0" distR="0" wp14:anchorId="51E8438F" wp14:editId="5674B2DE">
+          <wp:inline distT="0" distB="0" distL="0" distR="0" wp14:anchorId="424FD4DA" wp14:editId="0BA57854">
             <wp:extent cx="6115050" cy="1600200"/>
             <wp:effectExtent l="0" t="0" r="0" b="0"/>
             <wp:docPr id="3" name="fig2" descr="Figura 2. Recorrido del cliente: un esfuerzo por paso, su lead magnet y el puntaje acumulado" title="Figura 2. Recorrido del cliente: un esfuerzo por paso, su lead magnet y el puntaje acumulado"/>
@@ -6220,12 +5948,10 @@
       </w:pPr>
       <w:r>
         <w:rPr>
-          <w:b/>
-          <w:bCs/>
           <w:sz w:val="19"/>
           <w:szCs w:val="19"/>
         </w:rPr>
-        <w:t>Figura 2. Recorrido del cliente: un esfuerzo por paso, su lead magnet y el puntaje acumulado</w:t>
+        <w:t>Figura 2. Recorrido vigente y puntaje de un caso ilustrativo; explorar no suma puntos adicionales</w:t>
       </w:r>
     </w:p>
     <w:p>
@@ -6240,7 +5966,7 @@
           <w:sz w:val="16"/>
           <w:szCs w:val="16"/>
         </w:rPr>
-        <w:t>Período: versión final, 15-10-2026 · Unidad: pasos; puntaje de interacción de 0 a 100 · Fuente: elaboración propia; puntajes medidos en el prototipo con un hotel de Las Condes (Anexo D, flujo 1; Anexo E, hoja 01)</w:t>
+        <w:t>Período: recorrido actualizado, 19-10-2026 · Unidad: pasos; puntaje de interacción de 0 a 100 · Fuente: elaboración propia; puntajes medidos en el prototipo con un hotel de Las Condes (Anexo D, flujo 1; Anexo E, hoja 01)</w:t>
       </w:r>
     </w:p>
     <w:p>
@@ -6259,17 +5985,7 @@
     </w:p>
     <w:p>
       <w:r>
-        <w:t xml:space="preserve">Para que al evaluar el prototipo nunca se pierda la relación entre lo que vive el cliente y lo que ocurre adentro de la empresa, se incorporó el Espejo Omnicanal en Vivo (⚡ Camino paralelo: Sitio ↔ CRM) junto con la barra de pulso inferior y la vista R16. </w:t>
-      </w:r>
-      <w:r>
-        <w:rPr>
-          <w:b/>
-          <w:bCs/>
-        </w:rPr>
-        <w:t>A medida que el usuario interactúa en el sitio web, puede abrir en paralelo el espejo para ver qué se disparó en el canal de Marketing, en la bandeja de Ventas, en Logística y en el CRM del Jefe.</w:t>
-      </w:r>
-      <w:r>
-        <w:t xml:space="preserve"> Asimismo, el camino de chat y postventa por WhatsApp permite comprobar cómo el asistente de IA entrega el resumen autorizado a la ejecutiva, guarda silencio apenas ella toma el caso y pausa las campañas comerciales si se registra una incidencia técnica (Anexos A a C y G; Anexo E, hojas 23 y 24).</w:t>
+        <w:t>El Espejo Omnicanal en Vivo se abre desde el menú de control de la demostración y permanece oculto en la experiencia habitual del cliente. Permite observar los eventos, puntajes y ejemplos de correo del motor local sin confundirlos con mensajes enviados. En el CRM, el chat muestra al cliente y a la ejecutiva; la IA presenta resúmenes y borradores en un panel interno por rol, que una persona revisa antes de usar. El traspaso pausa al bot (W6) y una incidencia suspende campañas (W9). La atención comercial continúa por correo; WhatsApp se ofrece únicamente para postventa iniciada por el cliente (Anexos A a C y G; Anexo E, hojas 23 y 24).</w:t>
       </w:r>
     </w:p>
     <w:p>
@@ -6299,7 +6015,6 @@
           <w:sz w:val="16"/>
           <w:szCs w:val="16"/>
         </w:rPr>
-        <w:lastRenderedPageBreak/>
         <w:t>IE2.2.2 · 15 % de la pauta</w:t>
       </w:r>
     </w:p>
@@ -6330,7 +6045,11 @@
         <w:t>El test de usabilidad se diseñó con un foco riguroso: comprobar si un decisor gastronómico y una ejecutiva de ventas podían cerrar una cotización de forma autónoma, sin guías ni manuales externos.</w:t>
       </w:r>
       <w:r>
-        <w:t xml:space="preserve"> El 15 de octubre de 2026 se ejecutaron cinco sesiones moderadas utilizando el motor de telemetría integrado en el propio prototipo (?test=sitio y ?test=crm), que mide tiempos exactos por pantalla, clics sin respuesta, mapas de calor y notas de observación directa. Para representar la realidad del canal HORECA se convocó a participantes reales según su cargo: Iván Valenzuela, en el rol de administrador de hotel (evaluando en computador de escritorio); Jimena Pérez, como administradora de restaurante (en celular); y Jocelyn Pizarro, como dueña de cafetería (en celular), quienes ejecutaron la tarea crítica de cotización (T1). En paralelo, Benjamín Espinoza evaluó el rol de ejecutiva comercial en el CRM de ventas (T7) y Claudio Aravena, en el rol de jefatura de ventas y KAM, evaluó el tablero directivo en celular (T9), aplicando las escalas estandarizadas SEQ y SUS (Sauro, 2011; Nielsen, 2000; Tabla 6).</w:t>
+        <w:t xml:space="preserve"> El 15 de octubre de 2026 se ejecutaron cinco sesiones moderadas utilizando el motor de telemetría integrado en el propio prototipo (?test=sitio y ?test=crm), que mide tiempos exactos por pantalla, clics sin respuesta, mapas de calor y notas de observación directa. Para representar la realidad del canal HORECA se convocó a participantes reales según su cargo: Iván Valenzuela, en el </w:t>
+      </w:r>
+      <w:r>
+        <w:lastRenderedPageBreak/>
+        <w:t>rol de administrador de hotel (evaluando en computador de escritorio); Jimena Pérez, como administradora de restaurante (en celular); y Jocelyn Pizarro, como dueña de cafetería (en celular), quienes ejecutaron la tarea crítica de cotización (T1). En paralelo, Benjamín Espinoza evaluó el rol de ejecutiva comercial en el CRM de ventas (T7) y Claudio Aravena, en el rol de jefatura de ventas y KAM, evaluó el tablero directivo en celular (T9), aplicando las escalas estandarizadas SEQ y SUS (Sauro, 2011; Nielsen, 2000; Tabla 6).</w:t>
       </w:r>
     </w:p>
     <w:p>
@@ -7747,17 +7466,7 @@
     </w:p>
     <w:p>
       <w:r>
-        <w:t xml:space="preserve">La telemetría en cinco tramos (Figura 3) identificó con nitidez los bloqueos. </w:t>
-      </w:r>
-      <w:r>
-        <w:rPr>
-          <w:b/>
-          <w:bCs/>
-        </w:rPr>
-        <w:t>El formulario inicial demandó 47,5 s en promedio y la propuesta otros 85,5 s, absorbiendo dos tercios de la sesión.</w:t>
-      </w:r>
-      <w:r>
-        <w:t xml:space="preserve"> En el formulario, escribir a mano el teléfono y buscar la comuna frenaba el avance; en la propuesta, frustraba no ver de entrada los valores en arriendo y compra directa. En celulares, la falta del texto «MENÚ» hacía que los decisores pasaran de largo sin hallar el acceso a Empresas.</w:t>
+        <w:t>La telemetría en cinco tramos (Figura 3) identificó con nitidez los bloqueos. El formulario inicial demandó 47,5 s en promedio y la propuesta otros 85,5 s, absorbiendo dos tercios de la sesión. En el formulario, escribir a mano el teléfono y buscar la comuna frenaba el avance; en la propuesta, frustraba no ver de entrada las referencias económicas en la versión probada. En celulares, la falta del texto «MENÚ» hacía que los decisores pasaran de largo sin hallar el acceso a Empresas.</w:t>
       </w:r>
     </w:p>
     <w:p>
@@ -7770,9 +7479,8 @@
         <w:rPr>
           <w:noProof/>
         </w:rPr>
-        <w:lastRenderedPageBreak/>
         <w:drawing>
-          <wp:inline distT="0" distB="0" distL="0" distR="0" wp14:anchorId="55FEDA65" wp14:editId="2D0D362D">
+          <wp:inline distT="0" distB="0" distL="0" distR="0" wp14:anchorId="6605ECC7" wp14:editId="0C598C53">
             <wp:extent cx="6115050" cy="1447800"/>
             <wp:effectExtent l="0" t="0" r="0" b="0"/>
             <wp:docPr id="4" name="fig3" descr="Figura 3. Tiempo de la tarea del cliente por etapa" title="Figura 3. Tiempo de la tarea del cliente por etapa"/>
@@ -7861,6 +7569,7 @@
         <w:pStyle w:val="Ttulo2"/>
       </w:pPr>
       <w:r>
+        <w:lastRenderedPageBreak/>
         <w:t>Hallazgos priorizados y mejoras implementadas en el prototipo</w:t>
       </w:r>
     </w:p>
@@ -7943,10 +7652,10 @@
         <w:tblLook w:val="0000" w:firstRow="0" w:lastRow="0" w:firstColumn="0" w:lastColumn="0" w:noHBand="0" w:noVBand="0"/>
       </w:tblPr>
       <w:tblGrid>
-        <w:gridCol w:w="2889"/>
+        <w:gridCol w:w="2888"/>
         <w:gridCol w:w="2215"/>
         <w:gridCol w:w="585"/>
-        <w:gridCol w:w="3949"/>
+        <w:gridCol w:w="3950"/>
       </w:tblGrid>
       <w:tr>
         <w:trPr>
@@ -8086,14 +7795,12 @@
             </w:pPr>
             <w:r>
               <w:rPr>
-                <w:b/>
-                <w:bCs/>
                 <w:caps/>
                 <w:color w:val="FFFFFF"/>
                 <w:sz w:val="16"/>
                 <w:szCs w:val="16"/>
               </w:rPr>
-              <w:t>Mejora estratégica incorporada el mismo día</w:t>
+              <w:t>Mejora de experiencia y actualización comercial</w:t>
             </w:r>
           </w:p>
         </w:tc>
@@ -8589,7 +8296,7 @@
                 <w:sz w:val="18"/>
                 <w:szCs w:val="18"/>
               </w:rPr>
-              <w:t>Propuesta en pantalla con arriendo mensual y compra directa, recomendador de insumos y extras</w:t>
+              <w:t>Propuesta en pantalla con comodato, carga inicial de referencia e insumos mensuales por cotizar; complementos opcionales.</w:t>
             </w:r>
           </w:p>
         </w:tc>
@@ -8976,23 +8683,17 @@
         <w:pStyle w:val="Ttulo2"/>
       </w:pPr>
       <w:r>
-        <w:lastRenderedPageBreak/>
         <w:t>Aprendizaje estratégico: el equilibrio entre experiencia y conversión</w:t>
       </w:r>
     </w:p>
     <w:p>
       <w:r>
-        <w:t xml:space="preserve">El mayor aprendizaje estratégico del test fue resolver la tensión entre rapidez de navegación y captura comercial. Si se eliminaba el formulario inicial, quien cerraba la ventana a mitad del diagnóstico se perdía sin opción de rescate. </w:t>
-      </w:r>
-      <w:r>
-        <w:rPr>
-          <w:b/>
-          <w:bCs/>
-        </w:rPr>
-        <w:t>La solución consistió en mantener la captura temprana reducida al mínimo: tres campos con autocompletado y prefijo telefónico listo.</w:t>
-      </w:r>
-      <w:r>
-        <w:t xml:space="preserve"> La segunda ronda comprobará que este ajuste baje el registro a menos de 30 segundos, consolidando un embudo sin fugas (Anexo E, hoja 22).</w:t>
+        <w:t>El aprendizaje del test fue equilibrar rapidez y captura comercial. Se mantuvieron tres campos: nombre, correo con selector Gmail/Hotmail/Otro y teléfono opcional con +56 9 preescrito. El diagnóstico continúa en tres capas para orientar la decisión sin pedir todo de golpe. La segunda ronda verificará si el registro baja de 30 segundos y si estas ayudas permiten avanzar con menos apoyo (Anexo E, hoja 22).</w:t>
+      </w:r>
+    </w:p>
+    <w:p>
+      <w:r>
+        <w:t>Actualización posterior al test: el19oct, el ejecutivo confirmó comodato y abastecimiento. Se incorporaron catálogo cotizador, revisión de máquinas y condiciones antes de los datos. Las fotos faltantes se ilustran con IA y rótulo visible; no certifican envases oficiales. La ronda1 no evaluó estas mejoras: la siguiente debe comprobar comprensión y continuidad hasta la propuesta.</w:t>
       </w:r>
     </w:p>
     <w:p>
@@ -9022,6 +8723,7 @@
           <w:sz w:val="16"/>
           <w:szCs w:val="16"/>
         </w:rPr>
+        <w:lastRenderedPageBreak/>
         <w:t>IE2.3.1 · 12 % de la pauta</w:t>
       </w:r>
     </w:p>
@@ -9067,36 +8769,12 @@
     </w:p>
     <w:p>
       <w:r>
-        <w:t xml:space="preserve">En la fase de atracción se combina el posicionamiento orgánico en Google (SEO) mediante páginas por tipo de negocio optimizadas para intenciones profesionales («arriendo cafetera industrial», «café en grano para cafeterías») con campañas pagadas (SEM) y videos testimoniales reales de locales gastronómicos. </w:t>
-      </w:r>
-      <w:r>
-        <w:rPr>
-          <w:b/>
-          <w:bCs/>
-        </w:rPr>
-        <w:t>Cada vez que se solicita un dato al comprador, se entrega previamente un Lead Magnet de servicio práctico, eliminando por completo los descuentos en primera compra que dañan el margen y degradan la marca.</w:t>
-      </w:r>
-      <w:r>
-        <w:t xml:space="preserve"> El sistema ofrece siete recursos de valor: diagnóstico de consumo en 60 segundos (LM1), respaldo de cotización en el correo (LM2), recomendación técnica de equipamiento (LM3), sugerencia de insumos complementarios con degustación (LM4), alertas preventivas de reposición (LM5), asesoría para aperturas de nuevos locales (LM6) y talleres de barismo y experiencias de marca por referir a otros colegas (LM7; Anexo E, hoja 15).</w:t>
-      </w:r>
-    </w:p>
-    <w:p>
-      <w:r>
-        <w:t xml:space="preserve">Todo el ciclo se apoya en diez workflows automatizados de acompañamiento (diseñados al estándar de HubSpot y detallados en el Anexo D) coordinados por el motor de Lead Scoring Dual (Anexo E, hojas 01, 03 y 05). </w:t>
-      </w:r>
-      <w:r>
-        <w:rPr>
-          <w:b/>
-          <w:bCs/>
-        </w:rPr>
-        <w:t>Se separa con total claridad el puntaje de interés comercial para prospectos nuevos del puntaje financiero para clientes con historial de compra.</w:t>
-      </w:r>
-      <w:r>
-        <w:t xml:space="preserve"> Para los prospectos, el sistema evalúa señales conductuales y la comuna: al declarar un giro HORECA y superar 40 puntos, el contacto se promueve a prospecto calificado (MQL), alertando a la ejecutiva con una meta de atención inferior a 5 minutos; si acepta la cotización en pantalla o supera 80 puntos, pasa a oportunidad prioritaria, donde el cierre comercial siempre lo valida una persona de Ventas. Para las cuentas activas, el puntaje financiero monitorea frecuencia, volumen y margen de compra para anticipar </w:t>
-      </w:r>
-      <w:r>
-        <w:lastRenderedPageBreak/>
-        <w:t>pedidos antes de un quiebre, pausando en el acto todo mensaje comercial si el cliente abre un reclamo de soporte técnico.</w:t>
+        <w:t>En la fase de atracción se combina el posicionamiento orgánico en Google (SEO) mediante páginas por tipo de negocio optimizadas para intenciones profesionales («máquina de café en comodato», «café en grano para cafeterías») con campañas pagadas (SEM) y videos testimoniales reales de locales gastronómicos. Cada vez que se solicita un dato al comprador, se entrega previamente un Lead Magnet de servicio práctico, eliminando por completo los descuentos en primera compra que dañan el margen y degradan la marca. El sistema ofrece siete recursos de valor: diagnóstico de consumo en 60 segundos (LM1), respaldo de cotización en el correo (LM2), recomendación técnica de equipamiento (LM3), sugerencia de insumos complementarios con degustación (LM4), alertas preventivas de reposición (LM5), asesoría para aperturas de nuevos locales (LM6) y talleres de barismo y experiencias de marca por referir a otros colegas (LM7; Anexo E, hoja 15).</w:t>
+      </w:r>
+    </w:p>
+    <w:p>
+      <w:r>
+        <w:t>Todo el ciclo se apoya en diez workflows automatizados de acompañamiento (diseñados al estándar de HubSpot y detallados en el Anexo D) coordinados por el motor de Lead Scoring Dual (Anexo E, hojas 01, 03 y 05). Se separa con total claridad el puntaje de interés comercial para prospectos nuevos del puntaje financiero para clientes con historial de compra. Para los prospectos, el sistema evalúa señales conductuales y la comuna: al dejar correo con permiso, declarar un giro HORECA y alcanzar 40 puntos, el contacto se promueve a prospecto calificado (MQL), alertando a la ejecutiva con una meta de atención inferior a 5 minutos; si acepta la cotización en pantalla o supera 80 puntos, pasa a oportunidad prioritaria, donde el cierre comercial siempre lo valida una persona de Ventas. Para las cuentas activas, el puntaje financiero monitorea frecuencia, volumen y margen de compra para anticipar pedidos antes de un quiebre, pausando en el acto todo mensaje comercial si el cliente abre un reclamo de soporte técnico.</w:t>
       </w:r>
     </w:p>
     <w:p>
@@ -9126,6 +8804,7 @@
           <w:sz w:val="16"/>
           <w:szCs w:val="16"/>
         </w:rPr>
+        <w:lastRenderedPageBreak/>
         <w:t>IE2.3.2 · 13 % de la pauta</w:t>
       </w:r>
     </w:p>
@@ -9141,17 +8820,7 @@
     </w:p>
     <w:p>
       <w:r>
-        <w:t xml:space="preserve">Un hallazgo clave del diagnóstico comercial es que el comercio B2B gastronómico no opera mediante un carrito de compras tradicional. Un administrador de hotel o restaurante no cierra una adquisición corporativa con tarjeta personal sin factura con RUT, orden de compra, crédito ni fecha de instalación confirmada. </w:t>
-      </w:r>
-      <w:r>
-        <w:rPr>
-          <w:b/>
-          <w:bCs/>
-        </w:rPr>
-        <w:t>Se estructuró un e-commerce de conversión asistida donde la web resuelve el 80 % de la configuración y la ejecutiva cierra el acuerdo con certeza operativa.</w:t>
-      </w:r>
-      <w:r>
-        <w:t xml:space="preserve"> El comprador personaliza su requerimiento en autoservicio, conoce su inversión mensual al instante y resuelve dudas en el chat y confirma su elección para revisión y seguimiento por correo. «Consultar por correo» registra una consulta sin cambiar la propuesta. La ejecutiva revisa condiciones, con ficha en vivo en el CRM (R02 y R08; Tabla 8).</w:t>
+        <w:t>Un hallazgo clave del diagnóstico comercial es que el comercio B2B gastronómico no opera mediante un carrito de compras tradicional. Un administrador de hotel o restaurante no cierra una adquisición corporativa con tarjeta personal sin factura con RUT, orden de compra, crédito ni fecha de instalación confirmada. Se estructuró un e-commerce de conversión asistida donde la web permite configurar la propuesta y la ejecutiva cierra el acuerdo con certeza operativa. El comprador personaliza su requerimiento en autoservicio, organiza su abastecimiento con condiciones claras y resuelve dudas en el chat y confirma su elección para revisión y seguimiento por correo. «Consultar por correo» registra una consulta sin cambiar la propuesta. La ejecutiva revisa condiciones, con ficha en vivo en el CRM (R02 y R08; Tabla 8).</w:t>
       </w:r>
     </w:p>
     <w:p>
@@ -9723,7 +9392,7 @@
                 <w:sz w:val="18"/>
                 <w:szCs w:val="18"/>
               </w:rPr>
-              <w:t>Confirmación de stock real por bodega, condiciones de arriendo o compra y alta con RUT y orden de compra</w:t>
+              <w:t>Confirmación de stock real por bodega, condiciones de comodato y abastecimiento y alta con RUT y orden de compra</w:t>
             </w:r>
           </w:p>
         </w:tc>
@@ -9913,23 +9582,12 @@
         <w:t>información corporativa interna y confidencial de Marley Coffee</w:t>
       </w:r>
       <w:r>
-        <w:t xml:space="preserve">, no disponible en esta etapa académica. Por ello, el flujo </w:t>
-      </w:r>
-      <w:r>
-        <w:lastRenderedPageBreak/>
-        <w:t>digital cubre la solicitud de propuesta y la reposición recurrente, documentando el checkout formal para la integración con Finanzas en el piloto.</w:t>
-      </w:r>
-    </w:p>
-    <w:p>
-      <w:r>
-        <w:t xml:space="preserve">Para maximizar el valor de vida del cliente (LTV) de forma armónica, se asigna un rol estratégico a cada línea del portafolio de Marley Coffee (Equipo del proyecto, 2026e; Marley Coffee Chile, s. f.-b): la máquina profesional (Bar, Oficina, Café al paso o Pods) opera como producto Ancla que establece la relación; el café en grano o cápsulas asegura la Recurrencia mensual; las infusiones y tés aportan Cobertura horaria en tardes y noches; las latas frías y barritas capturan compras de Impulso en vitrinas o minibares; y la vajilla, material POP y talleres de barismo consolidan la Experiencia de marca. </w:t>
-      </w:r>
-      <w:r>
-        <w:rPr>
-          <w:b/>
-          <w:bCs/>
-        </w:rPr>
-        <w:t>El cotizador presenta primero la propuesta base que resuelve la operación y ofrece complementos como sugerencias opcionales que el cliente añade solo si le generan valor.</w:t>
+        <w:t>, no disponible en esta etapa académica. Por ello, el flujo digital cubre la solicitud de propuesta y la reposición recurrente, documentando el checkout formal para la integración con Finanzas en el piloto.</w:t>
+      </w:r>
+    </w:p>
+    <w:p>
+      <w:r>
+        <w:t>La máquina en comodato ancla el servicio; café e insumos generan recurrencia. Té e infusiones cubren otros horarios; latas y barritas aportan impulso; vajilla y talleres, experiencia. El beneficio básico es servir café; el producto real une equipo y abastecimiento; el aumentado agrega acompañamiento opcional. C10 permite cotizar estos productos, con formatos y compatibilidad sujetos a validación (Marley Coffee Chile, s. f.-b; comunicación comercial del equipo, 19-10-2026).</w:t>
       </w:r>
     </w:p>
     <w:p>
@@ -9937,33 +9595,314 @@
         <w:pStyle w:val="Ttulo2"/>
       </w:pPr>
       <w:r>
-        <w:t>Modalidades comerciales y viabilidad económica</w:t>
-      </w:r>
-    </w:p>
+        <w:lastRenderedPageBreak/>
+        <w:t>Comodato y abastecimiento recurrente</w:t>
+      </w:r>
+    </w:p>
+    <w:p>
+      <w:r>
+        <w:t>El ejecutivo consultado confirmó un solo modelo para las máquinas: comodato, es decir, préstamo del equipo con compromiso de compra mensual de insumos. Antes de instalar se paga una carga base. La máquina sigue siendo central como parte del servicio, pero el ingreso recurrente proviene del abastecimiento. El presupuesto recibido para bajo y medio flujo es la referencia de la tabla siguiente; no representa una mensualidad ni el precio de venta de un equipo. No se informó mínimo mensual, plazo contractual, condiciones de retiro o mantención ni la identificación de los tres modelos mencionados en el correo.</w:t>
+      </w:r>
+    </w:p>
+    <w:tbl>
+      <w:tblPr>
+        <w:tblW w:w="9638" w:type="dxa"/>
+        <w:tblBorders>
+          <w:top w:val="single" w:sz="4" w:space="0" w:color="D9D9D9"/>
+          <w:left w:val="single" w:sz="4" w:space="0" w:color="D9D9D9"/>
+          <w:bottom w:val="single" w:sz="4" w:space="0" w:color="D9D9D9"/>
+          <w:right w:val="single" w:sz="4" w:space="0" w:color="D9D9D9"/>
+          <w:insideH w:val="single" w:sz="4" w:space="0" w:color="D9D9D9"/>
+          <w:insideV w:val="single" w:sz="4" w:space="0" w:color="D9D9D9"/>
+        </w:tblBorders>
+        <w:tblLayout w:type="fixed"/>
+        <w:tblLook w:val="04A0" w:firstRow="1" w:lastRow="0" w:firstColumn="1" w:lastColumn="0" w:noHBand="0" w:noVBand="1"/>
+      </w:tblPr>
+      <w:tblGrid>
+        <w:gridCol w:w="6500"/>
+        <w:gridCol w:w="3138"/>
+      </w:tblGrid>
+      <w:tr>
+        <w:trPr>
+          <w:cantSplit/>
+        </w:trPr>
+        <w:tc>
+          <w:tcPr>
+            <w:tcW w:w="6500" w:type="dxa"/>
+            <w:shd w:val="clear" w:color="auto" w:fill="E7E7E7"/>
+            <w:tcMar>
+              <w:top w:w="80" w:type="dxa"/>
+              <w:left w:w="80" w:type="dxa"/>
+              <w:bottom w:w="80" w:type="dxa"/>
+              <w:right w:w="80" w:type="dxa"/>
+            </w:tcMar>
+          </w:tcPr>
+          <w:p>
+            <w:pPr>
+              <w:spacing w:after="0" w:line="240" w:lineRule="auto"/>
+            </w:pPr>
+            <w:r>
+              <w:rPr>
+                <w:b/>
+                <w:color w:val="000000"/>
+                <w:sz w:val="20"/>
+              </w:rPr>
+              <w:t>Pago previo a instalar · bajo/medio flujo</w:t>
+            </w:r>
+          </w:p>
+        </w:tc>
+        <w:tc>
+          <w:tcPr>
+            <w:tcW w:w="3138" w:type="dxa"/>
+            <w:shd w:val="clear" w:color="auto" w:fill="E7E7E7"/>
+            <w:tcMar>
+              <w:top w:w="80" w:type="dxa"/>
+              <w:left w:w="80" w:type="dxa"/>
+              <w:bottom w:w="80" w:type="dxa"/>
+              <w:right w:w="80" w:type="dxa"/>
+            </w:tcMar>
+          </w:tcPr>
+          <w:p>
+            <w:pPr>
+              <w:spacing w:after="0" w:line="240" w:lineRule="auto"/>
+            </w:pPr>
+            <w:r>
+              <w:rPr>
+                <w:b/>
+                <w:color w:val="000000"/>
+                <w:sz w:val="20"/>
+              </w:rPr>
+              <w:t>Monto neto CLP</w:t>
+            </w:r>
+          </w:p>
+        </w:tc>
+      </w:tr>
+      <w:tr>
+        <w:trPr>
+          <w:cantSplit/>
+        </w:trPr>
+        <w:tc>
+          <w:tcPr>
+            <w:tcW w:w="6500" w:type="dxa"/>
+            <w:shd w:val="clear" w:color="auto" w:fill="FFFFFF"/>
+            <w:tcMar>
+              <w:top w:w="80" w:type="dxa"/>
+              <w:left w:w="80" w:type="dxa"/>
+              <w:bottom w:w="80" w:type="dxa"/>
+              <w:right w:w="80" w:type="dxa"/>
+            </w:tcMar>
+          </w:tcPr>
+          <w:p>
+            <w:pPr>
+              <w:spacing w:after="0" w:line="240" w:lineRule="auto"/>
+            </w:pPr>
+            <w:r>
+              <w:rPr>
+                <w:color w:val="000000"/>
+                <w:sz w:val="20"/>
+              </w:rPr>
+              <w:t>Carga base de insumos</w:t>
+            </w:r>
+          </w:p>
+        </w:tc>
+        <w:tc>
+          <w:tcPr>
+            <w:tcW w:w="3138" w:type="dxa"/>
+            <w:shd w:val="clear" w:color="auto" w:fill="FFFFFF"/>
+            <w:tcMar>
+              <w:top w:w="80" w:type="dxa"/>
+              <w:left w:w="80" w:type="dxa"/>
+              <w:bottom w:w="80" w:type="dxa"/>
+              <w:right w:w="80" w:type="dxa"/>
+            </w:tcMar>
+          </w:tcPr>
+          <w:p>
+            <w:pPr>
+              <w:spacing w:after="0" w:line="240" w:lineRule="auto"/>
+            </w:pPr>
+            <w:r>
+              <w:rPr>
+                <w:color w:val="000000"/>
+                <w:sz w:val="20"/>
+              </w:rPr>
+              <w:t>$1.331.220</w:t>
+            </w:r>
+          </w:p>
+        </w:tc>
+      </w:tr>
+      <w:tr>
+        <w:trPr>
+          <w:cantSplit/>
+        </w:trPr>
+        <w:tc>
+          <w:tcPr>
+            <w:tcW w:w="6500" w:type="dxa"/>
+            <w:shd w:val="clear" w:color="auto" w:fill="FFFFFF"/>
+            <w:tcMar>
+              <w:top w:w="80" w:type="dxa"/>
+              <w:left w:w="80" w:type="dxa"/>
+              <w:bottom w:w="80" w:type="dxa"/>
+              <w:right w:w="80" w:type="dxa"/>
+            </w:tcMar>
+          </w:tcPr>
+          <w:p>
+            <w:pPr>
+              <w:spacing w:after="0" w:line="240" w:lineRule="auto"/>
+            </w:pPr>
+            <w:r>
+              <w:rPr>
+                <w:color w:val="000000"/>
+                <w:sz w:val="20"/>
+              </w:rPr>
+              <w:t>Kit de instalación</w:t>
+            </w:r>
+          </w:p>
+        </w:tc>
+        <w:tc>
+          <w:tcPr>
+            <w:tcW w:w="3138" w:type="dxa"/>
+            <w:shd w:val="clear" w:color="auto" w:fill="FFFFFF"/>
+            <w:tcMar>
+              <w:top w:w="80" w:type="dxa"/>
+              <w:left w:w="80" w:type="dxa"/>
+              <w:bottom w:w="80" w:type="dxa"/>
+              <w:right w:w="80" w:type="dxa"/>
+            </w:tcMar>
+          </w:tcPr>
+          <w:p>
+            <w:pPr>
+              <w:spacing w:after="0" w:line="240" w:lineRule="auto"/>
+            </w:pPr>
+            <w:r>
+              <w:rPr>
+                <w:color w:val="000000"/>
+                <w:sz w:val="20"/>
+              </w:rPr>
+              <w:t>$100.000</w:t>
+            </w:r>
+          </w:p>
+        </w:tc>
+      </w:tr>
+      <w:tr>
+        <w:trPr>
+          <w:cantSplit/>
+        </w:trPr>
+        <w:tc>
+          <w:tcPr>
+            <w:tcW w:w="6500" w:type="dxa"/>
+            <w:shd w:val="clear" w:color="auto" w:fill="FFFFFF"/>
+            <w:tcMar>
+              <w:top w:w="80" w:type="dxa"/>
+              <w:left w:w="80" w:type="dxa"/>
+              <w:bottom w:w="80" w:type="dxa"/>
+              <w:right w:w="80" w:type="dxa"/>
+            </w:tcMar>
+          </w:tcPr>
+          <w:p>
+            <w:pPr>
+              <w:spacing w:after="0" w:line="240" w:lineRule="auto"/>
+            </w:pPr>
+            <w:r>
+              <w:rPr>
+                <w:color w:val="000000"/>
+                <w:sz w:val="20"/>
+              </w:rPr>
+              <w:t>Filtro</w:t>
+            </w:r>
+          </w:p>
+        </w:tc>
+        <w:tc>
+          <w:tcPr>
+            <w:tcW w:w="3138" w:type="dxa"/>
+            <w:shd w:val="clear" w:color="auto" w:fill="FFFFFF"/>
+            <w:tcMar>
+              <w:top w:w="80" w:type="dxa"/>
+              <w:left w:w="80" w:type="dxa"/>
+              <w:bottom w:w="80" w:type="dxa"/>
+              <w:right w:w="80" w:type="dxa"/>
+            </w:tcMar>
+          </w:tcPr>
+          <w:p>
+            <w:pPr>
+              <w:spacing w:after="0" w:line="240" w:lineRule="auto"/>
+            </w:pPr>
+            <w:r>
+              <w:rPr>
+                <w:color w:val="000000"/>
+                <w:sz w:val="20"/>
+              </w:rPr>
+              <w:t>$60.000</w:t>
+            </w:r>
+          </w:p>
+        </w:tc>
+      </w:tr>
+      <w:tr>
+        <w:trPr>
+          <w:cantSplit/>
+        </w:trPr>
+        <w:tc>
+          <w:tcPr>
+            <w:tcW w:w="6500" w:type="dxa"/>
+            <w:shd w:val="clear" w:color="auto" w:fill="E7E7E7"/>
+            <w:tcMar>
+              <w:top w:w="80" w:type="dxa"/>
+              <w:left w:w="80" w:type="dxa"/>
+              <w:bottom w:w="80" w:type="dxa"/>
+              <w:right w:w="80" w:type="dxa"/>
+            </w:tcMar>
+          </w:tcPr>
+          <w:p>
+            <w:pPr>
+              <w:spacing w:after="0" w:line="240" w:lineRule="auto"/>
+            </w:pPr>
+            <w:r>
+              <w:rPr>
+                <w:b/>
+                <w:color w:val="000000"/>
+                <w:sz w:val="20"/>
+              </w:rPr>
+              <w:t>Total inicial de referencia</w:t>
+            </w:r>
+          </w:p>
+        </w:tc>
+        <w:tc>
+          <w:tcPr>
+            <w:tcW w:w="3138" w:type="dxa"/>
+            <w:shd w:val="clear" w:color="auto" w:fill="E7E7E7"/>
+            <w:tcMar>
+              <w:top w:w="80" w:type="dxa"/>
+              <w:left w:w="80" w:type="dxa"/>
+              <w:bottom w:w="80" w:type="dxa"/>
+              <w:right w:w="80" w:type="dxa"/>
+            </w:tcMar>
+          </w:tcPr>
+          <w:p>
+            <w:pPr>
+              <w:spacing w:after="0" w:line="240" w:lineRule="auto"/>
+            </w:pPr>
+            <w:r>
+              <w:rPr>
+                <w:b/>
+                <w:color w:val="000000"/>
+                <w:sz w:val="20"/>
+              </w:rPr>
+              <w:t>$1.491.220</w:t>
+            </w:r>
+          </w:p>
+        </w:tc>
+      </w:tr>
+    </w:tbl>
     <w:p>
       <w:r>
         <w:rPr>
-          <w:b/>
-          <w:bCs/>
+          <w:sz w:val="18"/>
         </w:rPr>
-        <w:t>En todo el ecosistema rigen exclusivamente dos modalidades comerciales para el equipamiento: arriendo mensual y compra directa de la cafetera, tarificando siempre el suministro de café por separado según el consumo.</w:t>
-      </w:r>
-      <w:r>
-        <w:t xml:space="preserve"> Se erradican modelos ambiguos de comodato o préstamos informales que inmovilizan activos de la empresa sin asegurar rentabilidad. A modo de ejemplo, para un hotel que sirve 250 tazas diarias durante 26 días al mes, la máquina profesional en arriendo junto a 52 kg de café en grano representa un costo estimado de $1,32 a $1,75 millones mensuales más IVA* ($202 a $269 por taza más IVA); si opta por la compra directa, adquiere el equipo por un pago único de $2,9 a $4,5 millones más IVA* y mantiene únicamente la reposición periódica de café (Anexo E, hoja 19). Todos los valores se rotulan como supuestos académicos que la ejecutiva ratifica antes de contratar.</w:t>
-      </w:r>
-    </w:p>
-    <w:p>
-      <w:r>
-        <w:t xml:space="preserve">A nivel de costos, tanto el Camino 1 por API dando de baja JUMP como el Camino 2 en WooCommerce, CRM Open Source en VPS y automatización en Python ($139.700 a $170.500 CLP/mes) consumen &lt; 1 % del presupuesto del brief ($220M anuales*), liberando el capital para inversión comercial. </w:t>
-      </w:r>
-      <w:r>
-        <w:rPr>
-          <w:b/>
-        </w:rPr>
-        <w:t xml:space="preserve">El beneficio financiero se sustenta en dos palancas medidas punto a punto: reducir en un 33 % el costo de captación de clientes al elevar la conversión del 12 % al 18 %*, y extender la permanencia de cada cuenta de 7,1 a 10 años al subir la retención anual del 86 % al 90 %* (Anexo E, hoja 16). </w:t>
-      </w:r>
-      <w:r>
-        <w:t>Bajo las 7C del e-commerce (Rayport y Jaworski, 2000), se completa además la dimensión de Comunidad mediante el programa de referidos entre pares gastronómicos.</w:t>
+        <w:t>Fuente: correo y presupuesto del ejecutivo compartidos por el equipo, consultados el 19-10-2026. La suma es $1.331.220 + $100.000 + $60.000. El recetario y catálogo mencionados no se recibieron; no se dispone de márgenes ni de una mensualidad verificable.</w:t>
+      </w:r>
+    </w:p>
+    <w:p>
+      <w:r>
+        <w:t>El Camino 1 supone $565.000 a $1.110.000 CLP/mes y el Camino 2 $139.700 a $170.500 CLP/mes: aproximadamente 3,1–6,1 % y 0,8–0,9 % del presupuesto mensual equivalente del brief, antes de implementación, comisiones y soporte. El beneficio comercial es una hipótesis: al pasar la conversión de 12 % a 18 %*, el costo por cliente bajaría un tercio solo si el gasto y los contactos permanecen constantes. Bajo un modelo de retención constante, 86 % y 90 %* equivalen a 7,1 y 10 años esperados; no son permanencias observadas (Anexo E, hoja 16). El programa de referidos refuerza la comunidad entre pares gastronómicos.</w:t>
       </w:r>
     </w:p>
     <w:p>
@@ -9977,7 +9916,7 @@
         <w:ind w:left="140" w:right="140"/>
       </w:pPr>
       <w:r>
-        <w:t>La decisión es impulsar la conversión mediante transparencia radical: mostrar al instante el costo estimado en arriendo o compra directa, sugerir venta cruzada sin imponerla y formalizar el contrato con respaldo humano.</w:t>
+        <w:t>La decisión es convertir con información útil: comodato y proceso claros, productos con presencia propia y un carrito cotizador que mantiene la selección hasta el CRM. El abastecimiento es la venta principal; la experiencia y los accesorios amplían el valor de forma opcional. La siguiente ronda comprobará si el cliente comprende qué elige, qué paga al inicio y qué debe validar para reponer.</w:t>
       </w:r>
     </w:p>
     <w:p>
@@ -10020,57 +9959,343 @@
         <w:t xml:space="preserve"> Como muestra la Figura 4, los agentes absorben el trabajo mecánico en la cadena de valor y dejan al alcance exclusivo de lo humano el criterio comercial, financiero y relacional.</w:t>
       </w:r>
     </w:p>
-    <w:p>
-      <w:pPr>
-        <w:keepNext/>
-        <w:spacing w:before="120" w:after="60"/>
-        <w:jc w:val="center"/>
-      </w:pPr>
-      <w:r>
-        <w:rPr>
-          <w:noProof/>
-        </w:rPr>
-        <w:lastRenderedPageBreak/>
-        <w:drawing>
-          <wp:inline distT="0" distB="0" distL="0" distR="0" wp14:anchorId="6EE41BE2" wp14:editId="400EAE81">
-            <wp:extent cx="6115050" cy="1720000"/>
-            <wp:effectExtent l="0" t="0" r="0" b="0"/>
-            <wp:docPr id="5" name="fig4" descr="Figura 4. Agentes y personas en la cadena de valor, con el cuello de botella marcado" title="Figura 4. Agentes y personas en la cadena de valor, con el cuello de botella marcado"/>
-            <wp:cNvGraphicFramePr>
-              <a:graphicFrameLocks xmlns:a="http://schemas.openxmlformats.org/drawingml/2006/main" noChangeAspect="1"/>
-            </wp:cNvGraphicFramePr>
-            <a:graphic xmlns:a="http://schemas.openxmlformats.org/drawingml/2006/main">
-              <a:graphicData uri="http://schemas.openxmlformats.org/drawingml/2006/picture">
-                <pic:pic xmlns:pic="http://schemas.openxmlformats.org/drawingml/2006/picture">
-                  <pic:nvPicPr>
-                    <pic:cNvPr id="0" name=""/>
-                    <pic:cNvPicPr>
-                      <a:picLocks noChangeAspect="1" noChangeArrowheads="1"/>
-                    </pic:cNvPicPr>
-                  </pic:nvPicPr>
-                  <pic:blipFill>
-                    <a:blip r:embed="rId11"/>
-                    <a:srcRect/>
-                    <a:stretch>
-                      <a:fillRect/>
-                    </a:stretch>
-                  </pic:blipFill>
-                  <pic:spPr bwMode="auto">
-                    <a:xfrm>
-                      <a:off x="0" y="0"/>
-                      <a:ext cx="6115050" cy="1720000"/>
-                    </a:xfrm>
-                    <a:prstGeom prst="rect">
-                      <a:avLst/>
-                    </a:prstGeom>
-                  </pic:spPr>
-                </pic:pic>
-              </a:graphicData>
-            </a:graphic>
-          </wp:inline>
-        </w:drawing>
-      </w:r>
-    </w:p>
+    <w:tbl>
+      <w:tblPr>
+        <w:tblW w:w="9638" w:type="dxa"/>
+        <w:tblBorders>
+          <w:top w:val="single" w:sz="6" w:space="0" w:color="D3D3D3"/>
+          <w:left w:val="single" w:sz="6" w:space="0" w:color="D3D3D3"/>
+          <w:bottom w:val="single" w:sz="6" w:space="0" w:color="D3D3D3"/>
+          <w:right w:val="single" w:sz="6" w:space="0" w:color="D3D3D3"/>
+          <w:insideH w:val="single" w:sz="6" w:space="0" w:color="D3D3D3"/>
+          <w:insideV w:val="single" w:sz="6" w:space="0" w:color="D3D3D3"/>
+        </w:tblBorders>
+        <w:tblLayout w:type="fixed"/>
+        <w:tblLook w:val="04A0" w:firstRow="1" w:lastRow="0" w:firstColumn="1" w:lastColumn="0" w:noHBand="0" w:noVBand="1"/>
+      </w:tblPr>
+      <w:tblGrid>
+        <w:gridCol w:w="3212"/>
+        <w:gridCol w:w="3213"/>
+        <w:gridCol w:w="3213"/>
+      </w:tblGrid>
+      <w:tr>
+        <w:trPr>
+          <w:cantSplit/>
+        </w:trPr>
+        <w:tc>
+          <w:tcPr>
+            <w:tcW w:w="3212" w:type="dxa"/>
+            <w:tcMar>
+              <w:top w:w="90" w:type="dxa"/>
+              <w:left w:w="90" w:type="dxa"/>
+              <w:bottom w:w="90" w:type="dxa"/>
+              <w:right w:w="90" w:type="dxa"/>
+            </w:tcMar>
+          </w:tcPr>
+          <w:p>
+            <w:pPr>
+              <w:keepNext/>
+              <w:spacing w:after="40" w:line="220" w:lineRule="exact"/>
+            </w:pPr>
+            <w:r>
+              <w:rPr>
+                <w:b/>
+                <w:color w:val="000000"/>
+                <w:sz w:val="18"/>
+              </w:rPr>
+              <w:lastRenderedPageBreak/>
+              <w:t>1 · Captación</w:t>
+            </w:r>
+          </w:p>
+          <w:p>
+            <w:pPr>
+              <w:keepNext/>
+              <w:spacing w:after="40" w:line="220" w:lineRule="exact"/>
+            </w:pPr>
+            <w:r>
+              <w:rPr>
+                <w:color w:val="000000"/>
+                <w:sz w:val="17"/>
+              </w:rPr>
+              <w:t>IA: guarda datos y puntúa.</w:t>
+            </w:r>
+          </w:p>
+          <w:p>
+            <w:pPr>
+              <w:keepNext/>
+              <w:spacing w:after="40" w:line="220" w:lineRule="exact"/>
+            </w:pPr>
+            <w:r>
+              <w:rPr>
+                <w:color w:val="000000"/>
+                <w:sz w:val="17"/>
+              </w:rPr>
+              <w:t>Persona: valida campaña y SQL.</w:t>
+            </w:r>
+          </w:p>
+        </w:tc>
+        <w:tc>
+          <w:tcPr>
+            <w:tcW w:w="3212" w:type="dxa"/>
+            <w:tcMar>
+              <w:top w:w="90" w:type="dxa"/>
+              <w:left w:w="90" w:type="dxa"/>
+              <w:bottom w:w="90" w:type="dxa"/>
+              <w:right w:w="90" w:type="dxa"/>
+            </w:tcMar>
+          </w:tcPr>
+          <w:p>
+            <w:pPr>
+              <w:keepNext/>
+              <w:spacing w:after="40" w:line="220" w:lineRule="exact"/>
+            </w:pPr>
+            <w:r>
+              <w:rPr>
+                <w:b/>
+                <w:color w:val="000000"/>
+                <w:sz w:val="18"/>
+              </w:rPr>
+              <w:t>2 · Stock</w:t>
+            </w:r>
+          </w:p>
+          <w:p>
+            <w:pPr>
+              <w:keepNext/>
+              <w:spacing w:after="40" w:line="220" w:lineRule="exact"/>
+            </w:pPr>
+            <w:r>
+              <w:rPr>
+                <w:color w:val="000000"/>
+                <w:sz w:val="17"/>
+              </w:rPr>
+              <w:t>IA: consulta y propone sustitutos.</w:t>
+            </w:r>
+          </w:p>
+          <w:p>
+            <w:pPr>
+              <w:keepNext/>
+              <w:spacing w:after="40" w:line="220" w:lineRule="exact"/>
+            </w:pPr>
+            <w:r>
+              <w:rPr>
+                <w:color w:val="000000"/>
+                <w:sz w:val="17"/>
+              </w:rPr>
+              <w:t>Persona: confirma disponibilidad.</w:t>
+            </w:r>
+          </w:p>
+        </w:tc>
+        <w:tc>
+          <w:tcPr>
+            <w:tcW w:w="3212" w:type="dxa"/>
+            <w:tcMar>
+              <w:top w:w="90" w:type="dxa"/>
+              <w:left w:w="90" w:type="dxa"/>
+              <w:bottom w:w="90" w:type="dxa"/>
+              <w:right w:w="90" w:type="dxa"/>
+            </w:tcMar>
+          </w:tcPr>
+          <w:p>
+            <w:pPr>
+              <w:keepNext/>
+              <w:spacing w:after="40" w:line="220" w:lineRule="exact"/>
+            </w:pPr>
+            <w:r>
+              <w:rPr>
+                <w:b/>
+                <w:color w:val="000000"/>
+                <w:sz w:val="18"/>
+              </w:rPr>
+              <w:t>3 · Preparación</w:t>
+            </w:r>
+          </w:p>
+          <w:p>
+            <w:pPr>
+              <w:keepNext/>
+              <w:spacing w:after="40" w:line="220" w:lineRule="exact"/>
+            </w:pPr>
+            <w:r>
+              <w:rPr>
+                <w:color w:val="000000"/>
+                <w:sz w:val="17"/>
+              </w:rPr>
+              <w:t>IA: prepara reserva y pedido.</w:t>
+            </w:r>
+          </w:p>
+          <w:p>
+            <w:pPr>
+              <w:keepNext/>
+              <w:spacing w:after="40" w:line="220" w:lineRule="exact"/>
+            </w:pPr>
+            <w:r>
+              <w:rPr>
+                <w:color w:val="000000"/>
+                <w:sz w:val="17"/>
+              </w:rPr>
+              <w:t>Persona: acepta y verifica armado.</w:t>
+            </w:r>
+          </w:p>
+        </w:tc>
+      </w:tr>
+      <w:tr>
+        <w:trPr>
+          <w:cantSplit/>
+        </w:trPr>
+        <w:tc>
+          <w:tcPr>
+            <w:tcW w:w="3212" w:type="dxa"/>
+            <w:tcMar>
+              <w:top w:w="90" w:type="dxa"/>
+              <w:left w:w="90" w:type="dxa"/>
+              <w:bottom w:w="90" w:type="dxa"/>
+              <w:right w:w="90" w:type="dxa"/>
+            </w:tcMar>
+          </w:tcPr>
+          <w:p>
+            <w:pPr>
+              <w:keepNext/>
+              <w:spacing w:after="40" w:line="220" w:lineRule="exact"/>
+            </w:pPr>
+            <w:r>
+              <w:rPr>
+                <w:b/>
+                <w:color w:val="000000"/>
+                <w:sz w:val="18"/>
+              </w:rPr>
+              <w:t>4 · Distribución</w:t>
+            </w:r>
+          </w:p>
+          <w:p>
+            <w:pPr>
+              <w:keepNext/>
+              <w:spacing w:after="40" w:line="220" w:lineRule="exact"/>
+            </w:pPr>
+            <w:r>
+              <w:rPr>
+                <w:color w:val="000000"/>
+                <w:sz w:val="17"/>
+              </w:rPr>
+              <w:t>IA: sugiere ruta y prioridades.</w:t>
+            </w:r>
+          </w:p>
+          <w:p>
+            <w:pPr>
+              <w:keepNext/>
+              <w:spacing w:after="40" w:line="220" w:lineRule="exact"/>
+            </w:pPr>
+            <w:r>
+              <w:rPr>
+                <w:color w:val="000000"/>
+                <w:sz w:val="17"/>
+              </w:rPr>
+              <w:t>Persona: confirma la fecha.</w:t>
+            </w:r>
+          </w:p>
+        </w:tc>
+        <w:tc>
+          <w:tcPr>
+            <w:tcW w:w="3212" w:type="dxa"/>
+            <w:tcMar>
+              <w:top w:w="90" w:type="dxa"/>
+              <w:left w:w="90" w:type="dxa"/>
+              <w:bottom w:w="90" w:type="dxa"/>
+              <w:right w:w="90" w:type="dxa"/>
+            </w:tcMar>
+          </w:tcPr>
+          <w:p>
+            <w:pPr>
+              <w:keepNext/>
+              <w:spacing w:after="40" w:line="220" w:lineRule="exact"/>
+            </w:pPr>
+            <w:r>
+              <w:rPr>
+                <w:b/>
+                <w:color w:val="000000"/>
+                <w:sz w:val="18"/>
+              </w:rPr>
+              <w:t>5 · Cobro</w:t>
+            </w:r>
+          </w:p>
+          <w:p>
+            <w:pPr>
+              <w:keepNext/>
+              <w:spacing w:after="40" w:line="220" w:lineRule="exact"/>
+            </w:pPr>
+            <w:r>
+              <w:rPr>
+                <w:color w:val="000000"/>
+                <w:sz w:val="17"/>
+              </w:rPr>
+              <w:t>IA: prepara alta y conciliación.</w:t>
+            </w:r>
+          </w:p>
+          <w:p>
+            <w:pPr>
+              <w:keepNext/>
+              <w:spacing w:after="40" w:line="220" w:lineRule="exact"/>
+            </w:pPr>
+            <w:r>
+              <w:rPr>
+                <w:color w:val="000000"/>
+                <w:sz w:val="17"/>
+              </w:rPr>
+              <w:t>Persona: aprueba crédito y factura.</w:t>
+            </w:r>
+          </w:p>
+        </w:tc>
+        <w:tc>
+          <w:tcPr>
+            <w:tcW w:w="3212" w:type="dxa"/>
+            <w:tcMar>
+              <w:top w:w="90" w:type="dxa"/>
+              <w:left w:w="90" w:type="dxa"/>
+              <w:bottom w:w="90" w:type="dxa"/>
+              <w:right w:w="90" w:type="dxa"/>
+            </w:tcMar>
+          </w:tcPr>
+          <w:p>
+            <w:pPr>
+              <w:keepNext/>
+              <w:spacing w:after="40" w:line="220" w:lineRule="exact"/>
+            </w:pPr>
+            <w:r>
+              <w:rPr>
+                <w:b/>
+                <w:color w:val="000000"/>
+                <w:sz w:val="18"/>
+              </w:rPr>
+              <w:t>6 · Postventa</w:t>
+            </w:r>
+          </w:p>
+          <w:p>
+            <w:pPr>
+              <w:keepNext/>
+              <w:spacing w:after="40" w:line="220" w:lineRule="exact"/>
+            </w:pPr>
+            <w:r>
+              <w:rPr>
+                <w:color w:val="000000"/>
+                <w:sz w:val="17"/>
+              </w:rPr>
+              <w:t>IA: alerta reposición y pausa ofertas.</w:t>
+            </w:r>
+          </w:p>
+          <w:p>
+            <w:pPr>
+              <w:keepNext/>
+              <w:spacing w:after="40" w:line="220" w:lineRule="exact"/>
+            </w:pPr>
+            <w:r>
+              <w:rPr>
+                <w:color w:val="000000"/>
+                <w:sz w:val="17"/>
+              </w:rPr>
+              <w:t>Persona: resuelve y autoriza.</w:t>
+            </w:r>
+          </w:p>
+        </w:tc>
+      </w:tr>
+    </w:tbl>
     <w:p>
       <w:pPr>
         <w:keepNext/>
@@ -10107,10 +10332,10 @@
       </w:pPr>
       <w:r>
         <w:rPr>
-          <w:color w:val="3F3F40"/>
+          <w:color w:val="000000"/>
           <w:sz w:val="16"/>
         </w:rPr>
-        <w:t>Nota de lectura: la arquitectura sostiene el dato y los agentes dan fluidez entre áreas; el bloque rojo marca el cuello de botella actual (82 %* de reposición manual) que el Agente de Logística automatiza bajo supervisión humana.</w:t>
+        <w:t>Nota de lectura: esquema del piloto. La IA prepara acciones; la persona valida. El 82 %* es la reposición manual actual, no una reducción demostrada.</w:t>
       </w:r>
     </w:p>
     <w:p>
@@ -10650,30 +10875,12 @@
     </w:p>
     <w:p>
       <w:r>
-        <w:t xml:space="preserve">Sobre esta base arquitectónica, la capa agéntica opera bajo autonomía supervisada (R07 y Espejo Paralelo): </w:t>
-      </w:r>
-      <w:r>
-        <w:rPr>
-          <w:b/>
-        </w:rPr>
-        <w:t>los seis agentes (Marketing, Calificación, Ventas, Logística, Postventa y Orquestador) dan fluidez al flujo eliminando el trabajo manual repetitivo, pero jamás ejecutan acciones financieras o contractuales irreversibles por cuenta propia.</w:t>
-      </w:r>
-      <w:r>
-        <w:t xml:space="preserve"> Así, Marketing y Calificación trazan el origen, calculan el puntaje dual y asignan zona sin digitar fichas, pero la ejecutiva acepta el SQL; Ventas arma la propuesta en 60 s con stock real, pero la persona cierra el precio; Logística reserva SKU y sugiere ruta, pero Operaciones valida fechas; el Orquestador pre-arma el alta con RUT, pero Finanzas aprueba el crédito; y Postventa predice la recompra, pero el cliente y el equipo confirman antes de facturar (Anexo E, hojas 20 y 23).</w:t>
-      </w:r>
-    </w:p>
-    <w:p>
-      <w:r>
-        <w:t xml:space="preserve">En la operación diaria, esta sinergia entre automatización agéntica y alcance humano articula toda la cadena de suministro (Tabla 10): la comuna declarada conecta al instante la prioridad comercial, la ejecutiva territorial y el calendario de ruta (por ejemplo, Ruta Oriente los martes y jueves en demostración). </w:t>
-      </w:r>
-      <w:r>
-        <w:rPr>
-          <w:b/>
-        </w:rPr>
-        <w:t>En postventa, Mi cuenta (C09), el chat y WhatsApp entrante convergen en un solo hilo trazable donde el cliente repite su pedido en un toque sin depender de mensajes manuales.</w:t>
-      </w:r>
-      <w:r>
-        <w:t xml:space="preserve"> Si reporta una falla en su cafetera, el sistema abre el ticket (DEMO-INC), activa el workflow W9 para pausar al instante todo recordatorio de recompra o venta cruzada y deriva el caso al técnico humano; las campañas solo se reactivan cuando el cliente confirma en el chat que su máquina volvió a operar.</w:t>
+        <w:t>Los seis agentes —Marketing, Calificación, Ventas, Logística, Postventa y Orquestador— preparan datos, cálculos y tareas. El prototipo demuestra eventos locales; stock, reservas y facturación reales requieren integración. Ventas acepta el SQL y el precio; Operaciones confirma disponibilidad y fechas; Finanzas aprueba crédito; el cliente confirma su pedido (Anexo E, hojas 20 y 23).</w:t>
+      </w:r>
+    </w:p>
+    <w:p>
+      <w:r>
+        <w:t>La comuna conecta ficha, ejecutiva y ruta demostrada. En Mi cuenta, el cliente repone insumos y abre soporte. Una falla activa W9: pausa ofertas y recordatorios y deriva a una persona; se reactivan tras confirmar la solución. WhatsApp solo atiende postventa iniciada por el cliente. El historial alimenta recompra, inventario y trazabilidad (Tabla 10).</w:t>
       </w:r>
     </w:p>
     <w:p>
@@ -10687,6 +10894,7 @@
           <w:b/>
           <w:sz w:val="19"/>
         </w:rPr>
+        <w:lastRenderedPageBreak/>
         <w:t>Tabla 10. Cadena de valor operativa y agentes de IA: automatización, alcance humano y beneficio por área</w:t>
       </w:r>
     </w:p>
@@ -10910,6 +11118,12 @@
                 <w:sz w:val="15"/>
               </w:rPr>
               <w:t>1. Captación y Datos</w:t>
+            </w:r>
+            <w:r>
+              <w:rPr>
+                <w:b/>
+                <w:sz w:val="15"/>
+              </w:rPr>
               <w:br/>
             </w:r>
             <w:r>
@@ -11003,7 +11217,7 @@
               <w:rPr>
                 <w:sz w:val="15"/>
               </w:rPr>
-              <w:t>Cero digitación manual de fichas, 0 fuga de leads y trazabilidad total.</w:t>
+              <w:t>Reducir digitación y pérdidas de seguimiento; medir integridad del dato en el piloto.</w:t>
             </w:r>
           </w:p>
         </w:tc>
@@ -11039,6 +11253,12 @@
                 <w:sz w:val="15"/>
               </w:rPr>
               <w:t>2. Almacenamiento</w:t>
+            </w:r>
+            <w:r>
+              <w:rPr>
+                <w:b/>
+                <w:sz w:val="15"/>
+              </w:rPr>
               <w:br/>
             </w:r>
             <w:r>
@@ -11167,6 +11387,12 @@
                 <w:sz w:val="15"/>
               </w:rPr>
               <w:t>3. Fulfilment</w:t>
+            </w:r>
+            <w:r>
+              <w:rPr>
+                <w:b/>
+                <w:sz w:val="15"/>
+              </w:rPr>
               <w:br/>
             </w:r>
             <w:r>
@@ -11201,7 +11427,7 @@
               <w:rPr>
                 <w:sz w:val="15"/>
               </w:rPr>
-              <w:t>Al aceptar propuesta o reponer en 1 clic (LM5), reserva SKU y crea pedido en CRM.</w:t>
+              <w:t>Tras validación comercial y aceptación del pedido, prepara reserva de SKU y registro en CRM.</w:t>
             </w:r>
           </w:p>
         </w:tc>
@@ -11257,7 +11483,7 @@
               <w:rPr>
                 <w:sz w:val="15"/>
               </w:rPr>
-              <w:t>Elimina de raíz el 82 %* de pedido manual y libera horas para vender.</w:t>
+              <w:t>Reducir reposiciones manuales desde la base de 82 %*; medir horas liberadas.</w:t>
             </w:r>
           </w:p>
         </w:tc>
@@ -11293,6 +11519,12 @@
                 <w:sz w:val="15"/>
               </w:rPr>
               <w:t>4. Distribución</w:t>
+            </w:r>
+            <w:r>
+              <w:rPr>
+                <w:b/>
+                <w:sz w:val="15"/>
+              </w:rPr>
               <w:br/>
             </w:r>
             <w:r>
@@ -11422,6 +11654,12 @@
                 <w:sz w:val="15"/>
               </w:rPr>
               <w:t>5. Cobro y Factura</w:t>
+            </w:r>
+            <w:r>
+              <w:rPr>
+                <w:b/>
+                <w:sz w:val="15"/>
+              </w:rPr>
               <w:br/>
             </w:r>
             <w:r>
@@ -11457,7 +11695,7 @@
               <w:rPr>
                 <w:sz w:val="15"/>
               </w:rPr>
-              <w:t>Pre-arma alta B2B con RUT, giro y OC; emite factura al despachar y concilia.</w:t>
+              <w:t>Prepara alta con RUT, giro y OC, y datos para facturación y conciliación autorizadas.</w:t>
             </w:r>
           </w:p>
         </w:tc>
@@ -11515,7 +11753,7 @@
               <w:rPr>
                 <w:sz w:val="15"/>
               </w:rPr>
-              <w:t>Formalización B2B ágil sin errores manuales ni riesgo crediticio.</w:t>
+              <w:t>Reducir errores de alta y sostener el control de crédito de Finanzas.</w:t>
             </w:r>
           </w:p>
         </w:tc>
@@ -11551,6 +11789,12 @@
                 <w:sz w:val="15"/>
               </w:rPr>
               <w:t>6. Postventa</w:t>
+            </w:r>
+            <w:r>
+              <w:rPr>
+                <w:b/>
+                <w:sz w:val="15"/>
+              </w:rPr>
               <w:br/>
             </w:r>
             <w:r>
@@ -11644,7 +11888,7 @@
               <w:rPr>
                 <w:sz w:val="15"/>
               </w:rPr>
-              <w:t>Eleva recompra digital (18→40 %*) y retención anual del 86 % al 90 %*.</w:t>
+              <w:t>Metas: recompra digital 18→40 %* y retención anual 86→90 %*.</w:t>
             </w:r>
           </w:p>
         </w:tc>
@@ -11678,7 +11922,7 @@
         <w:ind w:left="140" w:right="140"/>
       </w:pPr>
       <w:r>
-        <w:t>La decisión operativa es unir una arquitectura conectada con seis agentes de IA que eliminan el 82 %* de trabajo manual en reposiciones, cotizaciones y stock, dejando siempre al alcance humano el control comercial, logístico y financiero.</w:t>
+        <w:t>La decisión es conectar las áreas y reducir tareas repetitivas con supervisión humana. El 82 %* es la reposición manual de partida; el piloto medirá la reducción efectiva.</w:t>
       </w:r>
     </w:p>
     <w:p>
@@ -11693,40 +11937,51 @@
     </w:p>
     <w:p>
       <w:r>
-        <w:t xml:space="preserve">El reto de Marley Coffee en el canal HORECA no radicaba en crear demanda, sino en evitar perderla en un recorrido manual que desgastaba al cliente y a la empresa. </w:t>
-      </w:r>
-      <w:r>
-        <w:rPr>
-          <w:b/>
-          <w:bCs/>
-        </w:rPr>
-        <w:t>Marley Coffee Empresas demuestra que el inbound marketing, el e-commerce B2B, el diseño UX y la cadena de suministro se potencian al operar conectados.</w:t>
-      </w:r>
-      <w:r>
-        <w:t xml:space="preserve"> Con registro breve, diagnóstico en 60 segundos, propuesta transparente en arriendo o compra directa, correo comercial, WhatsApp de postventa entrante y espejo en vivo hacia el CRM, el cliente gana claridad inmediata y las ejecutivas recuperan tiempo para vender. Validar los umbrales en la segunda ronda y desplegar el piloto de 90 días* sobre las plataformas actuales de Marley asegura un crecimiento comercial rentable, escalable y sostenible.</w:t>
-      </w:r>
+        <w:t>El reto de Marley Coffee es evitar que la demanda profesional se pierda en un recorrido manual. El MVP muestra cómo vincular inbound marketing, e-commerce B2B, diseño UX y cadena de suministro: registro breve, diagnóstico por capas, propuesta en comodato y abastecimiento, seguimiento por correo y postventa entrante por WhatsApp. El CRM conserva el contexto y ofrece ayuda interna por rol. Las pruebas detectaron fricciones y guiaron el rediseño; aún falta validar sus resultados. La segunda ronda y el piloto de 90 días* permitirán comprobar conversión, recompra, carga operativa e integración antes de escalar.</w:t>
+      </w:r>
+    </w:p>
+    <w:p>
+      <w:pPr>
+        <w:pageBreakBefore/>
+        <w:widowControl w:val="0"/>
+        <w:pBdr>
+          <w:top w:val="nil"/>
+          <w:left w:val="nil"/>
+          <w:bottom w:val="nil"/>
+          <w:right w:val="nil"/>
+        </w:pBdr>
+        <w:spacing w:after="0" w:line="1920" w:lineRule="exact"/>
+      </w:pPr>
     </w:p>
     <w:p>
       <w:pPr>
         <w:pStyle w:val="Ttulo1"/>
-        <w:pageBreakBefore/>
+        <w:pBdr>
+          <w:top w:val="nil"/>
+          <w:left w:val="nil"/>
+          <w:bottom w:val="nil"/>
+          <w:right w:val="nil"/>
+        </w:pBdr>
+        <w:spacing w:after="480" w:line="800" w:lineRule="exact"/>
       </w:pPr>
       <w:bookmarkStart w:id="10" w:name="_Toc243252371"/>
       <w:r>
-        <w:lastRenderedPageBreak/>
+        <w:rPr>
+          <w:color w:val="000000"/>
+          <w:sz w:val="60"/>
+          <w:szCs w:val="60"/>
+        </w:rPr>
         <w:t>Anexos del informe</w:t>
       </w:r>
       <w:bookmarkEnd w:id="10"/>
     </w:p>
     <w:p>
       <w:pPr>
-        <w:spacing w:before="60" w:after="140" w:line="264" w:lineRule="auto"/>
+        <w:spacing w:after="300" w:line="264" w:lineRule="auto"/>
       </w:pPr>
       <w:r>
         <w:rPr>
-          <w:color w:val="3F3F40"/>
-          <w:sz w:val="16"/>
-          <w:szCs w:val="16"/>
+          <w:color w:val="000000"/>
         </w:rPr>
         <w:t>Los Anexos A a F se entregan como archivos junto a este documento; G a J están a continuación. Cada uno se cita desde el cuerpo por su letra.</w:t>
       </w:r>
@@ -11876,6 +12131,136 @@
         <w:t>Esquemas de los recorridos y estados actualizados, junto con capturas conservadas del formulario y del panel de jefatura (15-10-2026). Los esquemas se identifican como tales; las pantallas completas están en los Anexos A a C. Personas, empresas y montos del CRM son ficticios; los precios son supuestos académicos rotulados en pantalla.</w:t>
       </w:r>
     </w:p>
+    <w:tbl>
+      <w:tblPr>
+        <w:tblW w:w="9638" w:type="dxa"/>
+        <w:tblBorders>
+          <w:top w:val="single" w:sz="4" w:space="0" w:color="D9D9D9"/>
+          <w:left w:val="single" w:sz="4" w:space="0" w:color="D9D9D9"/>
+          <w:bottom w:val="single" w:sz="4" w:space="0" w:color="D9D9D9"/>
+          <w:right w:val="single" w:sz="4" w:space="0" w:color="D9D9D9"/>
+          <w:insideH w:val="single" w:sz="4" w:space="0" w:color="D9D9D9"/>
+          <w:insideV w:val="single" w:sz="4" w:space="0" w:color="D9D9D9"/>
+        </w:tblBorders>
+        <w:tblLayout w:type="fixed"/>
+        <w:tblLook w:val="04A0" w:firstRow="1" w:lastRow="0" w:firstColumn="1" w:lastColumn="0" w:noHBand="0" w:noVBand="1"/>
+      </w:tblPr>
+      <w:tblGrid>
+        <w:gridCol w:w="6500"/>
+        <w:gridCol w:w="3138"/>
+      </w:tblGrid>
+      <w:tr>
+        <w:tc>
+          <w:tcPr>
+            <w:tcW w:w="6500" w:type="dxa"/>
+          </w:tcPr>
+          <w:p>
+            <w:r>
+              <w:t>C01 · Tienda principal</w:t>
+            </w:r>
+          </w:p>
+        </w:tc>
+        <w:tc>
+          <w:tcPr>
+            <w:tcW w:w="3138" w:type="dxa"/>
+          </w:tcPr>
+          <w:p>
+            <w:r>
+              <w:t>C02 · Empresas</w:t>
+            </w:r>
+          </w:p>
+        </w:tc>
+      </w:tr>
+      <w:tr>
+        <w:tc>
+          <w:tcPr>
+            <w:tcW w:w="6500" w:type="dxa"/>
+          </w:tcPr>
+          <w:p>
+            <w:r>
+              <w:t>B2C conserva su diseño; acceso Empresas.</w:t>
+            </w:r>
+          </w:p>
+        </w:tc>
+        <w:tc>
+          <w:tcPr>
+            <w:tcW w:w="3138" w:type="dxa"/>
+          </w:tcPr>
+          <w:p>
+            <w:r>
+              <w:t>Máquina en comodato; productos y abastecimiento.</w:t>
+            </w:r>
+          </w:p>
+        </w:tc>
+      </w:tr>
+      <w:tr>
+        <w:tc>
+          <w:tcPr>
+            <w:tcW w:w="6500" w:type="dxa"/>
+          </w:tcPr>
+          <w:p>
+            <w:r>
+              <w:t>Entrada clara en escritorio y celular.</w:t>
+            </w:r>
+          </w:p>
+        </w:tc>
+        <w:tc>
+          <w:tcPr>
+            <w:tcW w:w="3138" w:type="dxa"/>
+          </w:tcPr>
+          <w:p>
+            <w:r>
+              <w:t>Carga inicial y condiciones antes del formulario.</w:t>
+            </w:r>
+          </w:p>
+        </w:tc>
+      </w:tr>
+    </w:tbl>
+    <w:p>
+      <w:pPr>
+        <w:keepNext/>
+        <w:keepLines/>
+        <w:spacing w:before="80" w:after="30" w:line="250" w:lineRule="auto"/>
+      </w:pPr>
+      <w:r>
+        <w:rPr>
+          <w:b/>
+          <w:bCs/>
+          <w:sz w:val="19"/>
+          <w:szCs w:val="19"/>
+        </w:rPr>
+        <w:t>Figura G1 · La tienda en el celular y la portada Empresas</w:t>
+      </w:r>
+    </w:p>
+    <w:p>
+      <w:pPr>
+        <w:keepNext/>
+        <w:keepLines/>
+        <w:spacing w:after="30" w:line="240" w:lineRule="auto"/>
+      </w:pPr>
+      <w:r>
+        <w:rPr>
+          <w:color w:val="3F3F40"/>
+          <w:sz w:val="16"/>
+          <w:szCs w:val="16"/>
+        </w:rPr>
+        <w:t>Período: prototipo, 15-10-2026 · Unidad: esquema funcional actualizado, no captura · Fuente: elaboración propia (Anexos A a C)</w:t>
+      </w:r>
+    </w:p>
+    <w:p>
+      <w:pPr>
+        <w:keepLines/>
+        <w:spacing w:after="260" w:line="240" w:lineRule="auto"/>
+      </w:pPr>
+      <w:r>
+        <w:rPr>
+          <w:color w:val="3F3F40"/>
+          <w:sz w:val="16"/>
+          <w:szCs w:val="16"/>
+        </w:rPr>
+        <w:t>Nota de lectura: la tienda conserva su función B2C; desde Empresas se ofrecen comodato y abastecimiento mensual.</w:t>
+      </w:r>
+    </w:p>
     <w:p>
       <w:pPr>
         <w:keepNext/>
@@ -11887,10 +12272,508 @@
           <w:noProof/>
         </w:rPr>
         <w:drawing>
-          <wp:inline distT="0" distB="0" distL="0" distR="0" wp14:anchorId="0E495904" wp14:editId="2EE8B33D">
-            <wp:extent cx="6115050" cy="2124075"/>
+          <wp:inline distT="0" distB="0" distL="0" distR="0" wp14:anchorId="6269138F" wp14:editId="742032C2">
+            <wp:extent cx="6115050" cy="2219325"/>
             <wp:effectExtent l="0" t="0" r="0" b="0"/>
-            <wp:docPr id="6" name="fig5" descr="Figura G1 · La tienda en el celular y la portada Empresas" title="Figura G1 · La tienda en el celular y la portada Empresas"/>
+            <wp:docPr id="7" name="fig6" descr="Figura G2 · Tus datos al principio y el diagnóstico" title="Figura G2 · Tus datos al principio y el diagnóstico"/>
+            <wp:cNvGraphicFramePr>
+              <a:graphicFrameLocks xmlns:a="http://schemas.openxmlformats.org/drawingml/2006/main" noChangeAspect="1"/>
+            </wp:cNvGraphicFramePr>
+            <a:graphic xmlns:a="http://schemas.openxmlformats.org/drawingml/2006/main">
+              <a:graphicData uri="http://schemas.openxmlformats.org/drawingml/2006/picture">
+                <pic:pic xmlns:pic="http://schemas.openxmlformats.org/drawingml/2006/picture">
+                  <pic:nvPicPr>
+                    <pic:cNvPr id="0" name=""/>
+                    <pic:cNvPicPr>
+                      <a:picLocks noChangeAspect="1" noChangeArrowheads="1"/>
+                    </pic:cNvPicPr>
+                  </pic:nvPicPr>
+                  <pic:blipFill>
+                    <a:blip r:embed="rId11"/>
+                    <a:srcRect/>
+                    <a:stretch>
+                      <a:fillRect/>
+                    </a:stretch>
+                  </pic:blipFill>
+                  <pic:spPr bwMode="auto">
+                    <a:xfrm>
+                      <a:off x="0" y="0"/>
+                      <a:ext cx="6115050" cy="2219325"/>
+                    </a:xfrm>
+                    <a:prstGeom prst="rect">
+                      <a:avLst/>
+                    </a:prstGeom>
+                  </pic:spPr>
+                </pic:pic>
+              </a:graphicData>
+            </a:graphic>
+          </wp:inline>
+        </w:drawing>
+      </w:r>
+    </w:p>
+    <w:p>
+      <w:pPr>
+        <w:keepNext/>
+        <w:keepLines/>
+        <w:spacing w:before="80" w:after="30" w:line="250" w:lineRule="auto"/>
+      </w:pPr>
+      <w:r>
+        <w:rPr>
+          <w:b/>
+          <w:bCs/>
+          <w:sz w:val="19"/>
+          <w:szCs w:val="19"/>
+        </w:rPr>
+        <w:t>Figura G2 · Tus datos al principio y el diagnóstico</w:t>
+      </w:r>
+    </w:p>
+    <w:p>
+      <w:pPr>
+        <w:keepNext/>
+        <w:keepLines/>
+        <w:spacing w:after="30" w:line="240" w:lineRule="auto"/>
+      </w:pPr>
+      <w:r>
+        <w:rPr>
+          <w:color w:val="3F3F40"/>
+          <w:sz w:val="16"/>
+          <w:szCs w:val="16"/>
+        </w:rPr>
+        <w:t>Período: prototipo, 15-10-2026 · Unidad: pantallas a 1366 × 900 · Fuente: elaboración propia (Anexos A a C)</w:t>
+      </w:r>
+    </w:p>
+    <w:p>
+      <w:pPr>
+        <w:keepLines/>
+        <w:spacing w:after="260" w:line="240" w:lineRule="auto"/>
+      </w:pPr>
+      <w:r>
+        <w:rPr>
+          <w:color w:val="000000"/>
+          <w:sz w:val="16"/>
+          <w:szCs w:val="16"/>
+        </w:rPr>
+        <w:t>Nota de lectura: captura conservada del 15-10. La versión vigente añade Gmail/Hotmail/Otro; mantiene teléfono opcional con +56 9 y diagnóstico en tres pasos. Los ejemplos de correo se consultan desde el control de demostración.</w:t>
+      </w:r>
+    </w:p>
+    <w:p>
+      <w:pPr>
+        <w:keepNext/>
+        <w:pageBreakBefore/>
+        <w:spacing w:after="0" w:line="20" w:lineRule="exact"/>
+      </w:pPr>
+    </w:p>
+    <w:tbl>
+      <w:tblPr>
+        <w:tblW w:w="9638" w:type="dxa"/>
+        <w:tblBorders>
+          <w:top w:val="single" w:sz="6" w:space="0" w:color="D3D3D3"/>
+          <w:left w:val="single" w:sz="6" w:space="0" w:color="D3D3D3"/>
+          <w:bottom w:val="single" w:sz="6" w:space="0" w:color="D3D3D3"/>
+          <w:right w:val="single" w:sz="6" w:space="0" w:color="D3D3D3"/>
+          <w:insideH w:val="single" w:sz="6" w:space="0" w:color="D3D3D3"/>
+          <w:insideV w:val="single" w:sz="6" w:space="0" w:color="D3D3D3"/>
+        </w:tblBorders>
+        <w:tblLayout w:type="fixed"/>
+        <w:tblLook w:val="04A0" w:firstRow="1" w:lastRow="0" w:firstColumn="1" w:lastColumn="0" w:noHBand="0" w:noVBand="1"/>
+      </w:tblPr>
+      <w:tblGrid>
+        <w:gridCol w:w="4819"/>
+        <w:gridCol w:w="4819"/>
+      </w:tblGrid>
+      <w:tr>
+        <w:trPr>
+          <w:cantSplit/>
+        </w:trPr>
+        <w:tc>
+          <w:tcPr>
+            <w:tcW w:w="4819" w:type="dxa"/>
+            <w:tcMar>
+              <w:top w:w="90" w:type="dxa"/>
+              <w:left w:w="90" w:type="dxa"/>
+              <w:bottom w:w="90" w:type="dxa"/>
+              <w:right w:w="90" w:type="dxa"/>
+            </w:tcMar>
+          </w:tcPr>
+          <w:p>
+            <w:pPr>
+              <w:keepNext/>
+              <w:spacing w:after="40" w:line="220" w:lineRule="exact"/>
+            </w:pPr>
+            <w:r>
+              <w:rPr>
+                <w:b/>
+                <w:color w:val="000000"/>
+                <w:sz w:val="18"/>
+              </w:rPr>
+              <w:t>C05 · Propuesta para decidir</w:t>
+            </w:r>
+          </w:p>
+          <w:p>
+            <w:pPr>
+              <w:keepNext/>
+              <w:spacing w:after="40" w:line="220" w:lineRule="exact"/>
+            </w:pPr>
+            <w:r>
+              <w:rPr>
+                <w:color w:val="000000"/>
+                <w:sz w:val="17"/>
+              </w:rPr>
+              <w:t>Máquina en comodato; compra mensual de insumos.</w:t>
+            </w:r>
+          </w:p>
+          <w:p>
+            <w:pPr>
+              <w:keepNext/>
+              <w:spacing w:after="40" w:line="220" w:lineRule="exact"/>
+            </w:pPr>
+            <w:r>
+              <w:rPr>
+                <w:color w:val="000000"/>
+                <w:sz w:val="17"/>
+              </w:rPr>
+              <w:t>Carga inicial separada de la reposición por cotizar.</w:t>
+            </w:r>
+          </w:p>
+          <w:p>
+            <w:pPr>
+              <w:keepNext/>
+              <w:spacing w:after="40" w:line="220" w:lineRule="exact"/>
+            </w:pPr>
+            <w:r>
+              <w:rPr>
+                <w:color w:val="000000"/>
+                <w:sz w:val="17"/>
+              </w:rPr>
+              <w:t>Cliente: confirma su elección para revisión.</w:t>
+            </w:r>
+          </w:p>
+        </w:tc>
+        <w:tc>
+          <w:tcPr>
+            <w:tcW w:w="4819" w:type="dxa"/>
+            <w:tcMar>
+              <w:top w:w="90" w:type="dxa"/>
+              <w:left w:w="90" w:type="dxa"/>
+              <w:bottom w:w="90" w:type="dxa"/>
+              <w:right w:w="90" w:type="dxa"/>
+            </w:tcMar>
+          </w:tcPr>
+          <w:p>
+            <w:pPr>
+              <w:keepNext/>
+              <w:spacing w:after="40" w:line="220" w:lineRule="exact"/>
+            </w:pPr>
+            <w:r>
+              <w:rPr>
+                <w:b/>
+                <w:color w:val="000000"/>
+                <w:sz w:val="18"/>
+              </w:rPr>
+              <w:t>C06 · Propuesta registrada</w:t>
+            </w:r>
+          </w:p>
+          <w:p>
+            <w:pPr>
+              <w:keepNext/>
+              <w:spacing w:after="40" w:line="220" w:lineRule="exact"/>
+            </w:pPr>
+            <w:r>
+              <w:rPr>
+                <w:color w:val="000000"/>
+                <w:sz w:val="17"/>
+              </w:rPr>
+              <w:t>Folio, resumen y ejecutiva asignada.</w:t>
+            </w:r>
+          </w:p>
+          <w:p>
+            <w:pPr>
+              <w:keepNext/>
+              <w:spacing w:after="40" w:line="220" w:lineRule="exact"/>
+            </w:pPr>
+            <w:r>
+              <w:rPr>
+                <w:color w:val="000000"/>
+                <w:sz w:val="17"/>
+              </w:rPr>
+              <w:t>Contacto comercial por correo.</w:t>
+            </w:r>
+          </w:p>
+          <w:p>
+            <w:pPr>
+              <w:keepNext/>
+              <w:spacing w:after="40" w:line="220" w:lineRule="exact"/>
+            </w:pPr>
+            <w:r>
+              <w:rPr>
+                <w:color w:val="000000"/>
+                <w:sz w:val="17"/>
+              </w:rPr>
+              <w:t>Sin contrato, cobro ni reserva automática.</w:t>
+            </w:r>
+          </w:p>
+        </w:tc>
+      </w:tr>
+    </w:tbl>
+    <w:p>
+      <w:pPr>
+        <w:keepNext/>
+        <w:keepLines/>
+        <w:spacing w:before="80" w:after="30" w:line="250" w:lineRule="auto"/>
+      </w:pPr>
+      <w:r>
+        <w:rPr>
+          <w:b/>
+          <w:bCs/>
+          <w:sz w:val="19"/>
+          <w:szCs w:val="19"/>
+        </w:rPr>
+        <w:t>Figura G3 · Propuesta al instante y «¡Listo!»</w:t>
+      </w:r>
+    </w:p>
+    <w:p>
+      <w:pPr>
+        <w:keepNext/>
+        <w:keepLines/>
+        <w:spacing w:after="30" w:line="240" w:lineRule="auto"/>
+      </w:pPr>
+      <w:r>
+        <w:rPr>
+          <w:color w:val="3F3F40"/>
+          <w:sz w:val="16"/>
+          <w:szCs w:val="16"/>
+        </w:rPr>
+        <w:t>Período: prototipo, 15-10-2026 · Unidad: esquema funcional actualizado, no captura · Fuente: elaboración propia (Anexos A a C)</w:t>
+      </w:r>
+    </w:p>
+    <w:p>
+      <w:pPr>
+        <w:keepLines/>
+        <w:spacing w:after="260" w:line="240" w:lineRule="auto"/>
+      </w:pPr>
+      <w:r>
+        <w:rPr>
+          <w:color w:val="3F3F40"/>
+          <w:sz w:val="16"/>
+          <w:szCs w:val="16"/>
+        </w:rPr>
+        <w:t>Nota de lectura: la máquina se presta; la carga base se paga antes de instalar y no es mensualidad. El equipo confirma el abastecimiento posterior.</w:t>
+      </w:r>
+    </w:p>
+    <w:tbl>
+      <w:tblPr>
+        <w:tblW w:w="9638" w:type="dxa"/>
+        <w:tblBorders>
+          <w:top w:val="single" w:sz="6" w:space="0" w:color="D3D3D3"/>
+          <w:left w:val="single" w:sz="6" w:space="0" w:color="D3D3D3"/>
+          <w:bottom w:val="single" w:sz="6" w:space="0" w:color="D3D3D3"/>
+          <w:right w:val="single" w:sz="6" w:space="0" w:color="D3D3D3"/>
+          <w:insideH w:val="single" w:sz="6" w:space="0" w:color="D3D3D3"/>
+          <w:insideV w:val="single" w:sz="6" w:space="0" w:color="D3D3D3"/>
+        </w:tblBorders>
+        <w:tblLayout w:type="fixed"/>
+        <w:tblLook w:val="04A0" w:firstRow="1" w:lastRow="0" w:firstColumn="1" w:lastColumn="0" w:noHBand="0" w:noVBand="1"/>
+      </w:tblPr>
+      <w:tblGrid>
+        <w:gridCol w:w="4819"/>
+        <w:gridCol w:w="4819"/>
+      </w:tblGrid>
+      <w:tr>
+        <w:trPr>
+          <w:cantSplit/>
+        </w:trPr>
+        <w:tc>
+          <w:tcPr>
+            <w:tcW w:w="4819" w:type="dxa"/>
+            <w:tcMar>
+              <w:top w:w="90" w:type="dxa"/>
+              <w:left w:w="90" w:type="dxa"/>
+              <w:bottom w:w="90" w:type="dxa"/>
+              <w:right w:w="90" w:type="dxa"/>
+            </w:tcMar>
+          </w:tcPr>
+          <w:p>
+            <w:pPr>
+              <w:keepNext/>
+              <w:spacing w:after="40" w:line="220" w:lineRule="exact"/>
+            </w:pPr>
+            <w:r>
+              <w:rPr>
+                <w:b/>
+                <w:color w:val="000000"/>
+                <w:sz w:val="18"/>
+              </w:rPr>
+              <w:t>CRM · Conversación comercial</w:t>
+            </w:r>
+          </w:p>
+          <w:p>
+            <w:pPr>
+              <w:keepNext/>
+              <w:spacing w:after="40" w:line="220" w:lineRule="exact"/>
+            </w:pPr>
+            <w:r>
+              <w:rPr>
+                <w:color w:val="000000"/>
+                <w:sz w:val="17"/>
+              </w:rPr>
+              <w:t>Chat: cliente simulado y ejecutiva.</w:t>
+            </w:r>
+          </w:p>
+          <w:p>
+            <w:pPr>
+              <w:keepNext/>
+              <w:spacing w:after="40" w:line="220" w:lineRule="exact"/>
+            </w:pPr>
+            <w:r>
+              <w:rPr>
+                <w:color w:val="000000"/>
+                <w:sz w:val="17"/>
+              </w:rPr>
+              <w:t>Panel interno IA: contexto y borrador.</w:t>
+            </w:r>
+          </w:p>
+          <w:p>
+            <w:pPr>
+              <w:keepNext/>
+              <w:spacing w:after="40" w:line="220" w:lineRule="exact"/>
+            </w:pPr>
+            <w:r>
+              <w:rPr>
+                <w:color w:val="000000"/>
+                <w:sz w:val="17"/>
+              </w:rPr>
+              <w:t>Ejecutiva revisa, toma el caso y responde.</w:t>
+            </w:r>
+          </w:p>
+        </w:tc>
+        <w:tc>
+          <w:tcPr>
+            <w:tcW w:w="4819" w:type="dxa"/>
+            <w:tcMar>
+              <w:top w:w="90" w:type="dxa"/>
+              <w:left w:w="90" w:type="dxa"/>
+              <w:bottom w:w="90" w:type="dxa"/>
+              <w:right w:w="90" w:type="dxa"/>
+            </w:tcMar>
+          </w:tcPr>
+          <w:p>
+            <w:pPr>
+              <w:keepNext/>
+              <w:spacing w:after="40" w:line="220" w:lineRule="exact"/>
+            </w:pPr>
+            <w:r>
+              <w:rPr>
+                <w:b/>
+                <w:color w:val="000000"/>
+                <w:sz w:val="18"/>
+              </w:rPr>
+              <w:t>Postventa · Resolver antes de vender</w:t>
+            </w:r>
+          </w:p>
+          <w:p>
+            <w:pPr>
+              <w:keepNext/>
+              <w:spacing w:after="40" w:line="220" w:lineRule="exact"/>
+            </w:pPr>
+            <w:r>
+              <w:rPr>
+                <w:color w:val="000000"/>
+                <w:sz w:val="17"/>
+              </w:rPr>
+              <w:t>Cliente inicia soporte; WhatsApp opcional.</w:t>
+            </w:r>
+          </w:p>
+          <w:p>
+            <w:pPr>
+              <w:keepNext/>
+              <w:spacing w:after="40" w:line="220" w:lineRule="exact"/>
+            </w:pPr>
+            <w:r>
+              <w:rPr>
+                <w:color w:val="000000"/>
+                <w:sz w:val="17"/>
+              </w:rPr>
+              <w:t>Incidencia DEMO: se pausan ofertas (W9).</w:t>
+            </w:r>
+          </w:p>
+          <w:p>
+            <w:pPr>
+              <w:keepNext/>
+              <w:spacing w:after="40" w:line="220" w:lineRule="exact"/>
+            </w:pPr>
+            <w:r>
+              <w:rPr>
+                <w:color w:val="000000"/>
+                <w:sz w:val="17"/>
+              </w:rPr>
+              <w:t>Persona resuelve; cliente confirma el cierre.</w:t>
+            </w:r>
+          </w:p>
+        </w:tc>
+      </w:tr>
+    </w:tbl>
+    <w:p>
+      <w:pPr>
+        <w:keepNext/>
+        <w:keepLines/>
+        <w:spacing w:before="80" w:after="30" w:line="250" w:lineRule="auto"/>
+      </w:pPr>
+      <w:r>
+        <w:rPr>
+          <w:b/>
+          <w:bCs/>
+          <w:sz w:val="19"/>
+          <w:szCs w:val="19"/>
+        </w:rPr>
+        <w:t>Figura G4 · CRM de ventas: chat, lo cotizado y la propuesta sugerida por el agente</w:t>
+      </w:r>
+    </w:p>
+    <w:p>
+      <w:pPr>
+        <w:keepNext/>
+        <w:keepLines/>
+        <w:spacing w:after="30" w:line="240" w:lineRule="auto"/>
+      </w:pPr>
+      <w:r>
+        <w:rPr>
+          <w:color w:val="3F3F40"/>
+          <w:sz w:val="16"/>
+          <w:szCs w:val="16"/>
+        </w:rPr>
+        <w:t>Período: prototipo, 15-10-2026 · Unidad: esquema funcional actualizado, no captura · Fuente: elaboración propia (Anexos A a C)</w:t>
+      </w:r>
+    </w:p>
+    <w:p>
+      <w:pPr>
+        <w:keepLines/>
+        <w:spacing w:after="260" w:line="240" w:lineRule="auto"/>
+      </w:pPr>
+      <w:r>
+        <w:rPr>
+          <w:color w:val="3F3F40"/>
+          <w:sz w:val="16"/>
+          <w:szCs w:val="16"/>
+        </w:rPr>
+        <w:t>Nota de lectura: el equipo toma el caso y pausa la IA; una incidencia suspende ofertas hasta que el cliente confirma la solución.</w:t>
+      </w:r>
+    </w:p>
+    <w:p>
+      <w:pPr>
+        <w:keepNext/>
+        <w:pageBreakBefore/>
+        <w:spacing w:before="120" w:after="60"/>
+        <w:jc w:val="center"/>
+      </w:pPr>
+      <w:r>
+        <w:rPr>
+          <w:noProof/>
+        </w:rPr>
+        <w:lastRenderedPageBreak/>
+        <w:drawing>
+          <wp:inline distT="0" distB="0" distL="0" distR="0" wp14:anchorId="12482634" wp14:editId="74EE57C1">
+            <wp:extent cx="6115050" cy="3381375"/>
+            <wp:effectExtent l="0" t="0" r="0" b="0"/>
+            <wp:docPr id="10" name="fig9" descr="Figura G5 · Panel de jefatura en el celular" title="Figura G5 · Panel de jefatura en el celular"/>
             <wp:cNvGraphicFramePr>
               <a:graphicFrameLocks xmlns:a="http://schemas.openxmlformats.org/drawingml/2006/main" noChangeAspect="1"/>
             </wp:cNvGraphicFramePr>
@@ -11913,388 +12796,6 @@
                   <pic:spPr bwMode="auto">
                     <a:xfrm>
                       <a:off x="0" y="0"/>
-                      <a:ext cx="6115050" cy="2124075"/>
-                    </a:xfrm>
-                    <a:prstGeom prst="rect">
-                      <a:avLst/>
-                    </a:prstGeom>
-                  </pic:spPr>
-                </pic:pic>
-              </a:graphicData>
-            </a:graphic>
-          </wp:inline>
-        </w:drawing>
-      </w:r>
-    </w:p>
-    <w:p>
-      <w:pPr>
-        <w:keepNext/>
-        <w:keepLines/>
-        <w:spacing w:before="80" w:after="30" w:line="250" w:lineRule="auto"/>
-      </w:pPr>
-      <w:r>
-        <w:rPr>
-          <w:b/>
-          <w:bCs/>
-          <w:sz w:val="19"/>
-          <w:szCs w:val="19"/>
-        </w:rPr>
-        <w:t>Figura G1 · La tienda en el celular y la portada Empresas</w:t>
-      </w:r>
-    </w:p>
-    <w:p>
-      <w:pPr>
-        <w:keepNext/>
-        <w:keepLines/>
-        <w:spacing w:after="30" w:line="240" w:lineRule="auto"/>
-      </w:pPr>
-      <w:r>
-        <w:rPr>
-          <w:color w:val="3F3F40"/>
-          <w:sz w:val="16"/>
-          <w:szCs w:val="16"/>
-        </w:rPr>
-        <w:t>Período: prototipo, 15-10-2026 · Unidad: esquema funcional actualizado, no captura · Fuente: elaboración propia (Anexos A a C)</w:t>
-      </w:r>
-    </w:p>
-    <w:p>
-      <w:pPr>
-        <w:keepLines/>
-        <w:spacing w:after="260" w:line="240" w:lineRule="auto"/>
-      </w:pPr>
-      <w:r>
-        <w:rPr>
-          <w:color w:val="3F3F40"/>
-          <w:sz w:val="16"/>
-          <w:szCs w:val="16"/>
-        </w:rPr>
-        <w:t>Nota de lectura: la tienda conserva su función B2C; desde Empresas se ofrecen arriendo y compra directa.</w:t>
-      </w:r>
-    </w:p>
-    <w:p>
-      <w:pPr>
-        <w:keepNext/>
-        <w:spacing w:before="120" w:after="60"/>
-        <w:jc w:val="center"/>
-      </w:pPr>
-      <w:r>
-        <w:rPr>
-          <w:noProof/>
-        </w:rPr>
-        <w:drawing>
-          <wp:inline distT="0" distB="0" distL="0" distR="0" wp14:anchorId="3030FB43" wp14:editId="6223F37C">
-            <wp:extent cx="6115050" cy="2219325"/>
-            <wp:effectExtent l="0" t="0" r="0" b="0"/>
-            <wp:docPr id="7" name="fig6" descr="Figura G2 · Tus datos al principio y el diagnóstico" title="Figura G2 · Tus datos al principio y el diagnóstico"/>
-            <wp:cNvGraphicFramePr>
-              <a:graphicFrameLocks xmlns:a="http://schemas.openxmlformats.org/drawingml/2006/main" noChangeAspect="1"/>
-            </wp:cNvGraphicFramePr>
-            <a:graphic xmlns:a="http://schemas.openxmlformats.org/drawingml/2006/main">
-              <a:graphicData uri="http://schemas.openxmlformats.org/drawingml/2006/picture">
-                <pic:pic xmlns:pic="http://schemas.openxmlformats.org/drawingml/2006/picture">
-                  <pic:nvPicPr>
-                    <pic:cNvPr id="0" name=""/>
-                    <pic:cNvPicPr>
-                      <a:picLocks noChangeAspect="1" noChangeArrowheads="1"/>
-                    </pic:cNvPicPr>
-                  </pic:nvPicPr>
-                  <pic:blipFill>
-                    <a:blip r:embed="rId13"/>
-                    <a:srcRect/>
-                    <a:stretch>
-                      <a:fillRect/>
-                    </a:stretch>
-                  </pic:blipFill>
-                  <pic:spPr bwMode="auto">
-                    <a:xfrm>
-                      <a:off x="0" y="0"/>
-                      <a:ext cx="6115050" cy="2219325"/>
-                    </a:xfrm>
-                    <a:prstGeom prst="rect">
-                      <a:avLst/>
-                    </a:prstGeom>
-                  </pic:spPr>
-                </pic:pic>
-              </a:graphicData>
-            </a:graphic>
-          </wp:inline>
-        </w:drawing>
-      </w:r>
-    </w:p>
-    <w:p>
-      <w:pPr>
-        <w:keepNext/>
-        <w:keepLines/>
-        <w:spacing w:before="80" w:after="30" w:line="250" w:lineRule="auto"/>
-      </w:pPr>
-      <w:r>
-        <w:rPr>
-          <w:b/>
-          <w:bCs/>
-          <w:sz w:val="19"/>
-          <w:szCs w:val="19"/>
-        </w:rPr>
-        <w:t>Figura G2 · Tus datos al principio y el diagnóstico</w:t>
-      </w:r>
-    </w:p>
-    <w:p>
-      <w:pPr>
-        <w:keepNext/>
-        <w:keepLines/>
-        <w:spacing w:after="30" w:line="240" w:lineRule="auto"/>
-      </w:pPr>
-      <w:r>
-        <w:rPr>
-          <w:color w:val="3F3F40"/>
-          <w:sz w:val="16"/>
-          <w:szCs w:val="16"/>
-        </w:rPr>
-        <w:t>Período: prototipo, 15-10-2026 · Unidad: pantallas a 1366 × 900 · Fuente: elaboración propia (Anexos A a C)</w:t>
-      </w:r>
-    </w:p>
-    <w:p>
-      <w:pPr>
-        <w:keepLines/>
-        <w:spacing w:after="260" w:line="240" w:lineRule="auto"/>
-      </w:pPr>
-      <w:r>
-        <w:rPr>
-          <w:color w:val="3F3F40"/>
-          <w:sz w:val="16"/>
-          <w:szCs w:val="16"/>
-        </w:rPr>
-        <w:t>Nota de lectura: apenas se toca «Cotizar», tres datos con +56 9 ya escrito y permiso: guardan el avance y permiten recuperar a quien abandona; el paso 2 trae lo típico del negocio marcado y habla de «una ejecutiva de tu zona».</w:t>
-      </w:r>
-    </w:p>
-    <w:p>
-      <w:pPr>
-        <w:keepNext/>
-        <w:spacing w:before="120" w:after="60"/>
-        <w:jc w:val="center"/>
-      </w:pPr>
-      <w:r>
-        <w:rPr>
-          <w:noProof/>
-        </w:rPr>
-        <w:lastRenderedPageBreak/>
-        <w:drawing>
-          <wp:inline distT="0" distB="0" distL="0" distR="0" wp14:anchorId="1840B417" wp14:editId="05499A3F">
-            <wp:extent cx="6115050" cy="2124075"/>
-            <wp:effectExtent l="0" t="0" r="0" b="0"/>
-            <wp:docPr id="8" name="fig7" descr="Figura G3 · Propuesta al instante y «¡Listo!»" title="Figura G3 · Propuesta al instante y «¡Listo!»"/>
-            <wp:cNvGraphicFramePr>
-              <a:graphicFrameLocks xmlns:a="http://schemas.openxmlformats.org/drawingml/2006/main" noChangeAspect="1"/>
-            </wp:cNvGraphicFramePr>
-            <a:graphic xmlns:a="http://schemas.openxmlformats.org/drawingml/2006/main">
-              <a:graphicData uri="http://schemas.openxmlformats.org/drawingml/2006/picture">
-                <pic:pic xmlns:pic="http://schemas.openxmlformats.org/drawingml/2006/picture">
-                  <pic:nvPicPr>
-                    <pic:cNvPr id="0" name=""/>
-                    <pic:cNvPicPr>
-                      <a:picLocks noChangeAspect="1" noChangeArrowheads="1"/>
-                    </pic:cNvPicPr>
-                  </pic:nvPicPr>
-                  <pic:blipFill>
-                    <a:blip r:embed="rId14"/>
-                    <a:srcRect/>
-                    <a:stretch>
-                      <a:fillRect/>
-                    </a:stretch>
-                  </pic:blipFill>
-                  <pic:spPr bwMode="auto">
-                    <a:xfrm>
-                      <a:off x="0" y="0"/>
-                      <a:ext cx="6115050" cy="2124075"/>
-                    </a:xfrm>
-                    <a:prstGeom prst="rect">
-                      <a:avLst/>
-                    </a:prstGeom>
-                  </pic:spPr>
-                </pic:pic>
-              </a:graphicData>
-            </a:graphic>
-          </wp:inline>
-        </w:drawing>
-      </w:r>
-    </w:p>
-    <w:p>
-      <w:pPr>
-        <w:keepNext/>
-        <w:keepLines/>
-        <w:spacing w:before="80" w:after="30" w:line="250" w:lineRule="auto"/>
-      </w:pPr>
-      <w:r>
-        <w:rPr>
-          <w:b/>
-          <w:bCs/>
-          <w:sz w:val="19"/>
-          <w:szCs w:val="19"/>
-        </w:rPr>
-        <w:t>Figura G3 · Propuesta al instante y «¡Listo!»</w:t>
-      </w:r>
-    </w:p>
-    <w:p>
-      <w:pPr>
-        <w:keepNext/>
-        <w:keepLines/>
-        <w:spacing w:after="30" w:line="240" w:lineRule="auto"/>
-      </w:pPr>
-      <w:r>
-        <w:rPr>
-          <w:color w:val="3F3F40"/>
-          <w:sz w:val="16"/>
-          <w:szCs w:val="16"/>
-        </w:rPr>
-        <w:t>Período: prototipo, 15-10-2026 · Unidad: esquema funcional actualizado, no captura · Fuente: elaboración propia (Anexos A a C)</w:t>
-      </w:r>
-    </w:p>
-    <w:p>
-      <w:pPr>
-        <w:keepLines/>
-        <w:spacing w:after="260" w:line="240" w:lineRule="auto"/>
-      </w:pPr>
-      <w:r>
-        <w:rPr>
-          <w:color w:val="3F3F40"/>
-          <w:sz w:val="16"/>
-          <w:szCs w:val="16"/>
-        </w:rPr>
-        <w:t>Nota de lectura: el arriendo es mensual y la compra de la máquina es un pago único; la atención conserva el contexto.</w:t>
-      </w:r>
-    </w:p>
-    <w:p>
-      <w:pPr>
-        <w:keepNext/>
-        <w:spacing w:before="120" w:after="60"/>
-        <w:jc w:val="center"/>
-      </w:pPr>
-      <w:r>
-        <w:rPr>
-          <w:noProof/>
-        </w:rPr>
-        <w:drawing>
-          <wp:inline distT="0" distB="0" distL="0" distR="0" wp14:anchorId="73AF05BA" wp14:editId="1C7B9C2B">
-            <wp:extent cx="6115050" cy="2124075"/>
-            <wp:effectExtent l="0" t="0" r="0" b="0"/>
-            <wp:docPr id="9" name="fig8" descr="Figura G4 · CRM de ventas: chat, lo cotizado y la propuesta sugerida por el agente" title="Figura G4 · CRM de ventas: chat, lo cotizado y la propuesta sugerida por el agente"/>
-            <wp:cNvGraphicFramePr>
-              <a:graphicFrameLocks xmlns:a="http://schemas.openxmlformats.org/drawingml/2006/main" noChangeAspect="1"/>
-            </wp:cNvGraphicFramePr>
-            <a:graphic xmlns:a="http://schemas.openxmlformats.org/drawingml/2006/main">
-              <a:graphicData uri="http://schemas.openxmlformats.org/drawingml/2006/picture">
-                <pic:pic xmlns:pic="http://schemas.openxmlformats.org/drawingml/2006/picture">
-                  <pic:nvPicPr>
-                    <pic:cNvPr id="0" name=""/>
-                    <pic:cNvPicPr>
-                      <a:picLocks noChangeAspect="1" noChangeArrowheads="1"/>
-                    </pic:cNvPicPr>
-                  </pic:nvPicPr>
-                  <pic:blipFill>
-                    <a:blip r:embed="rId15"/>
-                    <a:srcRect/>
-                    <a:stretch>
-                      <a:fillRect/>
-                    </a:stretch>
-                  </pic:blipFill>
-                  <pic:spPr bwMode="auto">
-                    <a:xfrm>
-                      <a:off x="0" y="0"/>
-                      <a:ext cx="6115050" cy="2124075"/>
-                    </a:xfrm>
-                    <a:prstGeom prst="rect">
-                      <a:avLst/>
-                    </a:prstGeom>
-                  </pic:spPr>
-                </pic:pic>
-              </a:graphicData>
-            </a:graphic>
-          </wp:inline>
-        </w:drawing>
-      </w:r>
-    </w:p>
-    <w:p>
-      <w:pPr>
-        <w:keepNext/>
-        <w:keepLines/>
-        <w:spacing w:before="80" w:after="30" w:line="250" w:lineRule="auto"/>
-      </w:pPr>
-      <w:r>
-        <w:rPr>
-          <w:b/>
-          <w:bCs/>
-          <w:sz w:val="19"/>
-          <w:szCs w:val="19"/>
-        </w:rPr>
-        <w:t>Figura G4 · CRM de ventas: chat, lo cotizado y la propuesta sugerida por el agente</w:t>
-      </w:r>
-    </w:p>
-    <w:p>
-      <w:pPr>
-        <w:keepNext/>
-        <w:keepLines/>
-        <w:spacing w:after="30" w:line="240" w:lineRule="auto"/>
-      </w:pPr>
-      <w:r>
-        <w:rPr>
-          <w:color w:val="3F3F40"/>
-          <w:sz w:val="16"/>
-          <w:szCs w:val="16"/>
-        </w:rPr>
-        <w:t>Período: prototipo, 15-10-2026 · Unidad: esquema funcional actualizado, no captura · Fuente: elaboración propia (Anexos A a C)</w:t>
-      </w:r>
-    </w:p>
-    <w:p>
-      <w:pPr>
-        <w:keepLines/>
-        <w:spacing w:after="260" w:line="240" w:lineRule="auto"/>
-      </w:pPr>
-      <w:r>
-        <w:rPr>
-          <w:color w:val="3F3F40"/>
-          <w:sz w:val="16"/>
-          <w:szCs w:val="16"/>
-        </w:rPr>
-        <w:t>Nota de lectura: el equipo toma el caso y pausa la IA; una incidencia suspende ofertas hasta que el cliente confirma la solución.</w:t>
-      </w:r>
-    </w:p>
-    <w:p>
-      <w:pPr>
-        <w:keepNext/>
-        <w:spacing w:before="120" w:after="60"/>
-        <w:jc w:val="center"/>
-      </w:pPr>
-      <w:r>
-        <w:rPr>
-          <w:noProof/>
-        </w:rPr>
-        <w:lastRenderedPageBreak/>
-        <w:drawing>
-          <wp:inline distT="0" distB="0" distL="0" distR="0" wp14:anchorId="4D22F12A" wp14:editId="508AC667">
-            <wp:extent cx="6115050" cy="3381375"/>
-            <wp:effectExtent l="0" t="0" r="0" b="0"/>
-            <wp:docPr id="10" name="fig9" descr="Figura G5 · Panel de jefatura en el celular" title="Figura G5 · Panel de jefatura en el celular"/>
-            <wp:cNvGraphicFramePr>
-              <a:graphicFrameLocks xmlns:a="http://schemas.openxmlformats.org/drawingml/2006/main" noChangeAspect="1"/>
-            </wp:cNvGraphicFramePr>
-            <a:graphic xmlns:a="http://schemas.openxmlformats.org/drawingml/2006/main">
-              <a:graphicData uri="http://schemas.openxmlformats.org/drawingml/2006/picture">
-                <pic:pic xmlns:pic="http://schemas.openxmlformats.org/drawingml/2006/picture">
-                  <pic:nvPicPr>
-                    <pic:cNvPr id="0" name=""/>
-                    <pic:cNvPicPr>
-                      <a:picLocks noChangeAspect="1" noChangeArrowheads="1"/>
-                    </pic:cNvPicPr>
-                  </pic:nvPicPr>
-                  <pic:blipFill>
-                    <a:blip r:embed="rId16"/>
-                    <a:srcRect/>
-                    <a:stretch>
-                      <a:fillRect/>
-                    </a:stretch>
-                  </pic:blipFill>
-                  <pic:spPr bwMode="auto">
-                    <a:xfrm>
-                      <a:off x="0" y="0"/>
                       <a:ext cx="6115050" cy="3381375"/>
                     </a:xfrm>
                     <a:prstGeom prst="rect">
@@ -12364,7 +12865,7 @@
           <w:noProof/>
         </w:rPr>
         <w:drawing>
-          <wp:inline distT="0" distB="0" distL="0" distR="0" wp14:anchorId="76EA37B4" wp14:editId="1267EFE0">
+          <wp:inline distT="0" distB="0" distL="0" distR="0" wp14:anchorId="76A97029" wp14:editId="5D40C835">
             <wp:extent cx="6115050" cy="2124075"/>
             <wp:effectExtent l="0" t="0" r="0" b="0"/>
             <wp:docPr id="11" name="fig10" descr="Figura G6 · Tres fidelidades de la misma pantalla" title="Figura G6 · Tres fidelidades de la misma pantalla"/>
@@ -12381,7 +12882,7 @@
                     </pic:cNvPicPr>
                   </pic:nvPicPr>
                   <pic:blipFill>
-                    <a:blip r:embed="rId17"/>
+                    <a:blip r:embed="rId13"/>
                     <a:srcRect/>
                     <a:stretch>
                       <a:fillRect/>
@@ -14651,7 +15152,7 @@
                 <w:sz w:val="17"/>
                 <w:szCs w:val="17"/>
               </w:rPr>
-              <w:t>El cliente elige chat, llamada o correo, pero los tres llegan a la misma conversación de su ejecutiva.</w:t>
+              <w:t>Contexto compartido entre sitio, CRM y correo comercial; WhatsApp queda para postventa iniciada por el cliente. Los canales conservan permisos y seguimiento del mismo caso.</w:t>
             </w:r>
           </w:p>
         </w:tc>
@@ -15098,7 +15599,7 @@
                 <w:sz w:val="17"/>
                 <w:szCs w:val="17"/>
               </w:rPr>
-              <w:t>Propuesta que arma el agente de ventas apenas el cliente termina el diagnóstico de 3 pasos: máquina, modalidad, café al mes y precio mensual estimado. La ejecutiva la confirma con el precio real.</w:t>
+              <w:t>Resumen que prepara el asistente al terminar el diagnóstico: equipo de referencia en comodato, consumo orientativo, carga inicial y reposición por cotizar. Una ejecutiva valida el modelo, los productos y las condiciones.</w:t>
             </w:r>
           </w:p>
         </w:tc>
@@ -15133,7 +15634,7 @@
                 <w:sz w:val="17"/>
                 <w:szCs w:val="17"/>
               </w:rPr>
-              <w:t>Arriendo / compra directa</w:t>
+              <w:t>Comodato y abastecimiento</w:t>
             </w:r>
           </w:p>
         </w:tc>
@@ -15163,7 +15664,7 @@
                 <w:sz w:val="17"/>
                 <w:szCs w:val="17"/>
               </w:rPr>
-              <w:t>Arriendo: cuota mensual por la máquina, aparte del café. Compra directa: pago único por el equipo, aparte del café y los servicios. Montos académicos a validar; la ejecutiva confirma precio y condiciones.</w:t>
+              <w:t>Comodato: préstamo de máquina asociado a compra mensual de insumos y carga base previa a la instalación. El presupuesto recibido no define mínimo mensual ni todas las condiciones; la ejecutiva las confirma.</w:t>
             </w:r>
           </w:p>
         </w:tc>
@@ -15596,11 +16097,11 @@
       </w:pPr>
       <w:r>
         <w:rPr>
-          <w:color w:val="3F3F40"/>
+          <w:color w:val="000000"/>
           <w:sz w:val="16"/>
           <w:szCs w:val="16"/>
         </w:rPr>
-        <w:t>Período: 7 a 16 de octubre de 2026 · Unidad: herramientas, prompts y verificación · Fuente: prompts originales del equipo y registro de trabajo (BITACORA.md)</w:t>
+        <w:t>Período: 7 a 19 de octubre de 2026 · Unidad: herramientas, prompts y verificación · Fuente: prompts originales del equipo y registro de trabajo (BITACORA.md)</w:t>
       </w:r>
     </w:p>
     <w:p>
@@ -15615,7 +16116,7 @@
           <w:sz w:val="16"/>
           <w:szCs w:val="16"/>
         </w:rPr>
-        <w:t>Nota de lectura: los extractos son literales de los prompts madre del equipo, con […] en los cortes y ortografía evidente normalizada; conservan el vocabulario estratégico original. La IA no generó datos ficticios, entrevistas ni resultados del test.</w:t>
+        <w:t>Nota de lectura: los extractos son literales de los prompts madre del equipo, con […] en los cortes y ortografía evidente normalizada; conservan el vocabulario estratégico original. Los datos de demostración del CRM son ficticios y están rotulados; no se inventaron entrevistas ni resultados del test. Las menciones históricas a arriendo o compra de máquinas quedaron sustituidas por la información de comodato del ejecutivo recibida posteriormente.</w:t>
       </w:r>
     </w:p>
     <w:tbl>
@@ -16058,7 +16559,7 @@
                 <w:sz w:val="17"/>
                 <w:szCs w:val="17"/>
               </w:rPr>
-              <w:t>Matriz de fricciones reales del sitio de Marley (Tabla 1 y Anexo J, Tabla J2). Contrastado punto a punto con la navegación real y las capturas archivadas (Equipo del proyecto, 2026a).</w:t>
+              <w:t>Matriz de fricciones del sitio (Tabla 1 y Anexo J). El extracto conserva el prompt original; la captura archivada precisa un máximo de 3 días hábiles. Google Sign-In se descartó del MVP por decisión posterior del equipo.</w:t>
             </w:r>
           </w:p>
         </w:tc>
@@ -16264,7 +16765,7 @@
                 <w:sz w:val="17"/>
                 <w:szCs w:val="17"/>
               </w:rPr>
-              <w:t>Diseño de la propuesta en pantalla C05, visualización de arriendo y compra directa, ruteo asistido por IA (C06) y meta de primera respuesta en CRM R02 (secciones 1.1 y 1.6).</w:t>
+              <w:t>Diseño de la propuesta en pantalla C05, visualización de comodato y abastecimiento mensual, ruteo asistido por IA (C06) y meta de primera respuesta en CRM R02 (secciones 1.1 y 1.6).</w:t>
             </w:r>
           </w:p>
         </w:tc>
@@ -17675,7 +18176,7 @@
                 <w:sz w:val="17"/>
                 <w:szCs w:val="17"/>
               </w:rPr>
-              <w:t>Instrucción de trabajo del equipo: humanizar el informe y sus destacados, erradicar tecnicismos de código, sintetizar párrafos para dar aire editorial, incrustar multimedia, retirar la tercera modalidad (solo arriendo y compra directa), ampliar chat y postventa por WhatsApp y auditar paridad estricta Word-PDF.</w:t>
+              <w:t>Instrucción del equipo: mejorar informe, multimedia y paridad Word-PDF. El 19 de octubre se generó la portada integrada; una comunicación posterior del ejecutivo sustituyó el modelo hipotético de arriendo/compra por comodato con abastecimiento mensual.</w:t>
             </w:r>
           </w:p>
         </w:tc>
@@ -18884,10 +19385,10 @@
       </w:tblPr>
       <w:tblGrid>
         <w:gridCol w:w="1252"/>
-        <w:gridCol w:w="2414"/>
+        <w:gridCol w:w="2428"/>
         <w:gridCol w:w="1154"/>
-        <w:gridCol w:w="2736"/>
-        <w:gridCol w:w="2082"/>
+        <w:gridCol w:w="2730"/>
+        <w:gridCol w:w="2074"/>
       </w:tblGrid>
       <w:tr>
         <w:trPr>
@@ -19354,7 +19855,7 @@
                 <w:sz w:val="18"/>
                 <w:szCs w:val="18"/>
               </w:rPr>
-              <w:t>Máquinas primero con su rendimiento por tazas, soluciones por negocio (hotel, restaurante, cafetería) y casos rotulados</w:t>
+              <w:t>Equipos como referencia de servicio, condiciones de comodato visibles y productos de abastecimiento a continuación; modelo y disponibilidad por confirmar.</w:t>
             </w:r>
           </w:p>
         </w:tc>
@@ -19449,7 +19950,7 @@
                 <w:sz w:val="18"/>
                 <w:szCs w:val="18"/>
               </w:rPr>
-              <w:t>Formulario extenso de 8 campos que obliga a escribir todo a mano sin autollenado ni Google Sign-In, exigiendo elegir máquina a ciegas sin beneficio (prompts madre)</w:t>
+              <w:t>Formulario extenso de 8 campos que obliga a escribir todo a mano sin ayudas de autocompletado, exigiendo elegir máquina a ciegas sin beneficio (prompts madre)</w:t>
             </w:r>
           </w:p>
         </w:tc>
@@ -19759,7 +20260,7 @@
                 <w:sz w:val="18"/>
                 <w:szCs w:val="18"/>
               </w:rPr>
-              <w:t>Opacidad absoluta de precios: sin costos de arriendo ni compra mensual; mensaje de corte «te contactaremos en 3 a 5 días hábiles» (prompts madre)</w:t>
+              <w:t>Falta de claridad previa sobre el comodato y la carga base; captura con promesa de máximo 3 días hábiles de contacto y espera puntual del equipo superior a cinco días.</w:t>
             </w:r>
           </w:p>
         </w:tc>
@@ -19817,7 +20318,7 @@
                 <w:sz w:val="18"/>
                 <w:szCs w:val="18"/>
               </w:rPr>
-              <w:t>Propuesta instantánea en pantalla con valores claros de arriendo y compra directa, recomendador de insumos y extras opcionales</w:t>
+              <w:t>Propuesta instantánea en pantalla con valores claros de comodato y abastecimiento mensual, recomendador de insumos y extras opcionales</w:t>
             </w:r>
           </w:p>
         </w:tc>
@@ -20341,6 +20842,11 @@
       <w:bookmarkEnd w:id="15"/>
     </w:p>
     <w:p>
+      <w:r>
+        <w:t>Marley Coffee Chile. (s. f.). Sistema de comodato y carga base para máquina de bajo o medio flujo [correo comercial y tabla de presupuesto facilitados por Carlos Vargas; consultados el 19-10-2026; evidencia resguardada por el equipo].</w:t>
+      </w:r>
+    </w:p>
+    <w:p>
       <w:pPr>
         <w:spacing w:after="70" w:line="250" w:lineRule="auto"/>
         <w:ind w:left="567" w:hanging="567"/>
@@ -20727,6 +21233,7 @@
           <w:sz w:val="18"/>
           <w:szCs w:val="18"/>
         </w:rPr>
+        <w:lastRenderedPageBreak/>
         <w:t>Sauro, J. (2011, 3 de febrero). Measuring usability with the System Usability Scale (SUS). MeasuringU. https://measuringu.com/sus/</w:t>
       </w:r>
     </w:p>
@@ -20753,7 +21260,6 @@
           <w:sz w:val="18"/>
           <w:szCs w:val="18"/>
         </w:rPr>
-        <w:lastRenderedPageBreak/>
         <w:t>Similarweb. (2026). marleycoffee.cl: análisis de tráfico [mayo a julio de 2026]. Recuperado el 15-08-2026 de https://www.similarweb.com/</w:t>
       </w:r>
     </w:p>
@@ -20862,8 +21368,8 @@
       </w:r>
     </w:p>
     <w:sectPr>
-      <w:footerReference w:type="default" r:id="rId18"/>
-      <w:footerReference w:type="first" r:id="rId19"/>
+      <w:footerReference w:type="default" r:id="rId14"/>
+      <w:footerReference w:type="first" r:id="rId15"/>
       <w:pgSz w:w="11906" w:h="16838"/>
       <w:pgMar w:top="1134" w:right="1134" w:bottom="1134" w:left="1134" w:header="708" w:footer="567" w:gutter="0"/>
       <w:cols w:space="720"/>
@@ -20916,7 +21422,7 @@
         <w:sz w:val="15"/>
         <w:szCs w:val="15"/>
       </w:rPr>
-      <w:t>Marley Coffee Empresas · Informe EP3 v3.7 · 15-10-2026</w:t>
+      <w:t>Marley Coffee Empresas · Informe EP3 v3.8 · 19-10-2026</w:t>
     </w:r>
     <w:r>
       <w:rPr>

</xml_diff>